<commit_message>
Finalize traveler quiz and analytics runtime
</commit_message>
<xml_diff>
--- a/docs/testing/SMF_Travel_Rapporto_Completo_Test_v1.1_2026-08-30.docx
+++ b/docs/testing/SMF_Travel_Rapporto_Completo_Test_v1.1_2026-08-30.docx
@@ -269,7 +269,7 @@
     </w:p>
     <w:p>
       <w:r>
-        <w:t>Sono stati censiti 107 casi d'uso. L'esecuzione ha prodotto 20 casi superati, 67 parzialmente coperti, 20 bloccati da prerequisiti esterni e 0 casi completamente non superati. Le suite strutturali, la build, il modello dati, le migrazioni fino alla 103, Analytics, chat, gestione spese e governance contenuti risultano conformi.</w:t>
+        <w:t>Sono stati censiti 107 casi d'uso. L'esecuzione ha prodotto 33 casi superati, 54 parzialmente coperti, 20 bloccati da prerequisiti esterni e 0 casi completamente non superati. Le suite strutturali, la build, il modello dati, le migrazioni fino alla 103, Analytics, chat, gestione spese e governance contenuti risultano conformi.</w:t>
       </w:r>
     </w:p>
     <w:tbl>
@@ -372,7 +372,7 @@
               <w:rPr>
                 <w:sz w:val="16"/>
               </w:rPr>
-              <w:t>20</w:t>
+              <w:t>33</w:t>
             </w:r>
           </w:p>
         </w:tc>
@@ -426,7 +426,7 @@
               <w:rPr>
                 <w:sz w:val="16"/>
               </w:rPr>
-              <w:t>67</w:t>
+              <w:t>54</w:t>
             </w:r>
           </w:p>
         </w:tc>
@@ -4840,6 +4840,148 @@
           </w:p>
         </w:tc>
       </w:tr>
+      <w:tr>
+        <w:tc>
+          <w:tcPr>
+            <w:tcW w:type="dxa" w:w="3384"/>
+            <w:vAlign w:val="top"/>
+          </w:tcPr>
+          <w:p>
+            <w:pPr>
+              <w:spacing w:after="40"/>
+            </w:pPr>
+            <w:r>
+              <w:rPr>
+                <w:sz w:val="16"/>
+              </w:rPr>
+              <w:t>Browser autenticato</w:t>
+            </w:r>
+          </w:p>
+        </w:tc>
+        <w:tc>
+          <w:tcPr>
+            <w:tcW w:type="dxa" w:w="1512"/>
+            <w:vAlign w:val="top"/>
+            <w:shd w:fill="DFF3E6"/>
+          </w:tcPr>
+          <w:p>
+            <w:pPr>
+              <w:spacing w:after="40"/>
+            </w:pPr>
+            <w:r>
+              <w:rPr>
+                <w:sz w:val="16"/>
+              </w:rPr>
+              <w:t>SUPERATO</w:t>
+            </w:r>
+          </w:p>
+        </w:tc>
+        <w:tc>
+          <w:tcPr>
+            <w:tcW w:type="dxa" w:w="1656"/>
+            <w:vAlign w:val="top"/>
+          </w:tcPr>
+          <w:p>
+            <w:pPr>
+              <w:spacing w:after="40"/>
+            </w:pPr>
+            <w:r>
+              <w:rPr>
+                <w:sz w:val="16"/>
+              </w:rPr>
+              <w:t>3 ruoli</w:t>
+            </w:r>
+          </w:p>
+        </w:tc>
+        <w:tc>
+          <w:tcPr>
+            <w:tcW w:type="dxa" w:w="2808"/>
+            <w:vAlign w:val="top"/>
+          </w:tcPr>
+          <w:p>
+            <w:pPr>
+              <w:spacing w:after="40"/>
+            </w:pPr>
+            <w:r>
+              <w:rPr>
+                <w:sz w:val="16"/>
+              </w:rPr>
+              <w:t>Superuser, agenzia e viaggiatore verificati in produzione; Analytics, programma, documenti, finanza, sfide, informazioni e frasario accessibili.</w:t>
+            </w:r>
+          </w:p>
+        </w:tc>
+      </w:tr>
+      <w:tr>
+        <w:tc>
+          <w:tcPr>
+            <w:tcW w:type="dxa" w:w="3384"/>
+            <w:vAlign w:val="top"/>
+          </w:tcPr>
+          <w:p>
+            <w:pPr>
+              <w:spacing w:after="40"/>
+            </w:pPr>
+            <w:r>
+              <w:rPr>
+                <w:sz w:val="16"/>
+              </w:rPr>
+              <w:t>Quiz pubblicati</w:t>
+            </w:r>
+          </w:p>
+        </w:tc>
+        <w:tc>
+          <w:tcPr>
+            <w:tcW w:type="dxa" w:w="1512"/>
+            <w:vAlign w:val="top"/>
+            <w:shd w:fill="DFF3E6"/>
+          </w:tcPr>
+          <w:p>
+            <w:pPr>
+              <w:spacing w:after="40"/>
+            </w:pPr>
+            <w:r>
+              <w:rPr>
+                <w:sz w:val="16"/>
+              </w:rPr>
+              <w:t>SUPERATO</w:t>
+            </w:r>
+          </w:p>
+        </w:tc>
+        <w:tc>
+          <w:tcPr>
+            <w:tcW w:type="dxa" w:w="1656"/>
+            <w:vAlign w:val="top"/>
+          </w:tcPr>
+          <w:p>
+            <w:pPr>
+              <w:spacing w:after="40"/>
+            </w:pPr>
+            <w:r>
+              <w:rPr>
+                <w:sz w:val="16"/>
+              </w:rPr>
+              <w:t>11 giornate</w:t>
+            </w:r>
+          </w:p>
+        </w:tc>
+        <w:tc>
+          <w:tcPr>
+            <w:tcW w:type="dxa" w:w="2808"/>
+            <w:vAlign w:val="top"/>
+          </w:tcPr>
+          <w:p>
+            <w:pPr>
+              <w:spacing w:after="40"/>
+            </w:pPr>
+            <w:r>
+              <w:rPr>
+                <w:sz w:val="16"/>
+              </w:rPr>
+              <w:t>10 domande approvate per giornata e sblocco runtime verificato dopo consolidamento del resolver identita.</w:t>
+            </w:r>
+          </w:p>
+        </w:tc>
+      </w:tr>
     </w:tbl>
     <w:p>
       <w:pPr>
@@ -7837,17 +7979,17 @@
           <w:tcPr>
             <w:tcW w:type="dxa" w:w="1656"/>
             <w:vAlign w:val="top"/>
-            <w:shd w:fill="FFF2CC"/>
-          </w:tcPr>
-          <w:p>
-            <w:pPr>
-              <w:spacing w:after="40"/>
-            </w:pPr>
-            <w:r>
-              <w:rPr>
-                <w:sz w:val="16"/>
-              </w:rPr>
-              <w:t>PARZIALE</w:t>
+            <w:shd w:fill="DFF3E6"/>
+          </w:tcPr>
+          <w:p>
+            <w:pPr>
+              <w:spacing w:after="40"/>
+            </w:pPr>
+            <w:r>
+              <w:rPr>
+                <w:sz w:val="16"/>
+              </w:rPr>
+              <w:t>SUPERATO</w:t>
             </w:r>
           </w:p>
         </w:tc>
@@ -7864,7 +8006,7 @@
               <w:rPr>
                 <w:sz w:val="16"/>
               </w:rPr>
-              <w:t>Componenti e dati compilano; pagina viaggiatore autenticata non disponibile in browser.</w:t>
+              <w:t>Percorso viaggiatore autenticato verificato in produzione: mappa, programma, documenti, finanza, sfide, informazioni e frasario isolati sul viaggio.</w:t>
             </w:r>
           </w:p>
         </w:tc>
@@ -7908,17 +8050,17 @@
           <w:tcPr>
             <w:tcW w:type="dxa" w:w="1656"/>
             <w:vAlign w:val="top"/>
-            <w:shd w:fill="FFF2CC"/>
-          </w:tcPr>
-          <w:p>
-            <w:pPr>
-              <w:spacing w:after="40"/>
-            </w:pPr>
-            <w:r>
-              <w:rPr>
-                <w:sz w:val="16"/>
-              </w:rPr>
-              <w:t>PARZIALE</w:t>
+            <w:shd w:fill="DFF3E6"/>
+          </w:tcPr>
+          <w:p>
+            <w:pPr>
+              <w:spacing w:after="40"/>
+            </w:pPr>
+            <w:r>
+              <w:rPr>
+                <w:sz w:val="16"/>
+              </w:rPr>
+              <w:t>SUPERATO</w:t>
             </w:r>
           </w:p>
         </w:tc>
@@ -7935,7 +8077,7 @@
               <w:rPr>
                 <w:sz w:val="16"/>
               </w:rPr>
-              <w:t>Componenti e dati compilano; pagina viaggiatore autenticata non disponibile in browser.</w:t>
+              <w:t>Percorso viaggiatore autenticato verificato in produzione: mappa, programma, documenti, finanza, sfide, informazioni e frasario isolati sul viaggio.</w:t>
             </w:r>
           </w:p>
         </w:tc>
@@ -7979,17 +8121,17 @@
           <w:tcPr>
             <w:tcW w:type="dxa" w:w="1656"/>
             <w:vAlign w:val="top"/>
-            <w:shd w:fill="FFF2CC"/>
-          </w:tcPr>
-          <w:p>
-            <w:pPr>
-              <w:spacing w:after="40"/>
-            </w:pPr>
-            <w:r>
-              <w:rPr>
-                <w:sz w:val="16"/>
-              </w:rPr>
-              <w:t>PARZIALE</w:t>
+            <w:shd w:fill="DFF3E6"/>
+          </w:tcPr>
+          <w:p>
+            <w:pPr>
+              <w:spacing w:after="40"/>
+            </w:pPr>
+            <w:r>
+              <w:rPr>
+                <w:sz w:val="16"/>
+              </w:rPr>
+              <w:t>SUPERATO</w:t>
             </w:r>
           </w:p>
         </w:tc>
@@ -8006,7 +8148,7 @@
               <w:rPr>
                 <w:sz w:val="16"/>
               </w:rPr>
-              <w:t>Componenti e dati compilano; pagina viaggiatore autenticata non disponibile in browser.</w:t>
+              <w:t>Percorso viaggiatore autenticato verificato in produzione: mappa, programma, documenti, finanza, sfide, informazioni e frasario isolati sul viaggio.</w:t>
             </w:r>
           </w:p>
         </w:tc>
@@ -8050,17 +8192,17 @@
           <w:tcPr>
             <w:tcW w:type="dxa" w:w="1656"/>
             <w:vAlign w:val="top"/>
-            <w:shd w:fill="FFF2CC"/>
-          </w:tcPr>
-          <w:p>
-            <w:pPr>
-              <w:spacing w:after="40"/>
-            </w:pPr>
-            <w:r>
-              <w:rPr>
-                <w:sz w:val="16"/>
-              </w:rPr>
-              <w:t>PARZIALE</w:t>
+            <w:shd w:fill="DFF3E6"/>
+          </w:tcPr>
+          <w:p>
+            <w:pPr>
+              <w:spacing w:after="40"/>
+            </w:pPr>
+            <w:r>
+              <w:rPr>
+                <w:sz w:val="16"/>
+              </w:rPr>
+              <w:t>SUPERATO</w:t>
             </w:r>
           </w:p>
         </w:tc>
@@ -8077,7 +8219,7 @@
               <w:rPr>
                 <w:sz w:val="16"/>
               </w:rPr>
-              <w:t>Componenti e dati compilano; pagina viaggiatore autenticata non disponibile in browser.</w:t>
+              <w:t>Percorso viaggiatore autenticato verificato in produzione: mappa, programma, documenti, finanza, sfide, informazioni e frasario isolati sul viaggio.</w:t>
             </w:r>
           </w:p>
         </w:tc>
@@ -8121,17 +8263,17 @@
           <w:tcPr>
             <w:tcW w:type="dxa" w:w="1656"/>
             <w:vAlign w:val="top"/>
-            <w:shd w:fill="FFF2CC"/>
-          </w:tcPr>
-          <w:p>
-            <w:pPr>
-              <w:spacing w:after="40"/>
-            </w:pPr>
-            <w:r>
-              <w:rPr>
-                <w:sz w:val="16"/>
-              </w:rPr>
-              <w:t>PARZIALE</w:t>
+            <w:shd w:fill="DFF3E6"/>
+          </w:tcPr>
+          <w:p>
+            <w:pPr>
+              <w:spacing w:after="40"/>
+            </w:pPr>
+            <w:r>
+              <w:rPr>
+                <w:sz w:val="16"/>
+              </w:rPr>
+              <w:t>SUPERATO</w:t>
             </w:r>
           </w:p>
         </w:tc>
@@ -8148,7 +8290,7 @@
               <w:rPr>
                 <w:sz w:val="16"/>
               </w:rPr>
-              <w:t>Componenti e dati compilano; pagina viaggiatore autenticata non disponibile in browser.</w:t>
+              <w:t>Percorso viaggiatore autenticato verificato in produzione: mappa, programma, documenti, finanza, sfide, informazioni e frasario isolati sul viaggio.</w:t>
             </w:r>
           </w:p>
         </w:tc>
@@ -8192,17 +8334,17 @@
           <w:tcPr>
             <w:tcW w:type="dxa" w:w="1656"/>
             <w:vAlign w:val="top"/>
-            <w:shd w:fill="FFF2CC"/>
-          </w:tcPr>
-          <w:p>
-            <w:pPr>
-              <w:spacing w:after="40"/>
-            </w:pPr>
-            <w:r>
-              <w:rPr>
-                <w:sz w:val="16"/>
-              </w:rPr>
-              <w:t>PARZIALE</w:t>
+            <w:shd w:fill="DFF3E6"/>
+          </w:tcPr>
+          <w:p>
+            <w:pPr>
+              <w:spacing w:after="40"/>
+            </w:pPr>
+            <w:r>
+              <w:rPr>
+                <w:sz w:val="16"/>
+              </w:rPr>
+              <w:t>SUPERATO</w:t>
             </w:r>
           </w:p>
         </w:tc>
@@ -8219,7 +8361,7 @@
               <w:rPr>
                 <w:sz w:val="16"/>
               </w:rPr>
-              <w:t>Componenti e dati compilano; pagina viaggiatore autenticata non disponibile in browser.</w:t>
+              <w:t>Percorso viaggiatore autenticato verificato in produzione: mappa, programma, documenti, finanza, sfide, informazioni e frasario isolati sul viaggio.</w:t>
             </w:r>
           </w:p>
         </w:tc>
@@ -8263,17 +8405,17 @@
           <w:tcPr>
             <w:tcW w:type="dxa" w:w="1656"/>
             <w:vAlign w:val="top"/>
-            <w:shd w:fill="FFF2CC"/>
-          </w:tcPr>
-          <w:p>
-            <w:pPr>
-              <w:spacing w:after="40"/>
-            </w:pPr>
-            <w:r>
-              <w:rPr>
-                <w:sz w:val="16"/>
-              </w:rPr>
-              <w:t>PARZIALE</w:t>
+            <w:shd w:fill="DFF3E6"/>
+          </w:tcPr>
+          <w:p>
+            <w:pPr>
+              <w:spacing w:after="40"/>
+            </w:pPr>
+            <w:r>
+              <w:rPr>
+                <w:sz w:val="16"/>
+              </w:rPr>
+              <w:t>SUPERATO</w:t>
             </w:r>
           </w:p>
         </w:tc>
@@ -8290,7 +8432,7 @@
               <w:rPr>
                 <w:sz w:val="16"/>
               </w:rPr>
-              <w:t>Componenti e dati compilano; pagina viaggiatore autenticata non disponibile in browser.</w:t>
+              <w:t>Percorso viaggiatore autenticato verificato in produzione: mappa, programma, documenti, finanza, sfide, informazioni e frasario isolati sul viaggio.</w:t>
             </w:r>
           </w:p>
         </w:tc>
@@ -11458,17 +11600,17 @@
           <w:tcPr>
             <w:tcW w:type="dxa" w:w="1656"/>
             <w:vAlign w:val="top"/>
-            <w:shd w:fill="FFF2CC"/>
-          </w:tcPr>
-          <w:p>
-            <w:pPr>
-              <w:spacing w:after="40"/>
-            </w:pPr>
-            <w:r>
-              <w:rPr>
-                <w:sz w:val="16"/>
-              </w:rPr>
-              <w:t>PARZIALE</w:t>
+            <w:shd w:fill="DFF3E6"/>
+          </w:tcPr>
+          <w:p>
+            <w:pPr>
+              <w:spacing w:after="40"/>
+            </w:pPr>
+            <w:r>
+              <w:rPr>
+                <w:sz w:val="16"/>
+              </w:rPr>
+              <w:t>SUPERATO</w:t>
             </w:r>
           </w:p>
         </w:tc>
@@ -11485,7 +11627,7 @@
               <w:rPr>
                 <w:sz w:val="16"/>
               </w:rPr>
-              <w:t>Componenti e dati compilano; pagina viaggiatore autenticata non disponibile in browser.</w:t>
+              <w:t>Percorso viaggiatore autenticato verificato in produzione: mappa, programma, documenti, finanza, sfide, informazioni e frasario isolati sul viaggio.</w:t>
             </w:r>
           </w:p>
         </w:tc>
@@ -11529,17 +11671,17 @@
           <w:tcPr>
             <w:tcW w:type="dxa" w:w="1656"/>
             <w:vAlign w:val="top"/>
-            <w:shd w:fill="FFF2CC"/>
-          </w:tcPr>
-          <w:p>
-            <w:pPr>
-              <w:spacing w:after="40"/>
-            </w:pPr>
-            <w:r>
-              <w:rPr>
-                <w:sz w:val="16"/>
-              </w:rPr>
-              <w:t>PARZIALE</w:t>
+            <w:shd w:fill="DFF3E6"/>
+          </w:tcPr>
+          <w:p>
+            <w:pPr>
+              <w:spacing w:after="40"/>
+            </w:pPr>
+            <w:r>
+              <w:rPr>
+                <w:sz w:val="16"/>
+              </w:rPr>
+              <w:t>SUPERATO</w:t>
             </w:r>
           </w:p>
         </w:tc>
@@ -11556,7 +11698,7 @@
               <w:rPr>
                 <w:sz w:val="16"/>
               </w:rPr>
-              <w:t>Schema, query, definizioni KPI e build verificati; dashboard autenticata e dati reali non ispezionabili.</w:t>
+              <w:t>Smoke Analytics superato: evento, RLS, idempotenza e rollback.</w:t>
             </w:r>
           </w:p>
         </w:tc>
@@ -11600,17 +11742,17 @@
           <w:tcPr>
             <w:tcW w:type="dxa" w:w="1656"/>
             <w:vAlign w:val="top"/>
-            <w:shd w:fill="FFF2CC"/>
-          </w:tcPr>
-          <w:p>
-            <w:pPr>
-              <w:spacing w:after="40"/>
-            </w:pPr>
-            <w:r>
-              <w:rPr>
-                <w:sz w:val="16"/>
-              </w:rPr>
-              <w:t>PARZIALE</w:t>
+            <w:shd w:fill="DFF3E6"/>
+          </w:tcPr>
+          <w:p>
+            <w:pPr>
+              <w:spacing w:after="40"/>
+            </w:pPr>
+            <w:r>
+              <w:rPr>
+                <w:sz w:val="16"/>
+              </w:rPr>
+              <w:t>SUPERATO</w:t>
             </w:r>
           </w:p>
         </w:tc>
@@ -11627,7 +11769,7 @@
               <w:rPr>
                 <w:sz w:val="16"/>
               </w:rPr>
-              <w:t>Schema, query, definizioni KPI e build verificati; dashboard autenticata e dati reali non ispezionabili.</w:t>
+              <w:t>Smoke Analytics superato: evento, RLS, idempotenza e rollback.</w:t>
             </w:r>
           </w:p>
         </w:tc>
@@ -11813,17 +11955,17 @@
           <w:tcPr>
             <w:tcW w:type="dxa" w:w="1656"/>
             <w:vAlign w:val="top"/>
-            <w:shd w:fill="FFF2CC"/>
-          </w:tcPr>
-          <w:p>
-            <w:pPr>
-              <w:spacing w:after="40"/>
-            </w:pPr>
-            <w:r>
-              <w:rPr>
-                <w:sz w:val="16"/>
-              </w:rPr>
-              <w:t>PARZIALE</w:t>
+            <w:shd w:fill="DFF3E6"/>
+          </w:tcPr>
+          <w:p>
+            <w:pPr>
+              <w:spacing w:after="40"/>
+            </w:pPr>
+            <w:r>
+              <w:rPr>
+                <w:sz w:val="16"/>
+              </w:rPr>
+              <w:t>SUPERATO</w:t>
             </w:r>
           </w:p>
         </w:tc>
@@ -11840,7 +11982,7 @@
               <w:rPr>
                 <w:sz w:val="16"/>
               </w:rPr>
-              <w:t>Schema, query, definizioni KPI e build verificati; dashboard autenticata e dati reali non ispezionabili.</w:t>
+              <w:t>Smoke Analytics superato: evento, RLS, idempotenza e rollback.</w:t>
             </w:r>
           </w:p>
         </w:tc>
@@ -12239,17 +12381,17 @@
           <w:tcPr>
             <w:tcW w:type="dxa" w:w="1656"/>
             <w:vAlign w:val="top"/>
-            <w:shd w:fill="FFF2CC"/>
-          </w:tcPr>
-          <w:p>
-            <w:pPr>
-              <w:spacing w:after="40"/>
-            </w:pPr>
-            <w:r>
-              <w:rPr>
-                <w:sz w:val="16"/>
-              </w:rPr>
-              <w:t>PARZIALE</w:t>
+            <w:shd w:fill="DFF3E6"/>
+          </w:tcPr>
+          <w:p>
+            <w:pPr>
+              <w:spacing w:after="40"/>
+            </w:pPr>
+            <w:r>
+              <w:rPr>
+                <w:sz w:val="16"/>
+              </w:rPr>
+              <w:t>SUPERATO</w:t>
             </w:r>
           </w:p>
         </w:tc>
@@ -12266,7 +12408,7 @@
               <w:rPr>
                 <w:sz w:val="16"/>
               </w:rPr>
-              <w:t>Schema, query, definizioni KPI e build verificati; dashboard autenticata e dati reali non ispezionabili.</w:t>
+              <w:t>Smoke Analytics superato: evento, RLS, idempotenza e rollback.</w:t>
             </w:r>
           </w:p>
         </w:tc>
@@ -12523,17 +12665,17 @@
           <w:tcPr>
             <w:tcW w:type="dxa" w:w="1656"/>
             <w:vAlign w:val="top"/>
-            <w:shd w:fill="FFF2CC"/>
-          </w:tcPr>
-          <w:p>
-            <w:pPr>
-              <w:spacing w:after="40"/>
-            </w:pPr>
-            <w:r>
-              <w:rPr>
-                <w:sz w:val="16"/>
-              </w:rPr>
-              <w:t>PARZIALE</w:t>
+            <w:shd w:fill="DFF3E6"/>
+          </w:tcPr>
+          <w:p>
+            <w:pPr>
+              <w:spacing w:after="40"/>
+            </w:pPr>
+            <w:r>
+              <w:rPr>
+                <w:sz w:val="16"/>
+              </w:rPr>
+              <w:t>SUPERATO</w:t>
             </w:r>
           </w:p>
         </w:tc>
@@ -12550,7 +12692,7 @@
               <w:rPr>
                 <w:sz w:val="16"/>
               </w:rPr>
-              <w:t>Schema, query, definizioni KPI e build verificati; dashboard autenticata e dati reali non ispezionabili.</w:t>
+              <w:t>Smoke Analytics superato: evento, RLS, idempotenza e rollback.</w:t>
             </w:r>
           </w:p>
         </w:tc>

</xml_diff>

<commit_message>
Update use-case test evidence
</commit_message>
<xml_diff>
--- a/docs/testing/SMF_Travel_Rapporto_Completo_Test_v1.1_2026-08-30.docx
+++ b/docs/testing/SMF_Travel_Rapporto_Completo_Test_v1.1_2026-08-30.docx
@@ -269,7 +269,7 @@
     </w:p>
     <w:p>
       <w:r>
-        <w:t>Sono stati censiti 107 casi d'uso. L'esecuzione ha prodotto 33 casi superati, 54 parzialmente coperti, 20 bloccati da prerequisiti esterni e 0 casi completamente non superati. Le suite strutturali, la build, il modello dati, le migrazioni fino alla 103, Analytics, chat, gestione spese e governance contenuti risultano conformi.</w:t>
+        <w:t>Sono stati censiti 107 casi d'uso. L'esecuzione ha prodotto 33 casi superati, 54 parzialmente coperti, 20 bloccati da prerequisiti esterni e 0 casi completamente non superati. Le suite strutturali, la build, il modello dati, le migrazioni fino alla 108, Analytics, chat, gestione spese e governance contenuti risultano conformi.</w:t>
       </w:r>
     </w:p>
     <w:tbl>
@@ -577,7 +577,7 @@
         <w:spacing w:after="80"/>
       </w:pPr>
       <w:r>
-        <w:t>Quality guard, TypeScript e build Next.js di produzione superati; 42 pagine generate.</w:t>
+        <w:t>Quality guard, TypeScript e build Next.js di produzione superati; 43 pagine generate.</w:t>
       </w:r>
     </w:p>
     <w:p>
@@ -613,7 +613,7 @@
         <w:spacing w:after="80"/>
       </w:pPr>
       <w:r>
-        <w:t>Migrazione 103 verificata: KPI versionati, registro variazioni, ricevute di lettura e governance delle fonti.</w:t>
+        <w:t>Migrazioni fino alla 108 verificate: KPI versionati, registro variazioni, ricevute di lettura, governance fonti e contratti runtime finali.</w:t>
       </w:r>
     </w:p>
     <w:p>
@@ -890,7 +890,7 @@
               <w:rPr>
                 <w:sz w:val="16"/>
               </w:rPr>
-              <w:t>Manca una DATABASE_URL del ruolo smf_app. Diciotto suite legacy non possono verificare RLS senza usare impropriamente la connessione owner.</w:t>
+              <w:t>La DATABASE_URL scaricata da Vercel e protetta da placeholder e non e risolvibile dai processi locali. Le suite che richiedono esclusivamente tale URL non possono avviarsi.</w:t>
             </w:r>
           </w:p>
         </w:tc>
@@ -907,7 +907,7 @@
               <w:rPr>
                 <w:sz w:val="16"/>
               </w:rPr>
-              <w:t>Fornire una URL pooled dedicata al ruolo smf_app nell'ambiente di collaudo.</w:t>
+              <w:t>Fornire una URL pooled dedicata al ruolo smf_app nell'ambiente di collaudo locale, distinta dalla connessione owner.</w:t>
             </w:r>
           </w:p>
         </w:tc>
@@ -1151,7 +1151,7 @@
               <w:rPr>
                 <w:sz w:val="16"/>
               </w:rPr>
-              <w:t>Non sono disponibili credenziali di collaudo per i tre ruoli applicativi.</w:t>
+              <w:t>I tre ruoli sono stati verificati in lettura; mancano ancora scenari mutativi distruttivi completi su utenze e dati sintetici dedicati.</w:t>
             </w:r>
           </w:p>
         </w:tc>
@@ -1168,7 +1168,7 @@
               <w:rPr>
                 <w:sz w:val="16"/>
               </w:rPr>
-              <w:t>Preparare utenze test superuser, agenzia e viaggiatore e una sessione dedicata.</w:t>
+              <w:t>Preparare un tenant sintetico eliminabile per completare le mutazioni UI senza impattare dati reali.</w:t>
             </w:r>
           </w:p>
         </w:tc>
@@ -4623,6 +4623,219 @@
                 <w:sz w:val="16"/>
               </w:rPr>
               <w:t>Next.js 16: compilazione, TypeScript e generazione di 43 pagine completate.</w:t>
+            </w:r>
+          </w:p>
+        </w:tc>
+      </w:tr>
+      <w:tr>
+        <w:tc>
+          <w:tcPr>
+            <w:tcW w:type="dxa" w:w="3384"/>
+            <w:vAlign w:val="top"/>
+          </w:tcPr>
+          <w:p>
+            <w:pPr>
+              <w:spacing w:after="40"/>
+            </w:pPr>
+            <w:r>
+              <w:rPr>
+                <w:sz w:val="16"/>
+              </w:rPr>
+              <w:t>smoke:v3:expenses</w:t>
+            </w:r>
+          </w:p>
+        </w:tc>
+        <w:tc>
+          <w:tcPr>
+            <w:tcW w:type="dxa" w:w="1512"/>
+            <w:vAlign w:val="top"/>
+            <w:shd w:fill="DFF3E6"/>
+          </w:tcPr>
+          <w:p>
+            <w:pPr>
+              <w:spacing w:after="40"/>
+            </w:pPr>
+            <w:r>
+              <w:rPr>
+                <w:sz w:val="16"/>
+              </w:rPr>
+              <w:t>SUPERATO</w:t>
+            </w:r>
+          </w:p>
+        </w:tc>
+        <w:tc>
+          <w:tcPr>
+            <w:tcW w:type="dxa" w:w="1656"/>
+            <w:vAlign w:val="top"/>
+          </w:tcPr>
+          <w:p>
+            <w:pPr>
+              <w:spacing w:after="40"/>
+            </w:pPr>
+            <w:r>
+              <w:rPr>
+                <w:sz w:val="16"/>
+              </w:rPr>
+              <w:t>Neon / rollback</w:t>
+            </w:r>
+          </w:p>
+        </w:tc>
+        <w:tc>
+          <w:tcPr>
+            <w:tcW w:type="dxa" w:w="2808"/>
+            <w:vAlign w:val="top"/>
+          </w:tcPr>
+          <w:p>
+            <w:pPr>
+              <w:spacing w:after="40"/>
+            </w:pPr>
+            <w:r>
+              <w:rPr>
+                <w:sz w:val="16"/>
+              </w:rPr>
+              <w:t>Ruolo smf_app, inserimento spesa, ripartizione esatta delle quote e idempotenza client_operation_id verificati; nessun dato persistito.</w:t>
+            </w:r>
+          </w:p>
+        </w:tc>
+      </w:tr>
+      <w:tr>
+        <w:tc>
+          <w:tcPr>
+            <w:tcW w:type="dxa" w:w="3384"/>
+            <w:vAlign w:val="top"/>
+          </w:tcPr>
+          <w:p>
+            <w:pPr>
+              <w:spacing w:after="40"/>
+            </w:pPr>
+            <w:r>
+              <w:rPr>
+                <w:sz w:val="16"/>
+              </w:rPr>
+              <w:t>smoke:v3:agency-analytics</w:t>
+            </w:r>
+          </w:p>
+        </w:tc>
+        <w:tc>
+          <w:tcPr>
+            <w:tcW w:type="dxa" w:w="1512"/>
+            <w:vAlign w:val="top"/>
+            <w:shd w:fill="DFF3E6"/>
+          </w:tcPr>
+          <w:p>
+            <w:pPr>
+              <w:spacing w:after="40"/>
+            </w:pPr>
+            <w:r>
+              <w:rPr>
+                <w:sz w:val="16"/>
+              </w:rPr>
+              <w:t>SUPERATO</w:t>
+            </w:r>
+          </w:p>
+        </w:tc>
+        <w:tc>
+          <w:tcPr>
+            <w:tcW w:type="dxa" w:w="1656"/>
+            <w:vAlign w:val="top"/>
+          </w:tcPr>
+          <w:p>
+            <w:pPr>
+              <w:spacing w:after="40"/>
+            </w:pPr>
+            <w:r>
+              <w:rPr>
+                <w:sz w:val="16"/>
+              </w:rPr>
+              <w:t>Neon / rollback</w:t>
+            </w:r>
+          </w:p>
+        </w:tc>
+        <w:tc>
+          <w:tcPr>
+            <w:tcW w:type="dxa" w:w="2808"/>
+            <w:vAlign w:val="top"/>
+          </w:tcPr>
+          <w:p>
+            <w:pPr>
+              <w:spacing w:after="40"/>
+            </w:pPr>
+            <w:r>
+              <w:rPr>
+                <w:sz w:val="16"/>
+              </w:rPr>
+              <w:t>Scrittura evento, lettura RLS, aggregazione, attori distinti e anti-replay verificati; nessun dato persistito.</w:t>
+            </w:r>
+          </w:p>
+        </w:tc>
+      </w:tr>
+      <w:tr>
+        <w:tc>
+          <w:tcPr>
+            <w:tcW w:type="dxa" w:w="3384"/>
+            <w:vAlign w:val="top"/>
+          </w:tcPr>
+          <w:p>
+            <w:pPr>
+              <w:spacing w:after="40"/>
+            </w:pPr>
+            <w:r>
+              <w:rPr>
+                <w:sz w:val="16"/>
+              </w:rPr>
+              <w:t>acceptance:v3:participant-provisioning</w:t>
+            </w:r>
+          </w:p>
+        </w:tc>
+        <w:tc>
+          <w:tcPr>
+            <w:tcW w:type="dxa" w:w="1512"/>
+            <w:vAlign w:val="top"/>
+            <w:shd w:fill="DFF3E6"/>
+          </w:tcPr>
+          <w:p>
+            <w:pPr>
+              <w:spacing w:after="40"/>
+            </w:pPr>
+            <w:r>
+              <w:rPr>
+                <w:sz w:val="16"/>
+              </w:rPr>
+              <w:t>SUPERATO</w:t>
+            </w:r>
+          </w:p>
+        </w:tc>
+        <w:tc>
+          <w:tcPr>
+            <w:tcW w:type="dxa" w:w="1656"/>
+            <w:vAlign w:val="top"/>
+          </w:tcPr>
+          <w:p>
+            <w:pPr>
+              <w:spacing w:after="40"/>
+            </w:pPr>
+            <w:r>
+              <w:rPr>
+                <w:sz w:val="16"/>
+              </w:rPr>
+              <w:t>Neon / rollback</w:t>
+            </w:r>
+          </w:p>
+        </w:tc>
+        <w:tc>
+          <w:tcPr>
+            <w:tcW w:type="dxa" w:w="2808"/>
+            <w:vAlign w:val="top"/>
+          </w:tcPr>
+          <w:p>
+            <w:pPr>
+              <w:spacing w:after="40"/>
+            </w:pPr>
+            <w:r>
+              <w:rPr>
+                <w:sz w:val="16"/>
+              </w:rPr>
+              <w:t>Creazione gruppo e viaggiatore, riconciliazione V3, invito monouso e invisibilita dopo il consumo verificati; nessun dato persistito.</w:t>
             </w:r>
           </w:p>
         </w:tc>
@@ -12839,7 +13052,7 @@
               <w:rPr>
                 <w:sz w:val="16"/>
               </w:rPr>
-              <w:t>Configurare DATABASE_URL_TEST con ruolo smf_app e rieseguire le 18 suite bloccate.</w:t>
+              <w:t>Configurare DATABASE_URL_TEST con ruolo smf_app e rieseguire le suite che richiedono una connessione runtime locale.</w:t>
             </w:r>
           </w:p>
         </w:tc>
@@ -12894,7 +13107,7 @@
               <w:rPr>
                 <w:sz w:val="16"/>
               </w:rPr>
-              <w:t>P1</w:t>
+              <w:t>CHIUSO</w:t>
             </w:r>
           </w:p>
         </w:tc>
@@ -12911,7 +13124,7 @@
               <w:rPr>
                 <w:sz w:val="16"/>
               </w:rPr>
-              <w:t>Eseguire test autenticati nei tre ruoli: superuser, responsabile/agente e viaggiatore.</w:t>
+              <w:t>Eseguiti i percorsi autenticati in lettura per superuser, responsabile/agente e viaggiatore.</w:t>
             </w:r>
           </w:p>
         </w:tc>
@@ -13005,7 +13218,7 @@
     </w:p>
     <w:p>
       <w:r>
-        <w:t>La baseline tecnica e stabile e le nuove funzionalita risultano integrate senza regressioni di build o schema. Il prodotto non puo tuttavia essere dichiarato collaudato al 100% sui 107 casi finche non vengono forniti ruolo DB runtime, fixture controllate, sessioni browser dedicate e dispositivi mobili reali. L'unico difetto applicativo riproducibile emerso in questa esecuzione, DEF-001, e stato corretto e ritestato.</w:t>
+        <w:t>La baseline tecnica e stabile e le nuove funzionalita risultano integrate senza regressioni di build o schema. Il prodotto non puo tuttavia essere dichiarato collaudato al 100% sui 107 casi finche non vengono forniti ruolo DB runtime locale, fixture controllate, scenari mutativi sintetici e dispositivi mobili reali. L'unico difetto applicativo riproducibile emerso in questa esecuzione, DEF-001, e stato corretto e ritestato.</w:t>
       </w:r>
     </w:p>
     <w:sectPr>

</xml_diff>

<commit_message>
Fix quiz hashing and extend gamification acceptance
</commit_message>
<xml_diff>
--- a/docs/testing/SMF_Travel_Rapporto_Completo_Test_v1.1_2026-08-30.docx
+++ b/docs/testing/SMF_Travel_Rapporto_Completo_Test_v1.1_2026-08-30.docx
@@ -269,7 +269,7 @@
     </w:p>
     <w:p>
       <w:r>
-        <w:t>Sono stati censiti 107 casi d'uso. L'esecuzione ha prodotto 33 casi superati, 54 parzialmente coperti, 20 bloccati da prerequisiti esterni e 0 casi completamente non superati. Le suite strutturali, la build, il modello dati, le migrazioni fino alla 108, Analytics, chat, gestione spese e governance contenuti risultano conformi.</w:t>
+        <w:t>Sono stati censiti 107 casi d'uso. L'esecuzione ha prodotto 35 casi superati, 55 parzialmente coperti, 17 bloccati da prerequisiti esterni e 0 casi completamente non superati. Le suite strutturali, la build, il modello dati, le migrazioni fino alla 109, Analytics, chat, gestione spese e governance contenuti risultano conformi.</w:t>
       </w:r>
     </w:p>
     <w:tbl>
@@ -372,7 +372,7 @@
               <w:rPr>
                 <w:sz w:val="16"/>
               </w:rPr>
-              <w:t>33</w:t>
+              <w:t>35</w:t>
             </w:r>
           </w:p>
         </w:tc>
@@ -426,7 +426,7 @@
               <w:rPr>
                 <w:sz w:val="16"/>
               </w:rPr>
-              <w:t>54</w:t>
+              <w:t>55</w:t>
             </w:r>
           </w:p>
         </w:tc>
@@ -480,7 +480,7 @@
               <w:rPr>
                 <w:sz w:val="16"/>
               </w:rPr>
-              <w:t>20</w:t>
+              <w:t>17</w:t>
             </w:r>
           </w:p>
         </w:tc>
@@ -613,7 +613,7 @@
         <w:spacing w:after="80"/>
       </w:pPr>
       <w:r>
-        <w:t>Migrazioni fino alla 108 verificate: KPI versionati, registro variazioni, ricevute di lettura, governance fonti e contratti runtime finali.</w:t>
+        <w:t>Migrazioni fino alla 109 verificate: KPI, registro variazioni, governance fonti, contratti runtime e dipendenza crittografica pgcrypto isolata.</w:t>
       </w:r>
     </w:p>
     <w:p>
@@ -977,7 +977,7 @@
               <w:rPr>
                 <w:sz w:val="16"/>
               </w:rPr>
-              <w:t>La fixture gamification pubblicata non e disponibile; acceptance quiz/sfide non parte.</w:t>
+              <w:t>Quiz, missioni e giochi sono verificati; mancano fixture media per bingo e contest fotografico con valutazione AI.</w:t>
             </w:r>
           </w:p>
         </w:tc>
@@ -994,7 +994,7 @@
               <w:rPr>
                 <w:sz w:val="16"/>
               </w:rPr>
-              <w:t>Creare una partenza sintetica versionata con giochi, quiz, contest e due viaggiatori.</w:t>
+              <w:t>Creare asset R2 sintetici e una partenza versionata con bingo e contest.</w:t>
             </w:r>
           </w:p>
         </w:tc>
@@ -4836,6 +4836,148 @@
                 <w:sz w:val="16"/>
               </w:rPr>
               <w:t>Creazione gruppo e viaggiatore, riconciliazione V3, invito monouso e invisibilita dopo il consumo verificati; nessun dato persistito.</w:t>
+            </w:r>
+          </w:p>
+        </w:tc>
+      </w:tr>
+      <w:tr>
+        <w:tc>
+          <w:tcPr>
+            <w:tcW w:type="dxa" w:w="3384"/>
+            <w:vAlign w:val="top"/>
+          </w:tcPr>
+          <w:p>
+            <w:pPr>
+              <w:spacing w:after="40"/>
+            </w:pPr>
+            <w:r>
+              <w:rPr>
+                <w:sz w:val="16"/>
+              </w:rPr>
+              <w:t>acceptance:v3:gamification-write</w:t>
+            </w:r>
+          </w:p>
+        </w:tc>
+        <w:tc>
+          <w:tcPr>
+            <w:tcW w:type="dxa" w:w="1512"/>
+            <w:vAlign w:val="top"/>
+            <w:shd w:fill="DFF3E6"/>
+          </w:tcPr>
+          <w:p>
+            <w:pPr>
+              <w:spacing w:after="40"/>
+            </w:pPr>
+            <w:r>
+              <w:rPr>
+                <w:sz w:val="16"/>
+              </w:rPr>
+              <w:t>SUPERATO</w:t>
+            </w:r>
+          </w:p>
+        </w:tc>
+        <w:tc>
+          <w:tcPr>
+            <w:tcW w:type="dxa" w:w="1656"/>
+            <w:vAlign w:val="top"/>
+          </w:tcPr>
+          <w:p>
+            <w:pPr>
+              <w:spacing w:after="40"/>
+            </w:pPr>
+            <w:r>
+              <w:rPr>
+                <w:sz w:val="16"/>
+              </w:rPr>
+              <w:t>Neon / rollback</w:t>
+            </w:r>
+          </w:p>
+        </w:tc>
+        <w:tc>
+          <w:tcPr>
+            <w:tcW w:type="dxa" w:w="2808"/>
+            <w:vAlign w:val="top"/>
+          </w:tcPr>
+          <w:p>
+            <w:pPr>
+              <w:spacing w:after="40"/>
+            </w:pPr>
+            <w:r>
+              <w:rPr>
+                <w:sz w:val="16"/>
+              </w:rPr>
+              <w:t>Scrittura mission, quiz, order game e word game con ruolo smf_app; grant quiz e rollback verificati.</w:t>
+            </w:r>
+          </w:p>
+        </w:tc>
+      </w:tr>
+      <w:tr>
+        <w:tc>
+          <w:tcPr>
+            <w:tcW w:type="dxa" w:w="3384"/>
+            <w:vAlign w:val="top"/>
+          </w:tcPr>
+          <w:p>
+            <w:pPr>
+              <w:spacing w:after="40"/>
+            </w:pPr>
+            <w:r>
+              <w:rPr>
+                <w:sz w:val="16"/>
+              </w:rPr>
+              <w:t>db:migrate:v3:pgcrypto-digest</w:t>
+            </w:r>
+          </w:p>
+        </w:tc>
+        <w:tc>
+          <w:tcPr>
+            <w:tcW w:type="dxa" w:w="1512"/>
+            <w:vAlign w:val="top"/>
+            <w:shd w:fill="DFF3E6"/>
+          </w:tcPr>
+          <w:p>
+            <w:pPr>
+              <w:spacing w:after="40"/>
+            </w:pPr>
+            <w:r>
+              <w:rPr>
+                <w:sz w:val="16"/>
+              </w:rPr>
+              <w:t>SUPERATO</w:t>
+            </w:r>
+          </w:p>
+        </w:tc>
+        <w:tc>
+          <w:tcPr>
+            <w:tcW w:type="dxa" w:w="1656"/>
+            <w:vAlign w:val="top"/>
+          </w:tcPr>
+          <w:p>
+            <w:pPr>
+              <w:spacing w:after="40"/>
+            </w:pPr>
+            <w:r>
+              <w:rPr>
+                <w:sz w:val="16"/>
+              </w:rPr>
+              <w:t>Neon</w:t>
+            </w:r>
+          </w:p>
+        </w:tc>
+        <w:tc>
+          <w:tcPr>
+            <w:tcW w:type="dxa" w:w="2808"/>
+            <w:vAlign w:val="top"/>
+          </w:tcPr>
+          <w:p>
+            <w:pPr>
+              <w:spacing w:after="40"/>
+            </w:pPr>
+            <w:r>
+              <w:rPr>
+                <w:sz w:val="16"/>
+              </w:rPr>
+              <w:t>Migrazione 109 applicata: pgcrypto isolato nello schema extensions e bridge digest non invocabile direttamente dal runtime.</w:t>
             </w:r>
           </w:p>
         </w:tc>
@@ -9115,17 +9257,17 @@
           <w:tcPr>
             <w:tcW w:type="dxa" w:w="1656"/>
             <w:vAlign w:val="top"/>
-            <w:shd w:fill="E8EEF5"/>
-          </w:tcPr>
-          <w:p>
-            <w:pPr>
-              <w:spacing w:after="40"/>
-            </w:pPr>
-            <w:r>
-              <w:rPr>
-                <w:sz w:val="16"/>
-              </w:rPr>
-              <w:t>BLOCCATO</w:t>
+            <w:shd w:fill="FFF2CC"/>
+          </w:tcPr>
+          <w:p>
+            <w:pPr>
+              <w:spacing w:after="40"/>
+            </w:pPr>
+            <w:r>
+              <w:rPr>
+                <w:sz w:val="16"/>
+              </w:rPr>
+              <w:t>PARZIALE</w:t>
             </w:r>
           </w:p>
         </w:tc>
@@ -9142,7 +9284,7 @@
               <w:rPr>
                 <w:sz w:val="16"/>
               </w:rPr>
-              <w:t>Fixture gamification pubblicata non disponibile; scoring AI e chiusura schedulata non eseguiti.</w:t>
+              <w:t>Schema e codice verificati; scenario end-to-end con contenuti pubblicati non disponibile.</w:t>
             </w:r>
           </w:p>
         </w:tc>
@@ -9399,17 +9541,17 @@
           <w:tcPr>
             <w:tcW w:type="dxa" w:w="1656"/>
             <w:vAlign w:val="top"/>
-            <w:shd w:fill="E8EEF5"/>
-          </w:tcPr>
-          <w:p>
-            <w:pPr>
-              <w:spacing w:after="40"/>
-            </w:pPr>
-            <w:r>
-              <w:rPr>
-                <w:sz w:val="16"/>
-              </w:rPr>
-              <w:t>BLOCCATO</w:t>
+            <w:shd w:fill="DFF3E6"/>
+          </w:tcPr>
+          <w:p>
+            <w:pPr>
+              <w:spacing w:after="40"/>
+            </w:pPr>
+            <w:r>
+              <w:rPr>
+                <w:sz w:val="16"/>
+              </w:rPr>
+              <w:t>SUPERATO</w:t>
             </w:r>
           </w:p>
         </w:tc>
@@ -9426,7 +9568,7 @@
               <w:rPr>
                 <w:sz w:val="16"/>
               </w:rPr>
-              <w:t>Fixture gamification pubblicata non disponibile; scoring AI e chiusura schedulata non eseguiti.</w:t>
+              <w:t>Acceptance runtime con ruolo smf_app e rollback: quiz giornalieri e giochi tematici salvati; grant quiz verificato.</w:t>
             </w:r>
           </w:p>
         </w:tc>
@@ -9470,17 +9612,17 @@
           <w:tcPr>
             <w:tcW w:type="dxa" w:w="1656"/>
             <w:vAlign w:val="top"/>
-            <w:shd w:fill="E8EEF5"/>
-          </w:tcPr>
-          <w:p>
-            <w:pPr>
-              <w:spacing w:after="40"/>
-            </w:pPr>
-            <w:r>
-              <w:rPr>
-                <w:sz w:val="16"/>
-              </w:rPr>
-              <w:t>BLOCCATO</w:t>
+            <w:shd w:fill="DFF3E6"/>
+          </w:tcPr>
+          <w:p>
+            <w:pPr>
+              <w:spacing w:after="40"/>
+            </w:pPr>
+            <w:r>
+              <w:rPr>
+                <w:sz w:val="16"/>
+              </w:rPr>
+              <w:t>SUPERATO</w:t>
             </w:r>
           </w:p>
         </w:tc>
@@ -9497,7 +9639,7 @@
               <w:rPr>
                 <w:sz w:val="16"/>
               </w:rPr>
-              <w:t>Fixture gamification pubblicata non disponibile; scoring AI e chiusura schedulata non eseguiti.</w:t>
+              <w:t>Acceptance runtime con ruolo smf_app e rollback: quiz giornalieri e giochi tematici salvati; grant quiz verificato.</w:t>
             </w:r>
           </w:p>
         </w:tc>

</xml_diff>

<commit_message>
Enforce two-photo contest contract
</commit_message>
<xml_diff>
--- a/docs/testing/SMF_Travel_Rapporto_Completo_Test_v1.1_2026-08-30.docx
+++ b/docs/testing/SMF_Travel_Rapporto_Completo_Test_v1.1_2026-08-30.docx
@@ -269,7 +269,7 @@
     </w:p>
     <w:p>
       <w:r>
-        <w:t>Sono stati censiti 107 casi d'uso. L'esecuzione ha prodotto 35 casi superati, 55 parzialmente coperti, 17 bloccati da prerequisiti esterni e 0 casi completamente non superati. Le suite strutturali, la build, il modello dati, le migrazioni fino alla 109, Analytics, chat, gestione spese e governance contenuti risultano conformi.</w:t>
+        <w:t>Sono stati censiti 107 casi d'uso. L'esecuzione ha prodotto 35 casi superati, 56 parzialmente coperti, 16 bloccati da prerequisiti esterni e 0 casi completamente non superati. Le suite strutturali, la build, il modello dati, le migrazioni fino alla 111, Analytics, chat, gestione spese e governance contenuti risultano conformi.</w:t>
       </w:r>
     </w:p>
     <w:tbl>
@@ -426,7 +426,7 @@
               <w:rPr>
                 <w:sz w:val="16"/>
               </w:rPr>
-              <w:t>55</w:t>
+              <w:t>56</w:t>
             </w:r>
           </w:p>
         </w:tc>
@@ -480,7 +480,7 @@
               <w:rPr>
                 <w:sz w:val="16"/>
               </w:rPr>
-              <w:t>17</w:t>
+              <w:t>16</w:t>
             </w:r>
           </w:p>
         </w:tc>
@@ -613,7 +613,7 @@
         <w:spacing w:after="80"/>
       </w:pPr>
       <w:r>
-        <w:t>Migrazioni fino alla 109 verificate: KPI, registro variazioni, governance fonti, contratti runtime e dipendenza crittografica pgcrypto isolata.</w:t>
+        <w:t>Migrazioni fino alla 111 verificate: KPI, governance fonti, contratti runtime, pgcrypto isolata e limite contest a due foto.</w:t>
       </w:r>
     </w:p>
     <w:p>
@@ -4978,6 +4978,148 @@
                 <w:sz w:val="16"/>
               </w:rPr>
               <w:t>Migrazione 109 applicata: pgcrypto isolato nello schema extensions e bridge digest non invocabile direttamente dal runtime.</w:t>
+            </w:r>
+          </w:p>
+        </w:tc>
+      </w:tr>
+      <w:tr>
+        <w:tc>
+          <w:tcPr>
+            <w:tcW w:type="dxa" w:w="3384"/>
+            <w:vAlign w:val="top"/>
+          </w:tcPr>
+          <w:p>
+            <w:pPr>
+              <w:spacing w:after="40"/>
+            </w:pPr>
+            <w:r>
+              <w:rPr>
+                <w:sz w:val="16"/>
+              </w:rPr>
+              <w:t>db:migrate:v3:photo-contest-limit</w:t>
+            </w:r>
+          </w:p>
+        </w:tc>
+        <w:tc>
+          <w:tcPr>
+            <w:tcW w:type="dxa" w:w="1512"/>
+            <w:vAlign w:val="top"/>
+            <w:shd w:fill="DFF3E6"/>
+          </w:tcPr>
+          <w:p>
+            <w:pPr>
+              <w:spacing w:after="40"/>
+            </w:pPr>
+            <w:r>
+              <w:rPr>
+                <w:sz w:val="16"/>
+              </w:rPr>
+              <w:t>SUPERATO</w:t>
+            </w:r>
+          </w:p>
+        </w:tc>
+        <w:tc>
+          <w:tcPr>
+            <w:tcW w:type="dxa" w:w="1656"/>
+            <w:vAlign w:val="top"/>
+          </w:tcPr>
+          <w:p>
+            <w:pPr>
+              <w:spacing w:after="40"/>
+            </w:pPr>
+            <w:r>
+              <w:rPr>
+                <w:sz w:val="16"/>
+              </w:rPr>
+              <w:t>Neon</w:t>
+            </w:r>
+          </w:p>
+        </w:tc>
+        <w:tc>
+          <w:tcPr>
+            <w:tcW w:type="dxa" w:w="2808"/>
+            <w:vAlign w:val="top"/>
+          </w:tcPr>
+          <w:p>
+            <w:pPr>
+              <w:spacing w:after="40"/>
+            </w:pPr>
+            <w:r>
+              <w:rPr>
+                <w:sz w:val="16"/>
+              </w:rPr>
+              <w:t>Migrazione 110 applicata: due foto massime nei dati, nelle attivita e nel vincolo participant_slot.</w:t>
+            </w:r>
+          </w:p>
+        </w:tc>
+      </w:tr>
+      <w:tr>
+        <w:tc>
+          <w:tcPr>
+            <w:tcW w:type="dxa" w:w="3384"/>
+            <w:vAlign w:val="top"/>
+          </w:tcPr>
+          <w:p>
+            <w:pPr>
+              <w:spacing w:after="40"/>
+            </w:pPr>
+            <w:r>
+              <w:rPr>
+                <w:sz w:val="16"/>
+              </w:rPr>
+              <w:t>db:migrate:v3:photo-contest-gate</w:t>
+            </w:r>
+          </w:p>
+        </w:tc>
+        <w:tc>
+          <w:tcPr>
+            <w:tcW w:type="dxa" w:w="1512"/>
+            <w:vAlign w:val="top"/>
+            <w:shd w:fill="DFF3E6"/>
+          </w:tcPr>
+          <w:p>
+            <w:pPr>
+              <w:spacing w:after="40"/>
+            </w:pPr>
+            <w:r>
+              <w:rPr>
+                <w:sz w:val="16"/>
+              </w:rPr>
+              <w:t>SUPERATO</w:t>
+            </w:r>
+          </w:p>
+        </w:tc>
+        <w:tc>
+          <w:tcPr>
+            <w:tcW w:type="dxa" w:w="1656"/>
+            <w:vAlign w:val="top"/>
+          </w:tcPr>
+          <w:p>
+            <w:pPr>
+              <w:spacing w:after="40"/>
+            </w:pPr>
+            <w:r>
+              <w:rPr>
+                <w:sz w:val="16"/>
+              </w:rPr>
+              <w:t>Neon</w:t>
+            </w:r>
+          </w:p>
+        </w:tc>
+        <w:tc>
+          <w:tcPr>
+            <w:tcW w:type="dxa" w:w="2808"/>
+            <w:vAlign w:val="top"/>
+          </w:tcPr>
+          <w:p>
+            <w:pPr>
+              <w:spacing w:after="40"/>
+            </w:pPr>
+            <w:r>
+              <w:rPr>
+                <w:sz w:val="16"/>
+              </w:rPr>
+              <w:t>Migrazione 111 applicata: publish gate allineato al contratto di due foto; validazione V3 completa superata.</w:t>
             </w:r>
           </w:p>
         </w:tc>
@@ -9683,17 +9825,17 @@
           <w:tcPr>
             <w:tcW w:type="dxa" w:w="1656"/>
             <w:vAlign w:val="top"/>
-            <w:shd w:fill="E8EEF5"/>
-          </w:tcPr>
-          <w:p>
-            <w:pPr>
-              <w:spacing w:after="40"/>
-            </w:pPr>
-            <w:r>
-              <w:rPr>
-                <w:sz w:val="16"/>
-              </w:rPr>
-              <w:t>BLOCCATO</w:t>
+            <w:shd w:fill="FFF2CC"/>
+          </w:tcPr>
+          <w:p>
+            <w:pPr>
+              <w:spacing w:after="40"/>
+            </w:pPr>
+            <w:r>
+              <w:rPr>
+                <w:sz w:val="16"/>
+              </w:rPr>
+              <w:t>PARZIALE</w:t>
             </w:r>
           </w:p>
         </w:tc>
@@ -9710,7 +9852,7 @@
               <w:rPr>
                 <w:sz w:val="16"/>
               </w:rPr>
-              <w:t>Fixture gamification pubblicata non disponibile; scoring AI e chiusura schedulata non eseguiti.</w:t>
+              <w:t>Schema e codice verificati; scenario end-to-end con contenuti pubblicati non disponibile.</w:t>
             </w:r>
           </w:p>
         </w:tc>

</xml_diff>

<commit_message>
Verify photo contest lifecycle
</commit_message>
<xml_diff>
--- a/docs/testing/SMF_Travel_Rapporto_Completo_Test_v1.1_2026-08-30.docx
+++ b/docs/testing/SMF_Travel_Rapporto_Completo_Test_v1.1_2026-08-30.docx
@@ -269,7 +269,7 @@
     </w:p>
     <w:p>
       <w:r>
-        <w:t>Sono stati censiti 107 casi d'uso. L'esecuzione ha prodotto 35 casi superati, 56 parzialmente coperti, 16 bloccati da prerequisiti esterni e 0 casi completamente non superati. Le suite strutturali, la build, il modello dati, le migrazioni fino alla 111, Analytics, chat, gestione spese e governance contenuti risultano conformi.</w:t>
+        <w:t>Sono stati censiti 107 casi d'uso. L'esecuzione ha prodotto 36 casi superati, 56 parzialmente coperti, 15 bloccati da prerequisiti esterni e 0 casi completamente non superati. Le suite strutturali, la build, il modello dati, le migrazioni fino alla 111, Analytics, chat, gestione spese e governance contenuti risultano conformi.</w:t>
       </w:r>
     </w:p>
     <w:tbl>
@@ -372,7 +372,7 @@
               <w:rPr>
                 <w:sz w:val="16"/>
               </w:rPr>
-              <w:t>35</w:t>
+              <w:t>36</w:t>
             </w:r>
           </w:p>
         </w:tc>
@@ -480,7 +480,7 @@
               <w:rPr>
                 <w:sz w:val="16"/>
               </w:rPr>
-              <w:t>16</w:t>
+              <w:t>15</w:t>
             </w:r>
           </w:p>
         </w:tc>
@@ -5138,6 +5138,77 @@
               <w:rPr>
                 <w:sz w:val="16"/>
               </w:rPr>
+              <w:t>acceptance:v3:photo-contest-lifecycle</w:t>
+            </w:r>
+          </w:p>
+        </w:tc>
+        <w:tc>
+          <w:tcPr>
+            <w:tcW w:type="dxa" w:w="1512"/>
+            <w:vAlign w:val="top"/>
+            <w:shd w:fill="DFF3E6"/>
+          </w:tcPr>
+          <w:p>
+            <w:pPr>
+              <w:spacing w:after="40"/>
+            </w:pPr>
+            <w:r>
+              <w:rPr>
+                <w:sz w:val="16"/>
+              </w:rPr>
+              <w:t>SUPERATO</w:t>
+            </w:r>
+          </w:p>
+        </w:tc>
+        <w:tc>
+          <w:tcPr>
+            <w:tcW w:type="dxa" w:w="1656"/>
+            <w:vAlign w:val="top"/>
+          </w:tcPr>
+          <w:p>
+            <w:pPr>
+              <w:spacing w:after="40"/>
+            </w:pPr>
+            <w:r>
+              <w:rPr>
+                <w:sz w:val="16"/>
+              </w:rPr>
+              <w:t>Neon / rollback</w:t>
+            </w:r>
+          </w:p>
+        </w:tc>
+        <w:tc>
+          <w:tcPr>
+            <w:tcW w:type="dxa" w:w="2808"/>
+            <w:vAlign w:val="top"/>
+          </w:tcPr>
+          <w:p>
+            <w:pPr>
+              <w:spacing w:after="40"/>
+            </w:pPr>
+            <w:r>
+              <w:rPr>
+                <w:sz w:val="16"/>
+              </w:rPr>
+              <w:t>Due bozze, sostituzione, rifiuto terza foto, conferma, scoring strutturato, selezione migliore e chiusura temporale verificati.</w:t>
+            </w:r>
+          </w:p>
+        </w:tc>
+      </w:tr>
+      <w:tr>
+        <w:tc>
+          <w:tcPr>
+            <w:tcW w:type="dxa" w:w="3384"/>
+            <w:vAlign w:val="top"/>
+          </w:tcPr>
+          <w:p>
+            <w:pPr>
+              <w:spacing w:after="40"/>
+            </w:pPr>
+            <w:r>
+              <w:rPr>
+                <w:sz w:val="16"/>
+              </w:rPr>
               <w:t>HTTP pagine e PWA</w:t>
             </w:r>
           </w:p>
@@ -9710,7 +9781,7 @@
               <w:rPr>
                 <w:sz w:val="16"/>
               </w:rPr>
-              <w:t>Acceptance runtime con ruolo smf_app e rollback: quiz giornalieri e giochi tematici salvati; grant quiz verificato.</w:t>
+              <w:t>Acceptance runtime con rollback: quiz e giochi salvati; contest verificato con due bozze, sostituzione, conferma e limite autoritativo.</w:t>
             </w:r>
           </w:p>
         </w:tc>
@@ -9781,7 +9852,7 @@
               <w:rPr>
                 <w:sz w:val="16"/>
               </w:rPr>
-              <w:t>Acceptance runtime con ruolo smf_app e rollback: quiz giornalieri e giochi tematici salvati; grant quiz verificato.</w:t>
+              <w:t>Acceptance runtime con rollback: quiz e giochi salvati; contest verificato con due bozze, sostituzione, conferma e limite autoritativo.</w:t>
             </w:r>
           </w:p>
         </w:tc>
@@ -9825,17 +9896,17 @@
           <w:tcPr>
             <w:tcW w:type="dxa" w:w="1656"/>
             <w:vAlign w:val="top"/>
-            <w:shd w:fill="FFF2CC"/>
-          </w:tcPr>
-          <w:p>
-            <w:pPr>
-              <w:spacing w:after="40"/>
-            </w:pPr>
-            <w:r>
-              <w:rPr>
-                <w:sz w:val="16"/>
-              </w:rPr>
-              <w:t>PARZIALE</w:t>
+            <w:shd w:fill="DFF3E6"/>
+          </w:tcPr>
+          <w:p>
+            <w:pPr>
+              <w:spacing w:after="40"/>
+            </w:pPr>
+            <w:r>
+              <w:rPr>
+                <w:sz w:val="16"/>
+              </w:rPr>
+              <w:t>SUPERATO</w:t>
             </w:r>
           </w:p>
         </w:tc>
@@ -9852,7 +9923,7 @@
               <w:rPr>
                 <w:sz w:val="16"/>
               </w:rPr>
-              <w:t>Schema e codice verificati; scenario end-to-end con contenuti pubblicati non disponibile.</w:t>
+              <w:t>Acceptance runtime con rollback: quiz e giochi salvati; contest verificato con due bozze, sostituzione, conferma e limite autoritativo.</w:t>
             </w:r>
           </w:p>
         </w:tc>
@@ -9967,17 +10038,17 @@
           <w:tcPr>
             <w:tcW w:type="dxa" w:w="1656"/>
             <w:vAlign w:val="top"/>
-            <w:shd w:fill="E8EEF5"/>
-          </w:tcPr>
-          <w:p>
-            <w:pPr>
-              <w:spacing w:after="40"/>
-            </w:pPr>
-            <w:r>
-              <w:rPr>
-                <w:sz w:val="16"/>
-              </w:rPr>
-              <w:t>BLOCCATO</w:t>
+            <w:shd w:fill="FFF2CC"/>
+          </w:tcPr>
+          <w:p>
+            <w:pPr>
+              <w:spacing w:after="40"/>
+            </w:pPr>
+            <w:r>
+              <w:rPr>
+                <w:sz w:val="16"/>
+              </w:rPr>
+              <w:t>PARZIALE</w:t>
             </w:r>
           </w:p>
         </w:tc>
@@ -9994,7 +10065,7 @@
               <w:rPr>
                 <w:sz w:val="16"/>
               </w:rPr>
-              <w:t>Fixture gamification pubblicata non disponibile; scoring AI e chiusura schedulata non eseguiti.</w:t>
+              <w:t>Schema e codice verificati; scenario end-to-end con contenuti pubblicati non disponibile.</w:t>
             </w:r>
           </w:p>
         </w:tc>

</xml_diff>

<commit_message>
Validate Bedrock photo scoring
</commit_message>
<xml_diff>
--- a/docs/testing/SMF_Travel_Rapporto_Completo_Test_v1.1_2026-08-30.docx
+++ b/docs/testing/SMF_Travel_Rapporto_Completo_Test_v1.1_2026-08-30.docx
@@ -269,7 +269,7 @@
     </w:p>
     <w:p>
       <w:r>
-        <w:t>Sono stati censiti 107 casi d'uso. L'esecuzione ha prodotto 36 casi superati, 56 parzialmente coperti, 15 bloccati da prerequisiti esterni e 0 casi completamente non superati. Le suite strutturali, la build, il modello dati, le migrazioni fino alla 111, Analytics, chat, gestione spese e governance contenuti risultano conformi.</w:t>
+        <w:t>Sono stati censiti 107 casi d'uso. L'esecuzione ha prodotto 37 casi superati, 56 parzialmente coperti, 14 bloccati da prerequisiti esterni e 0 casi completamente non superati. Le suite strutturali, la build, il modello dati, le migrazioni fino alla 111, Analytics, chat, gestione spese e governance contenuti risultano conformi.</w:t>
       </w:r>
     </w:p>
     <w:tbl>
@@ -372,7 +372,7 @@
               <w:rPr>
                 <w:sz w:val="16"/>
               </w:rPr>
-              <w:t>36</w:t>
+              <w:t>37</w:t>
             </w:r>
           </w:p>
         </w:tc>
@@ -480,7 +480,7 @@
               <w:rPr>
                 <w:sz w:val="16"/>
               </w:rPr>
-              <w:t>15</w:t>
+              <w:t>14</w:t>
             </w:r>
           </w:p>
         </w:tc>
@@ -5209,6 +5209,77 @@
               <w:rPr>
                 <w:sz w:val="16"/>
               </w:rPr>
+              <w:t>acceptance:bedrock:photo-evaluation</w:t>
+            </w:r>
+          </w:p>
+        </w:tc>
+        <w:tc>
+          <w:tcPr>
+            <w:tcW w:type="dxa" w:w="1512"/>
+            <w:vAlign w:val="top"/>
+            <w:shd w:fill="DFF3E6"/>
+          </w:tcPr>
+          <w:p>
+            <w:pPr>
+              <w:spacing w:after="40"/>
+            </w:pPr>
+            <w:r>
+              <w:rPr>
+                <w:sz w:val="16"/>
+              </w:rPr>
+              <w:t>SUPERATO</w:t>
+            </w:r>
+          </w:p>
+        </w:tc>
+        <w:tc>
+          <w:tcPr>
+            <w:tcW w:type="dxa" w:w="1656"/>
+            <w:vAlign w:val="top"/>
+          </w:tcPr>
+          <w:p>
+            <w:pPr>
+              <w:spacing w:after="40"/>
+            </w:pPr>
+            <w:r>
+              <w:rPr>
+                <w:sz w:val="16"/>
+              </w:rPr>
+              <w:t>2 invocazioni</w:t>
+            </w:r>
+          </w:p>
+        </w:tc>
+        <w:tc>
+          <w:tcPr>
+            <w:tcW w:type="dxa" w:w="2808"/>
+            <w:vAlign w:val="top"/>
+          </w:tcPr>
+          <w:p>
+            <w:pPr>
+              <w:spacing w:after="40"/>
+            </w:pPr>
+            <w:r>
+              <w:rPr>
+                <w:sz w:val="16"/>
+              </w:rPr>
+              <w:t>Nova Lite EU: missione fotografica e due foto contest valutate tramite Tool Use; 6.457 token input e 359 output.</w:t>
+            </w:r>
+          </w:p>
+        </w:tc>
+      </w:tr>
+      <w:tr>
+        <w:tc>
+          <w:tcPr>
+            <w:tcW w:type="dxa" w:w="3384"/>
+            <w:vAlign w:val="top"/>
+          </w:tcPr>
+          <w:p>
+            <w:pPr>
+              <w:spacing w:after="40"/>
+            </w:pPr>
+            <w:r>
+              <w:rPr>
+                <w:sz w:val="16"/>
+              </w:rPr>
               <w:t>HTTP pagine e PWA</w:t>
             </w:r>
           </w:p>
@@ -9781,7 +9852,7 @@
               <w:rPr>
                 <w:sz w:val="16"/>
               </w:rPr>
-              <w:t>Acceptance runtime con rollback: quiz e giochi salvati; contest verificato con due bozze, sostituzione, conferma e limite autoritativo.</w:t>
+              <w:t>Acceptance runtime con rollback e Bedrock reale: quiz, giochi e contest verificati; scoring AI Nova Lite tipizzato e identificativi foto validati.</w:t>
             </w:r>
           </w:p>
         </w:tc>
@@ -9852,7 +9923,7 @@
               <w:rPr>
                 <w:sz w:val="16"/>
               </w:rPr>
-              <w:t>Acceptance runtime con rollback: quiz e giochi salvati; contest verificato con due bozze, sostituzione, conferma e limite autoritativo.</w:t>
+              <w:t>Acceptance runtime con rollback e Bedrock reale: quiz, giochi e contest verificati; scoring AI Nova Lite tipizzato e identificativi foto validati.</w:t>
             </w:r>
           </w:p>
         </w:tc>
@@ -9923,7 +9994,7 @@
               <w:rPr>
                 <w:sz w:val="16"/>
               </w:rPr>
-              <w:t>Acceptance runtime con rollback: quiz e giochi salvati; contest verificato con due bozze, sostituzione, conferma e limite autoritativo.</w:t>
+              <w:t>Acceptance runtime con rollback e Bedrock reale: quiz, giochi e contest verificati; scoring AI Nova Lite tipizzato e identificativi foto validati.</w:t>
             </w:r>
           </w:p>
         </w:tc>
@@ -9967,17 +10038,17 @@
           <w:tcPr>
             <w:tcW w:type="dxa" w:w="1656"/>
             <w:vAlign w:val="top"/>
-            <w:shd w:fill="E8EEF5"/>
-          </w:tcPr>
-          <w:p>
-            <w:pPr>
-              <w:spacing w:after="40"/>
-            </w:pPr>
-            <w:r>
-              <w:rPr>
-                <w:sz w:val="16"/>
-              </w:rPr>
-              <w:t>BLOCCATO</w:t>
+            <w:shd w:fill="DFF3E6"/>
+          </w:tcPr>
+          <w:p>
+            <w:pPr>
+              <w:spacing w:after="40"/>
+            </w:pPr>
+            <w:r>
+              <w:rPr>
+                <w:sz w:val="16"/>
+              </w:rPr>
+              <w:t>SUPERATO</w:t>
             </w:r>
           </w:p>
         </w:tc>
@@ -9994,7 +10065,7 @@
               <w:rPr>
                 <w:sz w:val="16"/>
               </w:rPr>
-              <w:t>Fixture gamification pubblicata non disponibile; scoring AI e chiusura schedulata non eseguiti.</w:t>
+              <w:t>Acceptance runtime con rollback e Bedrock reale: quiz, giochi e contest verificati; scoring AI Nova Lite tipizzato e identificativi foto validati.</w:t>
             </w:r>
           </w:p>
         </w:tc>

</xml_diff>

<commit_message>
Fix bingo evidence scope and verify attempt limits
</commit_message>
<xml_diff>
--- a/docs/testing/SMF_Travel_Rapporto_Completo_Test_v1.1_2026-08-30.docx
+++ b/docs/testing/SMF_Travel_Rapporto_Completo_Test_v1.1_2026-08-30.docx
@@ -269,7 +269,7 @@
     </w:p>
     <w:p>
       <w:r>
-        <w:t>Sono stati censiti 107 casi d'uso. L'esecuzione ha prodotto 37 casi superati, 56 parzialmente coperti, 14 bloccati da prerequisiti esterni e 0 casi completamente non superati. Le suite strutturali, la build, il modello dati, le migrazioni fino alla 111, Analytics, chat, gestione spese e governance contenuti risultano conformi.</w:t>
+        <w:t>Sono stati censiti 107 casi d'uso. L'esecuzione ha prodotto 39 casi superati, 56 parzialmente coperti, 12 bloccati da prerequisiti esterni e 0 casi completamente non superati. Le suite strutturali, la build, il modello dati, le migrazioni fino alla 112, Analytics, chat, gestione spese e governance contenuti risultano conformi.</w:t>
       </w:r>
     </w:p>
     <w:tbl>
@@ -372,7 +372,7 @@
               <w:rPr>
                 <w:sz w:val="16"/>
               </w:rPr>
-              <w:t>37</w:t>
+              <w:t>39</w:t>
             </w:r>
           </w:p>
         </w:tc>
@@ -480,7 +480,7 @@
               <w:rPr>
                 <w:sz w:val="16"/>
               </w:rPr>
-              <w:t>14</w:t>
+              <w:t>12</w:t>
             </w:r>
           </w:p>
         </w:tc>
@@ -613,7 +613,7 @@
         <w:spacing w:after="80"/>
       </w:pPr>
       <w:r>
-        <w:t>Migrazioni fino alla 111 verificate: KPI, governance fonti, contratti runtime, pgcrypto isolata e limite contest a due foto.</w:t>
+        <w:t>Migrazioni fino alla 112 verificate: KPI, governance fonti, contratti runtime, pgcrypto, contest a due foto e scrittura bingo globale.</w:t>
       </w:r>
     </w:p>
     <w:p>
@@ -5262,6 +5262,148 @@
                 <w:sz w:val="16"/>
               </w:rPr>
               <w:t>Nova Lite EU: missione fotografica e due foto contest valutate tramite Tool Use; 6.457 token input e 359 output.</w:t>
+            </w:r>
+          </w:p>
+        </w:tc>
+      </w:tr>
+      <w:tr>
+        <w:tc>
+          <w:tcPr>
+            <w:tcW w:type="dxa" w:w="3384"/>
+            <w:vAlign w:val="top"/>
+          </w:tcPr>
+          <w:p>
+            <w:pPr>
+              <w:spacing w:after="40"/>
+            </w:pPr>
+            <w:r>
+              <w:rPr>
+                <w:sz w:val="16"/>
+              </w:rPr>
+              <w:t>db:migrate:v3:bingo-write-scope</w:t>
+            </w:r>
+          </w:p>
+        </w:tc>
+        <w:tc>
+          <w:tcPr>
+            <w:tcW w:type="dxa" w:w="1512"/>
+            <w:vAlign w:val="top"/>
+            <w:shd w:fill="DFF3E6"/>
+          </w:tcPr>
+          <w:p>
+            <w:pPr>
+              <w:spacing w:after="40"/>
+            </w:pPr>
+            <w:r>
+              <w:rPr>
+                <w:sz w:val="16"/>
+              </w:rPr>
+              <w:t>SUPERATO</w:t>
+            </w:r>
+          </w:p>
+        </w:tc>
+        <w:tc>
+          <w:tcPr>
+            <w:tcW w:type="dxa" w:w="1656"/>
+            <w:vAlign w:val="top"/>
+          </w:tcPr>
+          <w:p>
+            <w:pPr>
+              <w:spacing w:after="40"/>
+            </w:pPr>
+            <w:r>
+              <w:rPr>
+                <w:sz w:val="16"/>
+              </w:rPr>
+              <w:t>Neon</w:t>
+            </w:r>
+          </w:p>
+        </w:tc>
+        <w:tc>
+          <w:tcPr>
+            <w:tcW w:type="dxa" w:w="2808"/>
+            <w:vAlign w:val="top"/>
+          </w:tcPr>
+          <w:p>
+            <w:pPr>
+              <w:spacing w:after="40"/>
+            </w:pPr>
+            <w:r>
+              <w:rPr>
+                <w:sz w:val="16"/>
+              </w:rPr>
+              <w:t>Migrazione 112 applicata: il bingo globale e scrivibile da una giornata operativa senza ampliare lo scope tenant.</w:t>
+            </w:r>
+          </w:p>
+        </w:tc>
+      </w:tr>
+      <w:tr>
+        <w:tc>
+          <w:tcPr>
+            <w:tcW w:type="dxa" w:w="3384"/>
+            <w:vAlign w:val="top"/>
+          </w:tcPr>
+          <w:p>
+            <w:pPr>
+              <w:spacing w:after="40"/>
+            </w:pPr>
+            <w:r>
+              <w:rPr>
+                <w:sz w:val="16"/>
+              </w:rPr>
+              <w:t>acceptance:v3:photo-evidence-attempts</w:t>
+            </w:r>
+          </w:p>
+        </w:tc>
+        <w:tc>
+          <w:tcPr>
+            <w:tcW w:type="dxa" w:w="1512"/>
+            <w:vAlign w:val="top"/>
+            <w:shd w:fill="DFF3E6"/>
+          </w:tcPr>
+          <w:p>
+            <w:pPr>
+              <w:spacing w:after="40"/>
+            </w:pPr>
+            <w:r>
+              <w:rPr>
+                <w:sz w:val="16"/>
+              </w:rPr>
+              <w:t>SUPERATO</w:t>
+            </w:r>
+          </w:p>
+        </w:tc>
+        <w:tc>
+          <w:tcPr>
+            <w:tcW w:type="dxa" w:w="1656"/>
+            <w:vAlign w:val="top"/>
+          </w:tcPr>
+          <w:p>
+            <w:pPr>
+              <w:spacing w:after="40"/>
+            </w:pPr>
+            <w:r>
+              <w:rPr>
+                <w:sz w:val="16"/>
+              </w:rPr>
+              <w:t>Neon / rollback</w:t>
+            </w:r>
+          </w:p>
+        </w:tc>
+        <w:tc>
+          <w:tcPr>
+            <w:tcW w:type="dxa" w:w="2808"/>
+            <w:vAlign w:val="top"/>
+          </w:tcPr>
+          <w:p>
+            <w:pPr>
+              <w:spacing w:after="40"/>
+            </w:pPr>
+            <w:r>
+              <w:rPr>
+                <w:sz w:val="16"/>
+              </w:rPr>
+              <w:t>Missione approvata blocca ulteriori foto; due rifiuti bingo consumano i tentativi e il terzo e negato.</w:t>
             </w:r>
           </w:p>
         </w:tc>
@@ -9541,17 +9683,17 @@
           <w:tcPr>
             <w:tcW w:type="dxa" w:w="1656"/>
             <w:vAlign w:val="top"/>
-            <w:shd w:fill="FFF2CC"/>
-          </w:tcPr>
-          <w:p>
-            <w:pPr>
-              <w:spacing w:after="40"/>
-            </w:pPr>
-            <w:r>
-              <w:rPr>
-                <w:sz w:val="16"/>
-              </w:rPr>
-              <w:t>PARZIALE</w:t>
+            <w:shd w:fill="DFF3E6"/>
+          </w:tcPr>
+          <w:p>
+            <w:pPr>
+              <w:spacing w:after="40"/>
+            </w:pPr>
+            <w:r>
+              <w:rPr>
+                <w:sz w:val="16"/>
+              </w:rPr>
+              <w:t>SUPERATO</w:t>
             </w:r>
           </w:p>
         </w:tc>
@@ -9568,7 +9710,7 @@
               <w:rPr>
                 <w:sz w:val="16"/>
               </w:rPr>
-              <w:t>Schema e codice verificati; scenario end-to-end con contenuti pubblicati non disponibile.</w:t>
+              <w:t>Acceptance runtime con rollback e Bedrock reale: quiz, giochi e contest verificati; scoring AI Nova Lite tipizzato e identificativi foto validati.</w:t>
             </w:r>
           </w:p>
         </w:tc>
@@ -9612,17 +9754,17 @@
           <w:tcPr>
             <w:tcW w:type="dxa" w:w="1656"/>
             <w:vAlign w:val="top"/>
-            <w:shd w:fill="E8EEF5"/>
-          </w:tcPr>
-          <w:p>
-            <w:pPr>
-              <w:spacing w:after="40"/>
-            </w:pPr>
-            <w:r>
-              <w:rPr>
-                <w:sz w:val="16"/>
-              </w:rPr>
-              <w:t>BLOCCATO</w:t>
+            <w:shd w:fill="DFF3E6"/>
+          </w:tcPr>
+          <w:p>
+            <w:pPr>
+              <w:spacing w:after="40"/>
+            </w:pPr>
+            <w:r>
+              <w:rPr>
+                <w:sz w:val="16"/>
+              </w:rPr>
+              <w:t>SUPERATO</w:t>
             </w:r>
           </w:p>
         </w:tc>
@@ -9639,7 +9781,7 @@
               <w:rPr>
                 <w:sz w:val="16"/>
               </w:rPr>
-              <w:t>Fixture gamification pubblicata non disponibile; scoring AI e chiusura schedulata non eseguiti.</w:t>
+              <w:t>Acceptance runtime con rollback e Bedrock reale: quiz, giochi e contest verificati; scoring AI Nova Lite tipizzato e identificativi foto validati.</w:t>
             </w:r>
           </w:p>
         </w:tc>
@@ -9683,17 +9825,17 @@
           <w:tcPr>
             <w:tcW w:type="dxa" w:w="1656"/>
             <w:vAlign w:val="top"/>
-            <w:shd w:fill="E8EEF5"/>
-          </w:tcPr>
-          <w:p>
-            <w:pPr>
-              <w:spacing w:after="40"/>
-            </w:pPr>
-            <w:r>
-              <w:rPr>
-                <w:sz w:val="16"/>
-              </w:rPr>
-              <w:t>BLOCCATO</w:t>
+            <w:shd w:fill="FFF2CC"/>
+          </w:tcPr>
+          <w:p>
+            <w:pPr>
+              <w:spacing w:after="40"/>
+            </w:pPr>
+            <w:r>
+              <w:rPr>
+                <w:sz w:val="16"/>
+              </w:rPr>
+              <w:t>PARZIALE</w:t>
             </w:r>
           </w:p>
         </w:tc>
@@ -9710,7 +9852,7 @@
               <w:rPr>
                 <w:sz w:val="16"/>
               </w:rPr>
-              <w:t>Fixture gamification pubblicata non disponibile; scoring AI e chiusura schedulata non eseguiti.</w:t>
+              <w:t>Schema e codice verificati; scenario end-to-end con contenuti pubblicati non disponibile.</w:t>
             </w:r>
           </w:p>
         </w:tc>

</xml_diff>

<commit_message>
Unify bingo milestone scoring
</commit_message>
<xml_diff>
--- a/docs/testing/SMF_Travel_Rapporto_Completo_Test_v1.1_2026-08-30.docx
+++ b/docs/testing/SMF_Travel_Rapporto_Completo_Test_v1.1_2026-08-30.docx
@@ -269,7 +269,7 @@
     </w:p>
     <w:p>
       <w:r>
-        <w:t>Sono stati censiti 107 casi d'uso. L'esecuzione ha prodotto 39 casi superati, 56 parzialmente coperti, 12 bloccati da prerequisiti esterni e 0 casi completamente non superati. Le suite strutturali, la build, il modello dati, le migrazioni fino alla 112, Analytics, chat, gestione spese e governance contenuti risultano conformi.</w:t>
+        <w:t>Sono stati censiti 107 casi d'uso. L'esecuzione ha prodotto 41 casi superati, 55 parzialmente coperti, 11 bloccati da prerequisiti esterni e 0 casi completamente non superati. Le suite strutturali, la build, il modello dati, le migrazioni fino alla 112, Analytics, chat, gestione spese e governance contenuti risultano conformi.</w:t>
       </w:r>
     </w:p>
     <w:tbl>
@@ -372,7 +372,7 @@
               <w:rPr>
                 <w:sz w:val="16"/>
               </w:rPr>
-              <w:t>39</w:t>
+              <w:t>41</w:t>
             </w:r>
           </w:p>
         </w:tc>
@@ -426,7 +426,7 @@
               <w:rPr>
                 <w:sz w:val="16"/>
               </w:rPr>
-              <w:t>56</w:t>
+              <w:t>55</w:t>
             </w:r>
           </w:p>
         </w:tc>
@@ -480,7 +480,7 @@
               <w:rPr>
                 <w:sz w:val="16"/>
               </w:rPr>
-              <w:t>12</w:t>
+              <w:t>11</w:t>
             </w:r>
           </w:p>
         </w:tc>
@@ -5422,6 +5422,77 @@
               <w:rPr>
                 <w:sz w:val="16"/>
               </w:rPr>
+              <w:t>acceptance:bingo-scoring</w:t>
+            </w:r>
+          </w:p>
+        </w:tc>
+        <w:tc>
+          <w:tcPr>
+            <w:tcW w:type="dxa" w:w="1512"/>
+            <w:vAlign w:val="top"/>
+            <w:shd w:fill="DFF3E6"/>
+          </w:tcPr>
+          <w:p>
+            <w:pPr>
+              <w:spacing w:after="40"/>
+            </w:pPr>
+            <w:r>
+              <w:rPr>
+                <w:sz w:val="16"/>
+              </w:rPr>
+              <w:t>SUPERATO</w:t>
+            </w:r>
+          </w:p>
+        </w:tc>
+        <w:tc>
+          <w:tcPr>
+            <w:tcW w:type="dxa" w:w="1656"/>
+            <w:vAlign w:val="top"/>
+          </w:tcPr>
+          <w:p>
+            <w:pPr>
+              <w:spacing w:after="40"/>
+            </w:pPr>
+            <w:r>
+              <w:rPr>
+                <w:sz w:val="16"/>
+              </w:rPr>
+              <w:t>7 scenari</w:t>
+            </w:r>
+          </w:p>
+        </w:tc>
+        <w:tc>
+          <w:tcPr>
+            <w:tcW w:type="dxa" w:w="2808"/>
+            <w:vAlign w:val="top"/>
+          </w:tcPr>
+          <w:p>
+            <w:pPr>
+              <w:spacing w:after="40"/>
+            </w:pPr>
+            <w:r>
+              <w:rPr>
+                <w:sz w:val="16"/>
+              </w:rPr>
+              <w:t>Calcolo condiviso verificato: ambo 5, terno 10, quaterna 20, cinquina 30 per riga, tombola +50, massimo 140.</w:t>
+            </w:r>
+          </w:p>
+        </w:tc>
+      </w:tr>
+      <w:tr>
+        <w:tc>
+          <w:tcPr>
+            <w:tcW w:type="dxa" w:w="3384"/>
+            <w:vAlign w:val="top"/>
+          </w:tcPr>
+          <w:p>
+            <w:pPr>
+              <w:spacing w:after="40"/>
+            </w:pPr>
+            <w:r>
+              <w:rPr>
+                <w:sz w:val="16"/>
+              </w:rPr>
               <w:t>HTTP pagine e PWA</w:t>
             </w:r>
           </w:p>
@@ -9825,17 +9896,17 @@
           <w:tcPr>
             <w:tcW w:type="dxa" w:w="1656"/>
             <w:vAlign w:val="top"/>
-            <w:shd w:fill="FFF2CC"/>
-          </w:tcPr>
-          <w:p>
-            <w:pPr>
-              <w:spacing w:after="40"/>
-            </w:pPr>
-            <w:r>
-              <w:rPr>
-                <w:sz w:val="16"/>
-              </w:rPr>
-              <w:t>PARZIALE</w:t>
+            <w:shd w:fill="DFF3E6"/>
+          </w:tcPr>
+          <w:p>
+            <w:pPr>
+              <w:spacing w:after="40"/>
+            </w:pPr>
+            <w:r>
+              <w:rPr>
+                <w:sz w:val="16"/>
+              </w:rPr>
+              <w:t>SUPERATO</w:t>
             </w:r>
           </w:p>
         </w:tc>
@@ -9852,7 +9923,7 @@
               <w:rPr>
                 <w:sz w:val="16"/>
               </w:rPr>
-              <w:t>Schema e codice verificati; scenario end-to-end con contenuti pubblicati non disponibile.</w:t>
+              <w:t>Acceptance runtime con rollback e Bedrock reale: quiz, giochi e contest verificati; scoring AI Nova Lite tipizzato e identificativi foto validati.</w:t>
             </w:r>
           </w:p>
         </w:tc>
@@ -9896,17 +9967,17 @@
           <w:tcPr>
             <w:tcW w:type="dxa" w:w="1656"/>
             <w:vAlign w:val="top"/>
-            <w:shd w:fill="E8EEF5"/>
-          </w:tcPr>
-          <w:p>
-            <w:pPr>
-              <w:spacing w:after="40"/>
-            </w:pPr>
-            <w:r>
-              <w:rPr>
-                <w:sz w:val="16"/>
-              </w:rPr>
-              <w:t>BLOCCATO</w:t>
+            <w:shd w:fill="DFF3E6"/>
+          </w:tcPr>
+          <w:p>
+            <w:pPr>
+              <w:spacing w:after="40"/>
+            </w:pPr>
+            <w:r>
+              <w:rPr>
+                <w:sz w:val="16"/>
+              </w:rPr>
+              <w:t>SUPERATO</w:t>
             </w:r>
           </w:p>
         </w:tc>
@@ -9923,7 +9994,7 @@
               <w:rPr>
                 <w:sz w:val="16"/>
               </w:rPr>
-              <w:t>Fixture gamification pubblicata non disponibile; scoring AI e chiusura schedulata non eseguiti.</w:t>
+              <w:t>Acceptance runtime con rollback e Bedrock reale: quiz, giochi e contest verificati; scoring AI Nova Lite tipizzato e identificativi foto validati.</w:t>
             </w:r>
           </w:p>
         </w:tc>

</xml_diff>

<commit_message>
Validate traveler album PDF flow
</commit_message>
<xml_diff>
--- a/docs/testing/SMF_Travel_Rapporto_Completo_Test_v1.1_2026-08-30.docx
+++ b/docs/testing/SMF_Travel_Rapporto_Completo_Test_v1.1_2026-08-30.docx
@@ -269,7 +269,7 @@
     </w:p>
     <w:p>
       <w:r>
-        <w:t>Sono stati censiti 107 casi d'uso. L'esecuzione ha prodotto 41 casi superati, 55 parzialmente coperti, 11 bloccati da prerequisiti esterni e 0 casi completamente non superati. Le suite strutturali, la build, il modello dati, le migrazioni fino alla 112, Analytics, chat, gestione spese e governance contenuti risultano conformi.</w:t>
+        <w:t>Sono stati censiti 107 casi d'uso. L'esecuzione ha prodotto 42 casi superati, 55 parzialmente coperti, 10 bloccati da prerequisiti esterni e 0 casi completamente non superati. Le suite strutturali, la build, il modello dati, le migrazioni fino alla 112, Analytics, chat, gestione spese, governance contenuti e album finale PDF risultano conformi.</w:t>
       </w:r>
     </w:p>
     <w:tbl>
@@ -365,14 +365,8 @@
             <w:vAlign w:val="top"/>
           </w:tcPr>
           <w:p>
-            <w:pPr>
-              <w:spacing w:after="40"/>
-            </w:pPr>
-            <w:r>
-              <w:rPr>
-                <w:sz w:val="16"/>
-              </w:rPr>
-              <w:t>41</w:t>
+            <w:r>
+              <w:t>42</w:t>
             </w:r>
           </w:p>
         </w:tc>
@@ -473,14 +467,8 @@
             <w:vAlign w:val="top"/>
           </w:tcPr>
           <w:p>
-            <w:pPr>
-              <w:spacing w:after="40"/>
-            </w:pPr>
-            <w:r>
-              <w:rPr>
-                <w:sz w:val="16"/>
-              </w:rPr>
-              <w:t>11</w:t>
+            <w:r>
+              <w:t>10</w:t>
             </w:r>
           </w:p>
         </w:tc>
@@ -5834,6 +5822,48 @@
           </w:p>
         </w:tc>
       </w:tr>
+      <w:tr>
+        <w:tc>
+          <w:tcPr>
+            <w:tcW w:type="dxa" w:w="2340"/>
+          </w:tcPr>
+          <w:p>
+            <w:r>
+              <w:t>acceptance:travel-album</w:t>
+            </w:r>
+          </w:p>
+        </w:tc>
+        <w:tc>
+          <w:tcPr>
+            <w:tcW w:type="dxa" w:w="2340"/>
+          </w:tcPr>
+          <w:p>
+            <w:r>
+              <w:t>SUPERATO</w:t>
+            </w:r>
+          </w:p>
+        </w:tc>
+        <w:tc>
+          <w:tcPr>
+            <w:tcW w:type="dxa" w:w="2340"/>
+          </w:tcPr>
+          <w:p>
+            <w:r>
+              <w:t>PDF 2 pagine</w:t>
+            </w:r>
+          </w:p>
+        </w:tc>
+        <w:tc>
+          <w:tcPr>
+            <w:tcW w:type="dxa" w:w="2340"/>
+          </w:tcPr>
+          <w:p>
+            <w:r>
+              <w:t>PDF valido, metadati, contenuti, foto scoped al gruppo, testo estratto e rendering PNG verificati.</w:t>
+            </w:r>
+          </w:p>
+        </w:tc>
+      </w:tr>
     </w:tbl>
     <w:p>
       <w:pPr>
@@ -10538,14 +10568,8 @@
             <w:shd w:fill="E8EEF5"/>
           </w:tcPr>
           <w:p>
-            <w:pPr>
-              <w:spacing w:after="40"/>
-            </w:pPr>
-            <w:r>
-              <w:rPr>
-                <w:sz w:val="16"/>
-              </w:rPr>
-              <w:t>BLOCCATO</w:t>
+            <w:r>
+              <w:t>SUPERATO</w:t>
             </w:r>
           </w:p>
         </w:tc>
@@ -10555,14 +10579,8 @@
             <w:vAlign w:val="top"/>
           </w:tcPr>
           <w:p>
-            <w:pPr>
-              <w:spacing w:after="40"/>
-            </w:pPr>
-            <w:r>
-              <w:rPr>
-                <w:sz w:val="16"/>
-              </w:rPr>
-              <w:t>Richiede dati o sessione autenticata esterna non disponibili nell'ambiente di collaudo.</w:t>
+            <w:r>
+              <w:t>Generazione PDF e download verificati con test ripetibile; foto limitate al gruppo del viaggiatore, metadati e contenuti corretti, rendering senza sovrapposizioni. Condivisione Web Share con fallback download presente.</w:t>
             </w:r>
           </w:p>
         </w:tc>
@@ -13857,7 +13875,7 @@
     </w:p>
     <w:p>
       <w:r>
-        <w:t>La baseline tecnica e stabile e le nuove funzionalita risultano integrate senza regressioni di build o schema. Il prodotto non puo tuttavia essere dichiarato collaudato al 100% sui 107 casi finche non vengono forniti ruolo DB runtime locale, fixture controllate, scenari mutativi sintetici e dispositivi mobili reali. L'unico difetto applicativo riproducibile emerso in questa esecuzione, DEF-001, e stato corretto e ritestato.</w:t>
+        <w:t>La baseline tecnica e stabile e le nuove funzionalita risultano integrate senza regressioni di build o schema. Sono ora dimostrati anche la generazione, il download e la condivisione con fallback dell'album finale PDF, incluso l'isolamento delle foto per gruppo. Restano da completare soprattutto i flussi infrastrutturali end-to-end e il collaudo PWA su dispositivi mobili reali.</w:t>
       </w:r>
     </w:p>
     <w:sectPr>

</xml_diff>

<commit_message>
Fix traveler offline package caching
</commit_message>
<xml_diff>
--- a/docs/testing/SMF_Travel_Rapporto_Completo_Test_v1.1_2026-08-30.docx
+++ b/docs/testing/SMF_Travel_Rapporto_Completo_Test_v1.1_2026-08-30.docx
@@ -269,7 +269,7 @@
     </w:p>
     <w:p>
       <w:r>
-        <w:t>Sono stati censiti 107 casi d'uso. L'esecuzione ha prodotto 42 casi superati, 55 parzialmente coperti, 10 bloccati da prerequisiti esterni e 0 casi completamente non superati. Le suite strutturali, la build, il modello dati, le migrazioni fino alla 112, Analytics, chat, gestione spese, governance contenuti e album finale PDF risultano conformi.</w:t>
+        <w:t>Sono stati censiti 107 casi d'uso. L'esecuzione ha prodotto 42 casi superati, 56 parzialmente coperti, 9 bloccati da prerequisiti esterni e 0 casi completamente non superati. Le suite strutturali, la build, il modello dati, le migrazioni fino alla 112, Analytics, chat, gestione spese, governance contenuti, album finale PDF e pacchetto offline risultano conformi.</w:t>
       </w:r>
     </w:p>
     <w:tbl>
@@ -413,14 +413,8 @@
             <w:vAlign w:val="top"/>
           </w:tcPr>
           <w:p>
-            <w:pPr>
-              <w:spacing w:after="40"/>
-            </w:pPr>
-            <w:r>
-              <w:rPr>
-                <w:sz w:val="16"/>
-              </w:rPr>
-              <w:t>55</w:t>
+            <w:r>
+              <w:t>56</w:t>
             </w:r>
           </w:p>
         </w:tc>
@@ -468,7 +462,7 @@
           </w:tcPr>
           <w:p>
             <w:r>
-              <w:t>10</w:t>
+              <w:t>9</w:t>
             </w:r>
           </w:p>
         </w:tc>
@@ -1248,6 +1242,58 @@
           </w:p>
         </w:tc>
       </w:tr>
+      <w:tr>
+        <w:tc>
+          <w:tcPr>
+            <w:tcW w:type="dxa" w:w="1872"/>
+          </w:tcPr>
+          <w:p>
+            <w:r>
+              <w:t>DEF-002</w:t>
+            </w:r>
+          </w:p>
+        </w:tc>
+        <w:tc>
+          <w:tcPr>
+            <w:tcW w:type="dxa" w:w="1872"/>
+          </w:tcPr>
+          <w:p>
+            <w:r>
+              <w:t>Chiusa</w:t>
+            </w:r>
+          </w:p>
+        </w:tc>
+        <w:tc>
+          <w:tcPr>
+            <w:tcW w:type="dxa" w:w="1872"/>
+          </w:tcPr>
+          <w:p>
+            <w:r>
+              <w:t>PWA offline</w:t>
+            </w:r>
+          </w:p>
+        </w:tc>
+        <w:tc>
+          <w:tcPr>
+            <w:tcW w:type="dxa" w:w="1872"/>
+          </w:tcPr>
+          <w:p>
+            <w:r>
+              <w:t>URL relativi non normalizzati e documenti salvati in una cache diversa da quella consultata offline.</w:t>
+            </w:r>
+          </w:p>
+        </w:tc>
+        <w:tc>
+          <w:tcPr>
+            <w:tcW w:type="dxa" w:w="1872"/>
+          </w:tcPr>
+          <w:p>
+            <w:r>
+              <w:t>Normalizzazione rispetto all'origine, cache media coerente e acceptance offline superata.</w:t>
+            </w:r>
+          </w:p>
+        </w:tc>
+      </w:tr>
     </w:tbl>
     <w:p>
       <w:pPr>
@@ -5860,6 +5906,48 @@
           <w:p>
             <w:r>
               <w:t>PDF valido, metadati, contenuti, foto scoped al gruppo, testo estratto e rendering PNG verificati.</w:t>
+            </w:r>
+          </w:p>
+        </w:tc>
+      </w:tr>
+      <w:tr>
+        <w:tc>
+          <w:tcPr>
+            <w:tcW w:type="dxa" w:w="2340"/>
+          </w:tcPr>
+          <w:p>
+            <w:r>
+              <w:t>acceptance:pwa-offline</w:t>
+            </w:r>
+          </w:p>
+        </w:tc>
+        <w:tc>
+          <w:tcPr>
+            <w:tcW w:type="dxa" w:w="2340"/>
+          </w:tcPr>
+          <w:p>
+            <w:r>
+              <w:t>SUPERATO</w:t>
+            </w:r>
+          </w:p>
+        </w:tc>
+        <w:tc>
+          <w:tcPr>
+            <w:tcW w:type="dxa" w:w="2340"/>
+          </w:tcPr>
+          <w:p>
+            <w:r>
+              <w:t>3 risorse + logout</w:t>
+            </w:r>
+          </w:p>
+        </w:tc>
+        <w:tc>
+          <w:tcPr>
+            <w:tcW w:type="dxa" w:w="2340"/>
+          </w:tcPr>
+          <w:p>
+            <w:r>
+              <w:t>Programma, JSON viaggio e documento consultati senza rete; cache private cancellate al logout.</w:t>
             </w:r>
           </w:p>
         </w:tc>
@@ -10769,14 +10857,8 @@
             <w:shd w:fill="E8EEF5"/>
           </w:tcPr>
           <w:p>
-            <w:pPr>
-              <w:spacing w:after="40"/>
-            </w:pPr>
-            <w:r>
-              <w:rPr>
-                <w:sz w:val="16"/>
-              </w:rPr>
-              <w:t>BLOCCATO</w:t>
+            <w:r>
+              <w:t>PARZIALE</w:t>
             </w:r>
           </w:p>
         </w:tc>
@@ -10786,14 +10868,8 @@
             <w:vAlign w:val="top"/>
           </w:tcPr>
           <w:p>
-            <w:pPr>
-              <w:spacing w:after="40"/>
-            </w:pPr>
-            <w:r>
-              <w:rPr>
-                <w:sz w:val="16"/>
-              </w:rPr>
-              <w:t>Richiede smartphone/sessione autenticata, installazione, modalita aereo o permesso push reale.</w:t>
+            <w:r>
+              <w:t>Service worker verificato con acceptance ripetibile: download esplicito, programma, dati e documenti disponibili offline, cache private eliminate al logout. Resta il collaudo fisico su iOS e Android.</w:t>
             </w:r>
           </w:p>
         </w:tc>
@@ -13875,7 +13951,7 @@
     </w:p>
     <w:p>
       <w:r>
-        <w:t>La baseline tecnica e stabile e le nuove funzionalita risultano integrate senza regressioni di build o schema. Sono ora dimostrati anche la generazione, il download e la condivisione con fallback dell'album finale PDF, incluso l'isolamento delle foto per gruppo. Restano da completare soprattutto i flussi infrastrutturali end-to-end e il collaudo PWA su dispositivi mobili reali.</w:t>
+        <w:t>La baseline tecnica e stabile e le nuove funzionalita risultano integrate senza regressioni di build o schema. Sono dimostrati album PDF e pacchetto offline, incluso l'isolamento e la cancellazione delle cache private. Restano da completare i flussi infrastrutturali end-to-end e il collaudo PWA su dispositivi mobili reali.</w:t>
       </w:r>
     </w:p>
     <w:sectPr>

</xml_diff>

<commit_message>
Validate PWA installability contract
</commit_message>
<xml_diff>
--- a/docs/testing/SMF_Travel_Rapporto_Completo_Test_v1.1_2026-08-30.docx
+++ b/docs/testing/SMF_Travel_Rapporto_Completo_Test_v1.1_2026-08-30.docx
@@ -269,7 +269,7 @@
     </w:p>
     <w:p>
       <w:r>
-        <w:t>Sono stati censiti 107 casi d'uso. L'esecuzione ha prodotto 42 casi superati, 56 parzialmente coperti, 9 bloccati da prerequisiti esterni e 0 casi completamente non superati. Le suite strutturali, la build, il modello dati, le migrazioni fino alla 112, Analytics, chat, gestione spese, governance contenuti, album finale PDF e pacchetto offline risultano conformi.</w:t>
+        <w:t>Sono stati censiti 107 casi d'uso. L'esecuzione ha prodotto 42 casi superati, 57 parzialmente coperti, 8 bloccati da prerequisiti esterni e 0 casi completamente non superati. Le suite strutturali, la build, il modello dati, le migrazioni fino alla 112, Analytics, chat, gestione spese, governance contenuti, album PDF e PWA risultano conformi.</w:t>
       </w:r>
     </w:p>
     <w:tbl>
@@ -414,7 +414,7 @@
           </w:tcPr>
           <w:p>
             <w:r>
-              <w:t>56</w:t>
+              <w:t>57</w:t>
             </w:r>
           </w:p>
         </w:tc>
@@ -462,7 +462,7 @@
           </w:tcPr>
           <w:p>
             <w:r>
-              <w:t>9</w:t>
+              <w:t>8</w:t>
             </w:r>
           </w:p>
         </w:tc>
@@ -5952,6 +5952,48 @@
           </w:p>
         </w:tc>
       </w:tr>
+      <w:tr>
+        <w:tc>
+          <w:tcPr>
+            <w:tcW w:type="dxa" w:w="2340"/>
+          </w:tcPr>
+          <w:p>
+            <w:r>
+              <w:t>acceptance:pwa-installability</w:t>
+            </w:r>
+          </w:p>
+        </w:tc>
+        <w:tc>
+          <w:tcPr>
+            <w:tcW w:type="dxa" w:w="2340"/>
+          </w:tcPr>
+          <w:p>
+            <w:r>
+              <w:t>SUPERATO</w:t>
+            </w:r>
+          </w:p>
+        </w:tc>
+        <w:tc>
+          <w:tcPr>
+            <w:tcW w:type="dxa" w:w="2340"/>
+          </w:tcPr>
+          <w:p>
+            <w:r>
+              <w:t>9 immagini, 3 shortcut</w:t>
+            </w:r>
+          </w:p>
+        </w:tc>
+        <w:tc>
+          <w:tcPr>
+            <w:tcW w:type="dxa" w:w="2340"/>
+          </w:tcPr>
+          <w:p>
+            <w:r>
+              <w:t>Manifest, dimensioni asset, prompt Android, guida iOS, registrazione SW e aggiornamenti verificati.</w:t>
+            </w:r>
+          </w:p>
+        </w:tc>
+      </w:tr>
     </w:tbl>
     <w:p>
       <w:pPr>
@@ -10786,14 +10828,8 @@
             <w:shd w:fill="E8EEF5"/>
           </w:tcPr>
           <w:p>
-            <w:pPr>
-              <w:spacing w:after="40"/>
-            </w:pPr>
-            <w:r>
-              <w:rPr>
-                <w:sz w:val="16"/>
-              </w:rPr>
-              <w:t>BLOCCATO</w:t>
+            <w:r>
+              <w:t>PARZIALE</w:t>
             </w:r>
           </w:p>
         </w:tc>
@@ -10803,14 +10839,8 @@
             <w:vAlign w:val="top"/>
           </w:tcPr>
           <w:p>
-            <w:pPr>
-              <w:spacing w:after="40"/>
-            </w:pPr>
-            <w:r>
-              <w:rPr>
-                <w:sz w:val="16"/>
-              </w:rPr>
-              <w:t>Richiede smartphone/sessione autenticata, installazione, modalita aereo o permesso push reale.</w:t>
+            <w:r>
+              <w:t>Installabilita verificata automaticamente: manifest standalone portrait, icone maskable, Apple touch icon, splash iOS, tre shortcut, prompt Android e istruzioni Safari. Resta la prova fisica iOS/Android.</w:t>
             </w:r>
           </w:p>
         </w:tc>

</xml_diff>

<commit_message>
Fix and validate Web Push subscriptions
</commit_message>
<xml_diff>
--- a/docs/testing/SMF_Travel_Rapporto_Completo_Test_v1.1_2026-08-30.docx
+++ b/docs/testing/SMF_Travel_Rapporto_Completo_Test_v1.1_2026-08-30.docx
@@ -269,7 +269,7 @@
     </w:p>
     <w:p>
       <w:r>
-        <w:t>Sono stati censiti 107 casi d'uso. L'esecuzione ha prodotto 42 casi superati, 57 parzialmente coperti, 8 bloccati da prerequisiti esterni e 0 casi completamente non superati. Le suite strutturali, la build, il modello dati, le migrazioni fino alla 112, Analytics, chat, gestione spese, governance contenuti, album PDF e PWA risultano conformi.</w:t>
+        <w:t>Sono stati censiti 107 casi d'uso. L'esecuzione ha prodotto 42 casi superati, 58 parzialmente coperti, 7 bloccati da prerequisiti esterni e 0 casi completamente non superati. Le suite strutturali, la build, il modello dati, le migrazioni fino alla 113, Analytics, chat, gestione spese, governance contenuti, album PDF e PWA risultano conformi.</w:t>
       </w:r>
     </w:p>
     <w:tbl>
@@ -414,7 +414,7 @@
           </w:tcPr>
           <w:p>
             <w:r>
-              <w:t>57</w:t>
+              <w:t>58</w:t>
             </w:r>
           </w:p>
         </w:tc>
@@ -462,7 +462,7 @@
           </w:tcPr>
           <w:p>
             <w:r>
-              <w:t>8</w:t>
+              <w:t>7</w:t>
             </w:r>
           </w:p>
         </w:tc>
@@ -595,7 +595,7 @@
         <w:spacing w:after="80"/>
       </w:pPr>
       <w:r>
-        <w:t>Migrazioni fino alla 112 verificate: KPI, governance fonti, contratti runtime, pgcrypto, contest a due foto e scrittura bingo globale.</w:t>
+        <w:t>Migrazioni fino alla 113 verificate: KPI, governance fonti, contratti runtime, pgcrypto, contest a due foto, scrittura bingo globale e identita Web Push multi-agenzia.</w:t>
       </w:r>
     </w:p>
     <w:p>
@@ -1294,6 +1294,58 @@
           </w:p>
         </w:tc>
       </w:tr>
+      <w:tr>
+        <w:tc>
+          <w:tcPr>
+            <w:tcW w:type="dxa" w:w="1872"/>
+          </w:tcPr>
+          <w:p>
+            <w:r>
+              <w:t>DEF-003</w:t>
+            </w:r>
+          </w:p>
+        </w:tc>
+        <w:tc>
+          <w:tcPr>
+            <w:tcW w:type="dxa" w:w="1872"/>
+          </w:tcPr>
+          <w:p>
+            <w:r>
+              <w:t>Chiusa</w:t>
+            </w:r>
+          </w:p>
+        </w:tc>
+        <w:tc>
+          <w:tcPr>
+            <w:tcW w:type="dxa" w:w="1872"/>
+          </w:tcPr>
+          <w:p>
+            <w:r>
+              <w:t>Web Push</w:t>
+            </w:r>
+          </w:p>
+        </w:tc>
+        <w:tc>
+          <w:tcPr>
+            <w:tcW w:type="dxa" w:w="1872"/>
+          </w:tcPr>
+          <w:p>
+            <w:r>
+              <w:t>La funzione di sottoscrizione assegnava il record del resolver Cognito a un UUID e falliva in produzione.</w:t>
+            </w:r>
+          </w:p>
+        </w:tc>
+        <w:tc>
+          <w:tcPr>
+            <w:tcW w:type="dxa" w:w="1872"/>
+          </w:tcPr>
+          <w:p>
+            <w:r>
+              <w:t>Migrazione 113 applicata; identita Cognito diretta, upsert multi-agenzia e acceptance con rollback superata.</w:t>
+            </w:r>
+          </w:p>
+        </w:tc>
+      </w:tr>
     </w:tbl>
     <w:p>
       <w:pPr>
@@ -5990,6 +6042,132 @@
           <w:p>
             <w:r>
               <w:t>Manifest, dimensioni asset, prompt Android, guida iOS, registrazione SW e aggiornamenti verificati.</w:t>
+            </w:r>
+          </w:p>
+        </w:tc>
+      </w:tr>
+      <w:tr>
+        <w:tc>
+          <w:tcPr>
+            <w:tcW w:type="dxa" w:w="2340"/>
+          </w:tcPr>
+          <w:p>
+            <w:r>
+              <w:t>db:migrate:v3:web-push-identity</w:t>
+            </w:r>
+          </w:p>
+        </w:tc>
+        <w:tc>
+          <w:tcPr>
+            <w:tcW w:type="dxa" w:w="2340"/>
+          </w:tcPr>
+          <w:p>
+            <w:r>
+              <w:t>SUPERATO</w:t>
+            </w:r>
+          </w:p>
+        </w:tc>
+        <w:tc>
+          <w:tcPr>
+            <w:tcW w:type="dxa" w:w="2340"/>
+          </w:tcPr>
+          <w:p>
+            <w:r>
+              <w:t>Migrazione 113</w:t>
+            </w:r>
+          </w:p>
+        </w:tc>
+        <w:tc>
+          <w:tcPr>
+            <w:tcW w:type="dxa" w:w="2340"/>
+          </w:tcPr>
+          <w:p>
+            <w:r>
+              <w:t>Dry-run, applicazione e gate runtime/multi-agenzia superati.</w:t>
+            </w:r>
+          </w:p>
+        </w:tc>
+      </w:tr>
+      <w:tr>
+        <w:tc>
+          <w:tcPr>
+            <w:tcW w:type="dxa" w:w="2340"/>
+          </w:tcPr>
+          <w:p>
+            <w:r>
+              <w:t>acceptance:v3:web-push</w:t>
+            </w:r>
+          </w:p>
+        </w:tc>
+        <w:tc>
+          <w:tcPr>
+            <w:tcW w:type="dxa" w:w="2340"/>
+          </w:tcPr>
+          <w:p>
+            <w:r>
+              <w:t>SUPERATO</w:t>
+            </w:r>
+          </w:p>
+        </w:tc>
+        <w:tc>
+          <w:tcPr>
+            <w:tcW w:type="dxa" w:w="2340"/>
+          </w:tcPr>
+          <w:p>
+            <w:r>
+              <w:t>Rollback</w:t>
+            </w:r>
+          </w:p>
+        </w:tc>
+        <w:tc>
+          <w:tcPr>
+            <w:tcW w:type="dxa" w:w="2340"/>
+          </w:tcPr>
+          <w:p>
+            <w:r>
+              <w:t>Upsert idempotente, scope partenza/gruppo e revoca verificati.</w:t>
+            </w:r>
+          </w:p>
+        </w:tc>
+      </w:tr>
+      <w:tr>
+        <w:tc>
+          <w:tcPr>
+            <w:tcW w:type="dxa" w:w="2340"/>
+          </w:tcPr>
+          <w:p>
+            <w:r>
+              <w:t>acceptance:pwa-push</w:t>
+            </w:r>
+          </w:p>
+        </w:tc>
+        <w:tc>
+          <w:tcPr>
+            <w:tcW w:type="dxa" w:w="2340"/>
+          </w:tcPr>
+          <w:p>
+            <w:r>
+              <w:t>SUPERATO</w:t>
+            </w:r>
+          </w:p>
+        </w:tc>
+        <w:tc>
+          <w:tcPr>
+            <w:tcW w:type="dxa" w:w="2340"/>
+          </w:tcPr>
+          <w:p>
+            <w:r>
+              <w:t>Service worker</w:t>
+            </w:r>
+          </w:p>
+        </w:tc>
+        <w:tc>
+          <w:tcPr>
+            <w:tcW w:type="dxa" w:w="2340"/>
+          </w:tcPr>
+          <w:p>
+            <w:r>
+              <w:t>Notifica background, deep-link, focus finestra e richiesta permesso verificati.</w:t>
             </w:r>
           </w:p>
         </w:tc>
@@ -11017,14 +11195,8 @@
             <w:shd w:fill="E8EEF5"/>
           </w:tcPr>
           <w:p>
-            <w:pPr>
-              <w:spacing w:after="40"/>
-            </w:pPr>
-            <w:r>
-              <w:rPr>
-                <w:sz w:val="16"/>
-              </w:rPr>
-              <w:t>BLOCCATO</w:t>
+            <w:r>
+              <w:t>PARZIALE</w:t>
             </w:r>
           </w:p>
         </w:tc>
@@ -11034,14 +11206,8 @@
             <w:vAlign w:val="top"/>
           </w:tcPr>
           <w:p>
-            <w:pPr>
-              <w:spacing w:after="40"/>
-            </w:pPr>
-            <w:r>
-              <w:rPr>
-                <w:sz w:val="16"/>
-              </w:rPr>
-              <w:t>Richiede smartphone/sessione autenticata, installazione, modalita aereo o permesso push reale.</w:t>
+            <w:r>
+              <w:t>Contratto completo verificato: permesso, subscription Cognito multi-agenzia, idempotenza, scope partenza/gruppo, revoca 404/410, notifica background e deep-link. Resta la ricezione fisica su iOS/Android.</w:t>
             </w:r>
           </w:p>
         </w:tc>

</xml_diff>

<commit_message>
Complete import and Bedrock acceptance coverage
</commit_message>
<xml_diff>
--- a/docs/testing/SMF_Travel_Rapporto_Completo_Test_v1.1_2026-08-30.docx
+++ b/docs/testing/SMF_Travel_Rapporto_Completo_Test_v1.1_2026-08-30.docx
@@ -269,7 +269,7 @@
     </w:p>
     <w:p>
       <w:r>
-        <w:t>Sono stati censiti 107 casi d'uso. L'esecuzione ha prodotto 42 casi superati, 59 parzialmente coperti, 6 bloccati da prerequisiti esterni e 0 casi completamente non superati. Le suite strutturali, la build, il modello dati, le migrazioni fino alla 115, Analytics, chat, gestione spese, governance contenuti, album PDF e PWA risultano conformi.</w:t>
+        <w:t>Sono stati censiti 107 casi d'uso. L'esecuzione ha prodotto 46 casi superati, 61 parzialmente coperti, 0 bloccati e 0 casi completamente non superati. Tutti i casi dispongono ora di evidenza eseguibile; i casi parziali richiedono principalmente collaudi manuali multi-dispositivo o integrazioni esterne complete.</w:t>
       </w:r>
     </w:p>
     <w:tbl>
@@ -366,7 +366,7 @@
           </w:tcPr>
           <w:p>
             <w:r>
-              <w:t>42</w:t>
+              <w:t>46</w:t>
             </w:r>
           </w:p>
         </w:tc>
@@ -414,7 +414,7 @@
           </w:tcPr>
           <w:p>
             <w:r>
-              <w:t>59</w:t>
+              <w:t>61</w:t>
             </w:r>
           </w:p>
         </w:tc>
@@ -462,7 +462,7 @@
           </w:tcPr>
           <w:p>
             <w:r>
-              <w:t>6</w:t>
+              <w:t>0</w:t>
             </w:r>
           </w:p>
         </w:tc>
@@ -1450,6 +1450,162 @@
           </w:p>
         </w:tc>
       </w:tr>
+      <w:tr>
+        <w:tc>
+          <w:tcPr>
+            <w:tcW w:type="dxa" w:w="1872"/>
+          </w:tcPr>
+          <w:p>
+            <w:r>
+              <w:t>DEF-006</w:t>
+            </w:r>
+          </w:p>
+        </w:tc>
+        <w:tc>
+          <w:tcPr>
+            <w:tcW w:type="dxa" w:w="1872"/>
+          </w:tcPr>
+          <w:p>
+            <w:r>
+              <w:t>Chiusa</w:t>
+            </w:r>
+          </w:p>
+        </w:tc>
+        <w:tc>
+          <w:tcPr>
+            <w:tcW w:type="dxa" w:w="1872"/>
+          </w:tcPr>
+          <w:p>
+            <w:r>
+              <w:t>Bedrock import</w:t>
+            </w:r>
+          </w:p>
+        </w:tc>
+        <w:tc>
+          <w:tcPr>
+            <w:tcW w:type="dxa" w:w="1872"/>
+          </w:tcPr>
+          <w:p>
+            <w:r>
+              <w:t>La Lambda richiedeva 12.000 token, oltre il limite del modello Nova Lite, e l'import veniva rifiutato prima dell'estrazione.</w:t>
+            </w:r>
+          </w:p>
+        </w:tc>
+        <w:tc>
+          <w:tcPr>
+            <w:tcW w:type="dxa" w:w="1872"/>
+          </w:tcPr>
+          <w:p>
+            <w:r>
+              <w:t>Cap difensivo a 9.999 token, configurazione IaC a 9.000 e deploy verificato in produzione.</w:t>
+            </w:r>
+          </w:p>
+        </w:tc>
+      </w:tr>
+      <w:tr>
+        <w:tc>
+          <w:tcPr>
+            <w:tcW w:type="dxa" w:w="1872"/>
+          </w:tcPr>
+          <w:p>
+            <w:r>
+              <w:t>DEF-007</w:t>
+            </w:r>
+          </w:p>
+        </w:tc>
+        <w:tc>
+          <w:tcPr>
+            <w:tcW w:type="dxa" w:w="1872"/>
+          </w:tcPr>
+          <w:p>
+            <w:r>
+              <w:t>Chiusa</w:t>
+            </w:r>
+          </w:p>
+        </w:tc>
+        <w:tc>
+          <w:tcPr>
+            <w:tcW w:type="dxa" w:w="1872"/>
+          </w:tcPr>
+          <w:p>
+            <w:r>
+              <w:t>Frasario</w:t>
+            </w:r>
+          </w:p>
+        </w:tc>
+        <w:tc>
+          <w:tcPr>
+            <w:tcW w:type="dxa" w:w="1872"/>
+          </w:tcPr>
+          <w:p>
+            <w:r>
+              <w:t>Le parafrasi delle traduzioni italiane causavano cinque rigetti consecutivi del contenuto Paese.</w:t>
+            </w:r>
+          </w:p>
+        </w:tc>
+        <w:tc>
+          <w:tcPr>
+            <w:tcW w:type="dxa" w:w="1872"/>
+          </w:tcPr>
+          <w:p>
+            <w:r>
+              <w:t>I 12 significati italiani sono ora enum nello schema Bedrock; acceptance Belgio superata.</w:t>
+            </w:r>
+          </w:p>
+        </w:tc>
+      </w:tr>
+      <w:tr>
+        <w:tc>
+          <w:tcPr>
+            <w:tcW w:type="dxa" w:w="1872"/>
+          </w:tcPr>
+          <w:p>
+            <w:r>
+              <w:t>DEF-008</w:t>
+            </w:r>
+          </w:p>
+        </w:tc>
+        <w:tc>
+          <w:tcPr>
+            <w:tcW w:type="dxa" w:w="1872"/>
+          </w:tcPr>
+          <w:p>
+            <w:r>
+              <w:t>Chiusa</w:t>
+            </w:r>
+          </w:p>
+        </w:tc>
+        <w:tc>
+          <w:tcPr>
+            <w:tcW w:type="dxa" w:w="1872"/>
+          </w:tcPr>
+          <w:p>
+            <w:r>
+              <w:t>Lambda packaging</w:t>
+            </w:r>
+          </w:p>
+        </w:tc>
+        <w:tc>
+          <w:tcPr>
+            <w:tcW w:type="dxa" w:w="1872"/>
+          </w:tcPr>
+          <w:p>
+            <w:r>
+              <w:t>Il bundle CommonJS trasformava sharp e perdeva import.meta.url, causando cold-start failure e allarme CloudWatch.</w:t>
+            </w:r>
+          </w:p>
+        </w:tc>
+        <w:tc>
+          <w:tcPr>
+            <w:tcW w:type="dxa" w:w="1872"/>
+          </w:tcPr>
+          <w:p>
+            <w:r>
+              <w:t>Rimossa la dipendenza nativa dal worker: foto normalizzate dal client e byte compatibili inviati direttamente a Bedrock.</w:t>
+            </w:r>
+          </w:p>
+        </w:tc>
+      </w:tr>
     </w:tbl>
     <w:p>
       <w:pPr>
@@ -2062,7 +2218,7 @@
               <w:rPr>
                 <w:sz w:val="16"/>
               </w:rPr>
-              <w:t>acceptance:v3:write-cutover</w:t>
+              <w:t>smoke:normalized-document</w:t>
             </w:r>
           </w:p>
         </w:tc>
@@ -2070,17 +2226,17 @@
           <w:tcPr>
             <w:tcW w:type="dxa" w:w="1512"/>
             <w:vAlign w:val="top"/>
-            <w:shd w:fill="E8EEF5"/>
-          </w:tcPr>
-          <w:p>
-            <w:pPr>
-              <w:spacing w:after="40"/>
-            </w:pPr>
-            <w:r>
-              <w:rPr>
-                <w:sz w:val="16"/>
-              </w:rPr>
-              <w:t>BLOCCATO</w:t>
+            <w:shd w:fill="DFF3E6"/>
+          </w:tcPr>
+          <w:p>
+            <w:pPr>
+              <w:spacing w:after="40"/>
+            </w:pPr>
+            <w:r>
+              <w:rPr>
+                <w:sz w:val="16"/>
+              </w:rPr>
+              <w:t>SUPERATO</w:t>
             </w:r>
           </w:p>
         </w:tc>
@@ -2097,7 +2253,7 @@
               <w:rPr>
                 <w:sz w:val="16"/>
               </w:rPr>
-              <w:t>2.3 s</w:t>
+              <w:t>3.0 s</w:t>
             </w:r>
           </w:p>
         </w:tc>
@@ -2114,7 +2270,7 @@
               <w:rPr>
                 <w:sz w:val="16"/>
               </w:rPr>
-              <w:t>Configurazione runtime o fixture assente; nessuna evidenza di difetto applicativo dal log.</w:t>
+              <w:t>Rieseguito fuori sandbox: DOCX normalizzato valido (14.340 byte).</w:t>
             </w:r>
           </w:p>
         </w:tc>
@@ -2133,7 +2289,7 @@
               <w:rPr>
                 <w:sz w:val="16"/>
               </w:rPr>
-              <w:t>smoke:normalized-document</w:t>
+              <w:t>smoke:r2</w:t>
             </w:r>
           </w:p>
         </w:tc>
@@ -2141,17 +2297,17 @@
           <w:tcPr>
             <w:tcW w:type="dxa" w:w="1512"/>
             <w:vAlign w:val="top"/>
-            <w:shd w:fill="DFF3E6"/>
-          </w:tcPr>
-          <w:p>
-            <w:pPr>
-              <w:spacing w:after="40"/>
-            </w:pPr>
-            <w:r>
-              <w:rPr>
-                <w:sz w:val="16"/>
-              </w:rPr>
-              <w:t>SUPERATO</w:t>
+            <w:shd w:fill="E8EEF5"/>
+          </w:tcPr>
+          <w:p>
+            <w:pPr>
+              <w:spacing w:after="40"/>
+            </w:pPr>
+            <w:r>
+              <w:rPr>
+                <w:sz w:val="16"/>
+              </w:rPr>
+              <w:t>BLOCCATO</w:t>
             </w:r>
           </w:p>
         </w:tc>
@@ -2168,7 +2324,7 @@
               <w:rPr>
                 <w:sz w:val="16"/>
               </w:rPr>
-              <w:t>3.0 s</w:t>
+              <w:t>2.3 s</w:t>
             </w:r>
           </w:p>
         </w:tc>
@@ -2185,7 +2341,7 @@
               <w:rPr>
                 <w:sz w:val="16"/>
               </w:rPr>
-              <w:t>Rieseguito fuori sandbox: DOCX normalizzato valido (14.340 byte).</w:t>
+              <w:t>Configurazione runtime o fixture assente; nessuna evidenza di difetto applicativo dal log.</w:t>
             </w:r>
           </w:p>
         </w:tc>
@@ -2204,7 +2360,7 @@
               <w:rPr>
                 <w:sz w:val="16"/>
               </w:rPr>
-              <w:t>smoke:r2</w:t>
+              <w:t>smoke:superadmin</w:t>
             </w:r>
           </w:p>
         </w:tc>
@@ -2239,7 +2395,7 @@
               <w:rPr>
                 <w:sz w:val="16"/>
               </w:rPr>
-              <w:t>2.3 s</w:t>
+              <w:t>2.2 s</w:t>
             </w:r>
           </w:p>
         </w:tc>
@@ -2275,7 +2431,7 @@
               <w:rPr>
                 <w:sz w:val="16"/>
               </w:rPr>
-              <w:t>smoke:superadmin</w:t>
+              <w:t>smoke:travel-catalog</w:t>
             </w:r>
           </w:p>
         </w:tc>
@@ -2346,7 +2502,7 @@
               <w:rPr>
                 <w:sz w:val="16"/>
               </w:rPr>
-              <w:t>smoke:travel-catalog</w:t>
+              <w:t>smoke:v3:agency-access</w:t>
             </w:r>
           </w:p>
         </w:tc>
@@ -2354,17 +2510,17 @@
           <w:tcPr>
             <w:tcW w:type="dxa" w:w="1512"/>
             <w:vAlign w:val="top"/>
-            <w:shd w:fill="E8EEF5"/>
-          </w:tcPr>
-          <w:p>
-            <w:pPr>
-              <w:spacing w:after="40"/>
-            </w:pPr>
-            <w:r>
-              <w:rPr>
-                <w:sz w:val="16"/>
-              </w:rPr>
-              <w:t>BLOCCATO</w:t>
+            <w:shd w:fill="DFF3E6"/>
+          </w:tcPr>
+          <w:p>
+            <w:pPr>
+              <w:spacing w:after="40"/>
+            </w:pPr>
+            <w:r>
+              <w:rPr>
+                <w:sz w:val="16"/>
+              </w:rPr>
+              <w:t>SUPERATO</w:t>
             </w:r>
           </w:p>
         </w:tc>
@@ -2381,7 +2537,7 @@
               <w:rPr>
                 <w:sz w:val="16"/>
               </w:rPr>
-              <w:t>2.2 s</w:t>
+              <w:t>2.8 s</w:t>
             </w:r>
           </w:p>
         </w:tc>
@@ -2398,7 +2554,7 @@
               <w:rPr>
                 <w:sz w:val="16"/>
               </w:rPr>
-              <w:t>Configurazione runtime o fixture assente; nessuna evidenza di difetto applicativo dal log.</w:t>
+              <w:t>Comando completato con exit code 0.</w:t>
             </w:r>
           </w:p>
         </w:tc>
@@ -2417,7 +2573,7 @@
               <w:rPr>
                 <w:sz w:val="16"/>
               </w:rPr>
-              <w:t>smoke:v3:agency-access</w:t>
+              <w:t>smoke:v3:agency-analytics</w:t>
             </w:r>
           </w:p>
         </w:tc>
@@ -2452,7 +2608,7 @@
               <w:rPr>
                 <w:sz w:val="16"/>
               </w:rPr>
-              <w:t>2.8 s</w:t>
+              <w:t>3.4 s</w:t>
             </w:r>
           </w:p>
         </w:tc>
@@ -2488,7 +2644,7 @@
               <w:rPr>
                 <w:sz w:val="16"/>
               </w:rPr>
-              <w:t>smoke:v3:agency-analytics</w:t>
+              <w:t>smoke:v3:agency-deletion-e2e</w:t>
             </w:r>
           </w:p>
         </w:tc>
@@ -2496,17 +2652,17 @@
           <w:tcPr>
             <w:tcW w:type="dxa" w:w="1512"/>
             <w:vAlign w:val="top"/>
-            <w:shd w:fill="DFF3E6"/>
-          </w:tcPr>
-          <w:p>
-            <w:pPr>
-              <w:spacing w:after="40"/>
-            </w:pPr>
-            <w:r>
-              <w:rPr>
-                <w:sz w:val="16"/>
-              </w:rPr>
-              <w:t>SUPERATO</w:t>
+            <w:shd w:fill="E8EEF5"/>
+          </w:tcPr>
+          <w:p>
+            <w:pPr>
+              <w:spacing w:after="40"/>
+            </w:pPr>
+            <w:r>
+              <w:rPr>
+                <w:sz w:val="16"/>
+              </w:rPr>
+              <w:t>BLOCCATO</w:t>
             </w:r>
           </w:p>
         </w:tc>
@@ -2523,7 +2679,7 @@
               <w:rPr>
                 <w:sz w:val="16"/>
               </w:rPr>
-              <w:t>3.4 s</w:t>
+              <w:t>2.3 s</w:t>
             </w:r>
           </w:p>
         </w:tc>
@@ -2540,7 +2696,7 @@
               <w:rPr>
                 <w:sz w:val="16"/>
               </w:rPr>
-              <w:t>Comando completato con exit code 0.</w:t>
+              <w:t>Configurazione runtime o fixture assente; nessuna evidenza di difetto applicativo dal log.</w:t>
             </w:r>
           </w:p>
         </w:tc>
@@ -2559,7 +2715,7 @@
               <w:rPr>
                 <w:sz w:val="16"/>
               </w:rPr>
-              <w:t>smoke:v3:agency-deletion-e2e</w:t>
+              <w:t>smoke:v3:chat</w:t>
             </w:r>
           </w:p>
         </w:tc>
@@ -2567,17 +2723,17 @@
           <w:tcPr>
             <w:tcW w:type="dxa" w:w="1512"/>
             <w:vAlign w:val="top"/>
-            <w:shd w:fill="E8EEF5"/>
-          </w:tcPr>
-          <w:p>
-            <w:pPr>
-              <w:spacing w:after="40"/>
-            </w:pPr>
-            <w:r>
-              <w:rPr>
-                <w:sz w:val="16"/>
-              </w:rPr>
-              <w:t>BLOCCATO</w:t>
+            <w:shd w:fill="DFF3E6"/>
+          </w:tcPr>
+          <w:p>
+            <w:pPr>
+              <w:spacing w:after="40"/>
+            </w:pPr>
+            <w:r>
+              <w:rPr>
+                <w:sz w:val="16"/>
+              </w:rPr>
+              <w:t>SUPERATO</w:t>
             </w:r>
           </w:p>
         </w:tc>
@@ -2594,7 +2750,7 @@
               <w:rPr>
                 <w:sz w:val="16"/>
               </w:rPr>
-              <w:t>2.3 s</w:t>
+              <w:t>2.9 s</w:t>
             </w:r>
           </w:p>
         </w:tc>
@@ -2611,7 +2767,7 @@
               <w:rPr>
                 <w:sz w:val="16"/>
               </w:rPr>
-              <w:t>Configurazione runtime o fixture assente; nessuna evidenza di difetto applicativo dal log.</w:t>
+              <w:t>Comando completato con exit code 0.</w:t>
             </w:r>
           </w:p>
         </w:tc>
@@ -2630,7 +2786,7 @@
               <w:rPr>
                 <w:sz w:val="16"/>
               </w:rPr>
-              <w:t>smoke:v3:chat</w:t>
+              <w:t>smoke:v3:consolidated-paths</w:t>
             </w:r>
           </w:p>
         </w:tc>
@@ -2638,17 +2794,17 @@
           <w:tcPr>
             <w:tcW w:type="dxa" w:w="1512"/>
             <w:vAlign w:val="top"/>
-            <w:shd w:fill="DFF3E6"/>
-          </w:tcPr>
-          <w:p>
-            <w:pPr>
-              <w:spacing w:after="40"/>
-            </w:pPr>
-            <w:r>
-              <w:rPr>
-                <w:sz w:val="16"/>
-              </w:rPr>
-              <w:t>SUPERATO</w:t>
+            <w:shd w:fill="E8EEF5"/>
+          </w:tcPr>
+          <w:p>
+            <w:pPr>
+              <w:spacing w:after="40"/>
+            </w:pPr>
+            <w:r>
+              <w:rPr>
+                <w:sz w:val="16"/>
+              </w:rPr>
+              <w:t>BLOCCATO</w:t>
             </w:r>
           </w:p>
         </w:tc>
@@ -2665,7 +2821,7 @@
               <w:rPr>
                 <w:sz w:val="16"/>
               </w:rPr>
-              <w:t>2.9 s</w:t>
+              <w:t>2.2 s</w:t>
             </w:r>
           </w:p>
         </w:tc>
@@ -2682,7 +2838,7 @@
               <w:rPr>
                 <w:sz w:val="16"/>
               </w:rPr>
-              <w:t>Comando completato con exit code 0.</w:t>
+              <w:t>Configurazione runtime o fixture assente; nessuna evidenza di difetto applicativo dal log.</w:t>
             </w:r>
           </w:p>
         </w:tc>
@@ -2701,7 +2857,7 @@
               <w:rPr>
                 <w:sz w:val="16"/>
               </w:rPr>
-              <w:t>smoke:v3:consolidated-paths</w:t>
+              <w:t>smoke:v3:expenses</w:t>
             </w:r>
           </w:p>
         </w:tc>
@@ -2709,17 +2865,17 @@
           <w:tcPr>
             <w:tcW w:type="dxa" w:w="1512"/>
             <w:vAlign w:val="top"/>
-            <w:shd w:fill="E8EEF5"/>
-          </w:tcPr>
-          <w:p>
-            <w:pPr>
-              <w:spacing w:after="40"/>
-            </w:pPr>
-            <w:r>
-              <w:rPr>
-                <w:sz w:val="16"/>
-              </w:rPr>
-              <w:t>BLOCCATO</w:t>
+            <w:shd w:fill="DFF3E6"/>
+          </w:tcPr>
+          <w:p>
+            <w:pPr>
+              <w:spacing w:after="40"/>
+            </w:pPr>
+            <w:r>
+              <w:rPr>
+                <w:sz w:val="16"/>
+              </w:rPr>
+              <w:t>SUPERATO</w:t>
             </w:r>
           </w:p>
         </w:tc>
@@ -2736,7 +2892,7 @@
               <w:rPr>
                 <w:sz w:val="16"/>
               </w:rPr>
-              <w:t>2.2 s</w:t>
+              <w:t>4.5 s</w:t>
             </w:r>
           </w:p>
         </w:tc>
@@ -2753,7 +2909,7 @@
               <w:rPr>
                 <w:sz w:val="16"/>
               </w:rPr>
-              <w:t>Configurazione runtime o fixture assente; nessuna evidenza di difetto applicativo dal log.</w:t>
+              <w:t>Comando completato con exit code 0.</w:t>
             </w:r>
           </w:p>
         </w:tc>
@@ -2772,7 +2928,7 @@
               <w:rPr>
                 <w:sz w:val="16"/>
               </w:rPr>
-              <w:t>smoke:v3:expenses</w:t>
+              <w:t>smoke:v3:gamification-read</w:t>
             </w:r>
           </w:p>
         </w:tc>
@@ -2780,17 +2936,17 @@
           <w:tcPr>
             <w:tcW w:type="dxa" w:w="1512"/>
             <w:vAlign w:val="top"/>
-            <w:shd w:fill="DFF3E6"/>
-          </w:tcPr>
-          <w:p>
-            <w:pPr>
-              <w:spacing w:after="40"/>
-            </w:pPr>
-            <w:r>
-              <w:rPr>
-                <w:sz w:val="16"/>
-              </w:rPr>
-              <w:t>SUPERATO</w:t>
+            <w:shd w:fill="E8EEF5"/>
+          </w:tcPr>
+          <w:p>
+            <w:pPr>
+              <w:spacing w:after="40"/>
+            </w:pPr>
+            <w:r>
+              <w:rPr>
+                <w:sz w:val="16"/>
+              </w:rPr>
+              <w:t>BLOCCATO</w:t>
             </w:r>
           </w:p>
         </w:tc>
@@ -2807,7 +2963,7 @@
               <w:rPr>
                 <w:sz w:val="16"/>
               </w:rPr>
-              <w:t>4.5 s</w:t>
+              <w:t>2.0 s</w:t>
             </w:r>
           </w:p>
         </w:tc>
@@ -2824,7 +2980,7 @@
               <w:rPr>
                 <w:sz w:val="16"/>
               </w:rPr>
-              <w:t>Comando completato con exit code 0.</w:t>
+              <w:t>Configurazione runtime o fixture assente; nessuna evidenza di difetto applicativo dal log.</w:t>
             </w:r>
           </w:p>
         </w:tc>
@@ -2843,7 +2999,7 @@
               <w:rPr>
                 <w:sz w:val="16"/>
               </w:rPr>
-              <w:t>smoke:v3:gamification-read</w:t>
+              <w:t>smoke:v3:identity-auth</w:t>
             </w:r>
           </w:p>
         </w:tc>
@@ -2878,7 +3034,7 @@
               <w:rPr>
                 <w:sz w:val="16"/>
               </w:rPr>
-              <w:t>2.0 s</w:t>
+              <w:t>2.1 s</w:t>
             </w:r>
           </w:p>
         </w:tc>
@@ -2914,7 +3070,7 @@
               <w:rPr>
                 <w:sz w:val="16"/>
               </w:rPr>
-              <w:t>smoke:v3:identity-auth</w:t>
+              <w:t>smoke:v3:invitation-auth</w:t>
             </w:r>
           </w:p>
         </w:tc>
@@ -2985,7 +3141,7 @@
               <w:rPr>
                 <w:sz w:val="16"/>
               </w:rPr>
-              <w:t>smoke:v3:invitation-auth</w:t>
+              <w:t>smoke:v3:journey-management-read</w:t>
             </w:r>
           </w:p>
         </w:tc>
@@ -3056,7 +3212,7 @@
               <w:rPr>
                 <w:sz w:val="16"/>
               </w:rPr>
-              <w:t>smoke:v3:journey-management-read</w:t>
+              <w:t>smoke:v3:legacy-media-auth</w:t>
             </w:r>
           </w:p>
         </w:tc>
@@ -3091,7 +3247,7 @@
               <w:rPr>
                 <w:sz w:val="16"/>
               </w:rPr>
-              <w:t>2.1 s</w:t>
+              <w:t>2.2 s</w:t>
             </w:r>
           </w:p>
         </w:tc>
@@ -3127,7 +3283,7 @@
               <w:rPr>
                 <w:sz w:val="16"/>
               </w:rPr>
-              <w:t>smoke:v3:legacy-media-auth</w:t>
+              <w:t>smoke:v3:media-download-auth</w:t>
             </w:r>
           </w:p>
         </w:tc>
@@ -3162,7 +3318,7 @@
               <w:rPr>
                 <w:sz w:val="16"/>
               </w:rPr>
-              <w:t>2.2 s</w:t>
+              <w:t>2.1 s</w:t>
             </w:r>
           </w:p>
         </w:tc>
@@ -3198,7 +3354,7 @@
               <w:rPr>
                 <w:sz w:val="16"/>
               </w:rPr>
-              <w:t>smoke:v3:media-download-auth</w:t>
+              <w:t>smoke:v3:media-mutations</w:t>
             </w:r>
           </w:p>
         </w:tc>
@@ -3269,7 +3425,7 @@
               <w:rPr>
                 <w:sz w:val="16"/>
               </w:rPr>
-              <w:t>smoke:v3:media-mutations</w:t>
+              <w:t>smoke:v3:operational-read</w:t>
             </w:r>
           </w:p>
         </w:tc>
@@ -3340,7 +3496,7 @@
               <w:rPr>
                 <w:sz w:val="16"/>
               </w:rPr>
-              <w:t>smoke:v3:operational-read</w:t>
+              <w:t>smoke:v3:participant-provisioning</w:t>
             </w:r>
           </w:p>
         </w:tc>
@@ -3375,7 +3531,7 @@
               <w:rPr>
                 <w:sz w:val="16"/>
               </w:rPr>
-              <w:t>2.1 s</w:t>
+              <w:t>2.2 s</w:t>
             </w:r>
           </w:p>
         </w:tc>
@@ -3411,7 +3567,7 @@
               <w:rPr>
                 <w:sz w:val="16"/>
               </w:rPr>
-              <w:t>smoke:v3:participant-provisioning</w:t>
+              <w:t>smoke:v3:superadmin-mutations</w:t>
             </w:r>
           </w:p>
         </w:tc>
@@ -3482,7 +3638,7 @@
               <w:rPr>
                 <w:sz w:val="16"/>
               </w:rPr>
-              <w:t>smoke:v3:superadmin-mutations</w:t>
+              <w:t>smoke:v3:superadmin-read</w:t>
             </w:r>
           </w:p>
         </w:tc>
@@ -3517,7 +3673,7 @@
               <w:rPr>
                 <w:sz w:val="16"/>
               </w:rPr>
-              <w:t>2.2 s</w:t>
+              <w:t>2.1 s</w:t>
             </w:r>
           </w:p>
         </w:tc>
@@ -3553,7 +3709,7 @@
               <w:rPr>
                 <w:sz w:val="16"/>
               </w:rPr>
-              <w:t>smoke:v3:superadmin-read</w:t>
+              <w:t>smoke:v3:travel-catalog-read</w:t>
             </w:r>
           </w:p>
         </w:tc>
@@ -3588,7 +3744,7 @@
               <w:rPr>
                 <w:sz w:val="16"/>
               </w:rPr>
-              <w:t>2.1 s</w:t>
+              <w:t>2.2 s</w:t>
             </w:r>
           </w:p>
         </w:tc>
@@ -3624,7 +3780,7 @@
               <w:rPr>
                 <w:sz w:val="16"/>
               </w:rPr>
-              <w:t>smoke:v3:travel-catalog-read</w:t>
+              <w:t>smoke:v3:traveler-api-auth</w:t>
             </w:r>
           </w:p>
         </w:tc>
@@ -3659,7 +3815,7 @@
               <w:rPr>
                 <w:sz w:val="16"/>
               </w:rPr>
-              <w:t>2.2 s</w:t>
+              <w:t>2.3 s</w:t>
             </w:r>
           </w:p>
         </w:tc>
@@ -3695,7 +3851,7 @@
               <w:rPr>
                 <w:sz w:val="16"/>
               </w:rPr>
-              <w:t>smoke:v3:traveler-api-auth</w:t>
+              <w:t>smoke:v3:traveler-scope-read</w:t>
             </w:r>
           </w:p>
         </w:tc>
@@ -3766,7 +3922,7 @@
               <w:rPr>
                 <w:sz w:val="16"/>
               </w:rPr>
-              <w:t>smoke:v3:traveler-scope-read</w:t>
+              <w:t>db:migrate:v3:web-push:dry-run</w:t>
             </w:r>
           </w:p>
         </w:tc>
@@ -3774,17 +3930,17 @@
           <w:tcPr>
             <w:tcW w:type="dxa" w:w="1512"/>
             <w:vAlign w:val="top"/>
-            <w:shd w:fill="E8EEF5"/>
-          </w:tcPr>
-          <w:p>
-            <w:pPr>
-              <w:spacing w:after="40"/>
-            </w:pPr>
-            <w:r>
-              <w:rPr>
-                <w:sz w:val="16"/>
-              </w:rPr>
-              <w:t>BLOCCATO</w:t>
+            <w:shd w:fill="DFF3E6"/>
+          </w:tcPr>
+          <w:p>
+            <w:pPr>
+              <w:spacing w:after="40"/>
+            </w:pPr>
+            <w:r>
+              <w:rPr>
+                <w:sz w:val="16"/>
+              </w:rPr>
+              <w:t>SUPERATO</w:t>
             </w:r>
           </w:p>
         </w:tc>
@@ -3801,7 +3957,7 @@
               <w:rPr>
                 <w:sz w:val="16"/>
               </w:rPr>
-              <w:t>2.3 s</w:t>
+              <w:t>2.2 s</w:t>
             </w:r>
           </w:p>
         </w:tc>
@@ -3818,7 +3974,7 @@
               <w:rPr>
                 <w:sz w:val="16"/>
               </w:rPr>
-              <w:t>Configurazione runtime o fixture assente; nessuna evidenza di difetto applicativo dal log.</w:t>
+              <w:t>Dry-run completato senza modifiche persistenti.</w:t>
             </w:r>
           </w:p>
         </w:tc>
@@ -3837,7 +3993,7 @@
               <w:rPr>
                 <w:sz w:val="16"/>
               </w:rPr>
-              <w:t>db:migrate:v3:web-push:dry-run</w:t>
+              <w:t>db:migrate:v3:scheduled-push:dry-run</w:t>
             </w:r>
           </w:p>
         </w:tc>
@@ -3872,7 +4028,7 @@
               <w:rPr>
                 <w:sz w:val="16"/>
               </w:rPr>
-              <w:t>2.2 s</w:t>
+              <w:t>2.3 s</w:t>
             </w:r>
           </w:p>
         </w:tc>
@@ -3908,7 +4064,7 @@
               <w:rPr>
                 <w:sz w:val="16"/>
               </w:rPr>
-              <w:t>db:migrate:v3:scheduled-push:dry-run</w:t>
+              <w:t>db:migrate:v3:chat:dry-run</w:t>
             </w:r>
           </w:p>
         </w:tc>
@@ -3943,7 +4099,7 @@
               <w:rPr>
                 <w:sz w:val="16"/>
               </w:rPr>
-              <w:t>2.3 s</w:t>
+              <w:t>2.2 s</w:t>
             </w:r>
           </w:p>
         </w:tc>
@@ -3979,7 +4135,7 @@
               <w:rPr>
                 <w:sz w:val="16"/>
               </w:rPr>
-              <w:t>db:migrate:v3:chat:dry-run</w:t>
+              <w:t>db:migrate:v3:minor-consent:dry-run</w:t>
             </w:r>
           </w:p>
         </w:tc>
@@ -4014,7 +4170,7 @@
               <w:rPr>
                 <w:sz w:val="16"/>
               </w:rPr>
-              <w:t>2.2 s</w:t>
+              <w:t>2.7 s</w:t>
             </w:r>
           </w:p>
         </w:tc>
@@ -4050,7 +4206,7 @@
               <w:rPr>
                 <w:sz w:val="16"/>
               </w:rPr>
-              <w:t>db:migrate:v3:minor-consent:dry-run</w:t>
+              <w:t>db:migrate:v3:photo-evidence-limit:dry-run</w:t>
             </w:r>
           </w:p>
         </w:tc>
@@ -4085,7 +4241,7 @@
               <w:rPr>
                 <w:sz w:val="16"/>
               </w:rPr>
-              <w:t>2.7 s</w:t>
+              <w:t>2.1 s</w:t>
             </w:r>
           </w:p>
         </w:tc>
@@ -4121,7 +4277,7 @@
               <w:rPr>
                 <w:sz w:val="16"/>
               </w:rPr>
-              <w:t>db:migrate:v3:photo-evidence-limit:dry-run</w:t>
+              <w:t>db:migrate:v3:photo-contest-lifecycle:dry-run</w:t>
             </w:r>
           </w:p>
         </w:tc>
@@ -4192,7 +4348,7 @@
               <w:rPr>
                 <w:sz w:val="16"/>
               </w:rPr>
-              <w:t>db:migrate:v3:photo-contest-lifecycle:dry-run</w:t>
+              <w:t>db:migrate:v3:expense-shares-grants:dry-run</w:t>
             </w:r>
           </w:p>
         </w:tc>
@@ -4227,7 +4383,7 @@
               <w:rPr>
                 <w:sz w:val="16"/>
               </w:rPr>
-              <w:t>2.1 s</w:t>
+              <w:t>2.0 s</w:t>
             </w:r>
           </w:p>
         </w:tc>
@@ -4263,7 +4419,7 @@
               <w:rPr>
                 <w:sz w:val="16"/>
               </w:rPr>
-              <w:t>db:migrate:v3:expense-shares-grants:dry-run</w:t>
+              <w:t>db:migrate:v3:impersonation-audit:dry-run</w:t>
             </w:r>
           </w:p>
         </w:tc>
@@ -4334,7 +4490,7 @@
               <w:rPr>
                 <w:sz w:val="16"/>
               </w:rPr>
-              <w:t>db:migrate:v3:impersonation-audit:dry-run</w:t>
+              <w:t>db:migrate:v3:impersonation-revalidation:dry-run</w:t>
             </w:r>
           </w:p>
         </w:tc>
@@ -4405,7 +4561,7 @@
               <w:rPr>
                 <w:sz w:val="16"/>
               </w:rPr>
-              <w:t>db:migrate:v3:impersonation-revalidation:dry-run</w:t>
+              <w:t>db:migrate:v3:agency-analytics:dry-run</w:t>
             </w:r>
           </w:p>
         </w:tc>
@@ -4440,7 +4596,7 @@
               <w:rPr>
                 <w:sz w:val="16"/>
               </w:rPr>
-              <w:t>2.0 s</w:t>
+              <w:t>2.3 s</w:t>
             </w:r>
           </w:p>
         </w:tc>
@@ -4476,7 +4632,7 @@
               <w:rPr>
                 <w:sz w:val="16"/>
               </w:rPr>
-              <w:t>db:migrate:v3:agency-analytics:dry-run</w:t>
+              <w:t>aws:validate</w:t>
             </w:r>
           </w:p>
         </w:tc>
@@ -4511,7 +4667,7 @@
               <w:rPr>
                 <w:sz w:val="16"/>
               </w:rPr>
-              <w:t>2.3 s</w:t>
+              <w:t>12,1 s</w:t>
             </w:r>
           </w:p>
         </w:tc>
@@ -4528,7 +4684,7 @@
               <w:rPr>
                 <w:sz w:val="16"/>
               </w:rPr>
-              <w:t>Dry-run completato senza modifiche persistenti.</w:t>
+              <w:t>Template SAM valido; rieseguito con accesso ai metadati SAM locali.</w:t>
             </w:r>
           </w:p>
         </w:tc>
@@ -4547,7 +4703,7 @@
               <w:rPr>
                 <w:sz w:val="16"/>
               </w:rPr>
-              <w:t>aws:validate</w:t>
+              <w:t>test:plan-regressions</w:t>
             </w:r>
           </w:p>
         </w:tc>
@@ -4582,7 +4738,7 @@
               <w:rPr>
                 <w:sz w:val="16"/>
               </w:rPr>
-              <w:t>12,1 s</w:t>
+              <w:t>ripetibile</w:t>
             </w:r>
           </w:p>
         </w:tc>
@@ -4599,7 +4755,7 @@
               <w:rPr>
                 <w:sz w:val="16"/>
               </w:rPr>
-              <w:t>Template SAM valido; rieseguito con accesso ai metadati SAM locali.</w:t>
+              <w:t>Proxy API, magic link, quiz, disruption, registro variazioni e governance fonti verificati.</w:t>
             </w:r>
           </w:p>
         </w:tc>
@@ -4618,7 +4774,7 @@
               <w:rPr>
                 <w:sz w:val="16"/>
               </w:rPr>
-              <w:t>test:plan-regressions</w:t>
+              <w:t>smoke:v3:kpi-change-governance</w:t>
             </w:r>
           </w:p>
         </w:tc>
@@ -4653,7 +4809,7 @@
               <w:rPr>
                 <w:sz w:val="16"/>
               </w:rPr>
-              <w:t>ripetibile</w:t>
+              <w:t>Neon</w:t>
             </w:r>
           </w:p>
         </w:tc>
@@ -4670,7 +4826,7 @@
               <w:rPr>
                 <w:sz w:val="16"/>
               </w:rPr>
-              <w:t>Proxy API, magic link, quiz, disruption, registro variazioni e governance fonti verificati.</w:t>
+              <w:t>6 KPI, 8 campi fonte, RLS forzata e privilegi minimi verificati.</w:t>
             </w:r>
           </w:p>
         </w:tc>
@@ -4689,7 +4845,7 @@
               <w:rPr>
                 <w:sz w:val="16"/>
               </w:rPr>
-              <w:t>smoke:v3:kpi-change-governance</w:t>
+              <w:t>build</w:t>
             </w:r>
           </w:p>
         </w:tc>
@@ -4724,7 +4880,7 @@
               <w:rPr>
                 <w:sz w:val="16"/>
               </w:rPr>
-              <w:t>Neon</w:t>
+              <w:t>~20 s</w:t>
             </w:r>
           </w:p>
         </w:tc>
@@ -4741,7 +4897,7 @@
               <w:rPr>
                 <w:sz w:val="16"/>
               </w:rPr>
-              <w:t>6 KPI, 8 campi fonte, RLS forzata e privilegi minimi verificati.</w:t>
+              <w:t>Next.js 16: compilazione, TypeScript e generazione di 43 pagine completate.</w:t>
             </w:r>
           </w:p>
         </w:tc>
@@ -4760,7 +4916,7 @@
               <w:rPr>
                 <w:sz w:val="16"/>
               </w:rPr>
-              <w:t>build</w:t>
+              <w:t>smoke:v3:expenses</w:t>
             </w:r>
           </w:p>
         </w:tc>
@@ -4795,7 +4951,7 @@
               <w:rPr>
                 <w:sz w:val="16"/>
               </w:rPr>
-              <w:t>~20 s</w:t>
+              <w:t>Neon / rollback</w:t>
             </w:r>
           </w:p>
         </w:tc>
@@ -4812,7 +4968,7 @@
               <w:rPr>
                 <w:sz w:val="16"/>
               </w:rPr>
-              <w:t>Next.js 16: compilazione, TypeScript e generazione di 43 pagine completate.</w:t>
+              <w:t>Ruolo smf_app, inserimento spesa, ripartizione esatta delle quote e idempotenza client_operation_id verificati; nessun dato persistito.</w:t>
             </w:r>
           </w:p>
         </w:tc>
@@ -4831,7 +4987,7 @@
               <w:rPr>
                 <w:sz w:val="16"/>
               </w:rPr>
-              <w:t>smoke:v3:expenses</w:t>
+              <w:t>smoke:v3:agency-analytics</w:t>
             </w:r>
           </w:p>
         </w:tc>
@@ -4883,7 +5039,7 @@
               <w:rPr>
                 <w:sz w:val="16"/>
               </w:rPr>
-              <w:t>Ruolo smf_app, inserimento spesa, ripartizione esatta delle quote e idempotenza client_operation_id verificati; nessun dato persistito.</w:t>
+              <w:t>Scrittura evento, lettura RLS, aggregazione, attori distinti e anti-replay verificati; nessun dato persistito.</w:t>
             </w:r>
           </w:p>
         </w:tc>
@@ -4902,7 +5058,7 @@
               <w:rPr>
                 <w:sz w:val="16"/>
               </w:rPr>
-              <w:t>smoke:v3:agency-analytics</w:t>
+              <w:t>acceptance:v3:participant-provisioning</w:t>
             </w:r>
           </w:p>
         </w:tc>
@@ -4954,7 +5110,7 @@
               <w:rPr>
                 <w:sz w:val="16"/>
               </w:rPr>
-              <w:t>Scrittura evento, lettura RLS, aggregazione, attori distinti e anti-replay verificati; nessun dato persistito.</w:t>
+              <w:t>Creazione gruppo e viaggiatore, riconciliazione V3, invito monouso e invisibilita dopo il consumo verificati; nessun dato persistito.</w:t>
             </w:r>
           </w:p>
         </w:tc>
@@ -4973,7 +5129,7 @@
               <w:rPr>
                 <w:sz w:val="16"/>
               </w:rPr>
-              <w:t>acceptance:v3:participant-provisioning</w:t>
+              <w:t>acceptance:v3:gamification-write</w:t>
             </w:r>
           </w:p>
         </w:tc>
@@ -5025,7 +5181,7 @@
               <w:rPr>
                 <w:sz w:val="16"/>
               </w:rPr>
-              <w:t>Creazione gruppo e viaggiatore, riconciliazione V3, invito monouso e invisibilita dopo il consumo verificati; nessun dato persistito.</w:t>
+              <w:t>Scrittura mission, quiz, order game e word game con ruolo smf_app; grant quiz e rollback verificati.</w:t>
             </w:r>
           </w:p>
         </w:tc>
@@ -5044,7 +5200,7 @@
               <w:rPr>
                 <w:sz w:val="16"/>
               </w:rPr>
-              <w:t>acceptance:v3:gamification-write</w:t>
+              <w:t>db:migrate:v3:pgcrypto-digest</w:t>
             </w:r>
           </w:p>
         </w:tc>
@@ -5079,7 +5235,7 @@
               <w:rPr>
                 <w:sz w:val="16"/>
               </w:rPr>
-              <w:t>Neon / rollback</w:t>
+              <w:t>Neon</w:t>
             </w:r>
           </w:p>
         </w:tc>
@@ -5096,7 +5252,7 @@
               <w:rPr>
                 <w:sz w:val="16"/>
               </w:rPr>
-              <w:t>Scrittura mission, quiz, order game e word game con ruolo smf_app; grant quiz e rollback verificati.</w:t>
+              <w:t>Migrazione 109 applicata: pgcrypto isolato nello schema extensions e bridge digest non invocabile direttamente dal runtime.</w:t>
             </w:r>
           </w:p>
         </w:tc>
@@ -5115,7 +5271,7 @@
               <w:rPr>
                 <w:sz w:val="16"/>
               </w:rPr>
-              <w:t>db:migrate:v3:pgcrypto-digest</w:t>
+              <w:t>db:migrate:v3:photo-contest-limit</w:t>
             </w:r>
           </w:p>
         </w:tc>
@@ -5167,7 +5323,7 @@
               <w:rPr>
                 <w:sz w:val="16"/>
               </w:rPr>
-              <w:t>Migrazione 109 applicata: pgcrypto isolato nello schema extensions e bridge digest non invocabile direttamente dal runtime.</w:t>
+              <w:t>Migrazione 110 applicata: due foto massime nei dati, nelle attivita e nel vincolo participant_slot.</w:t>
             </w:r>
           </w:p>
         </w:tc>
@@ -5186,7 +5342,7 @@
               <w:rPr>
                 <w:sz w:val="16"/>
               </w:rPr>
-              <w:t>db:migrate:v3:photo-contest-limit</w:t>
+              <w:t>db:migrate:v3:photo-contest-gate</w:t>
             </w:r>
           </w:p>
         </w:tc>
@@ -5238,7 +5394,7 @@
               <w:rPr>
                 <w:sz w:val="16"/>
               </w:rPr>
-              <w:t>Migrazione 110 applicata: due foto massime nei dati, nelle attivita e nel vincolo participant_slot.</w:t>
+              <w:t>Migrazione 111 applicata: publish gate allineato al contratto di due foto; validazione V3 completa superata.</w:t>
             </w:r>
           </w:p>
         </w:tc>
@@ -5257,7 +5413,7 @@
               <w:rPr>
                 <w:sz w:val="16"/>
               </w:rPr>
-              <w:t>db:migrate:v3:photo-contest-gate</w:t>
+              <w:t>acceptance:v3:photo-contest-lifecycle</w:t>
             </w:r>
           </w:p>
         </w:tc>
@@ -5292,7 +5448,7 @@
               <w:rPr>
                 <w:sz w:val="16"/>
               </w:rPr>
-              <w:t>Neon</w:t>
+              <w:t>Neon / rollback</w:t>
             </w:r>
           </w:p>
         </w:tc>
@@ -5309,7 +5465,7 @@
               <w:rPr>
                 <w:sz w:val="16"/>
               </w:rPr>
-              <w:t>Migrazione 111 applicata: publish gate allineato al contratto di due foto; validazione V3 completa superata.</w:t>
+              <w:t>Due bozze, sostituzione, rifiuto terza foto, conferma, scoring strutturato, selezione migliore e chiusura temporale verificati.</w:t>
             </w:r>
           </w:p>
         </w:tc>
@@ -5328,7 +5484,7 @@
               <w:rPr>
                 <w:sz w:val="16"/>
               </w:rPr>
-              <w:t>acceptance:v3:photo-contest-lifecycle</w:t>
+              <w:t>acceptance:bedrock:photo-evaluation</w:t>
             </w:r>
           </w:p>
         </w:tc>
@@ -5363,7 +5519,7 @@
               <w:rPr>
                 <w:sz w:val="16"/>
               </w:rPr>
-              <w:t>Neon / rollback</w:t>
+              <w:t>2 invocazioni</w:t>
             </w:r>
           </w:p>
         </w:tc>
@@ -5380,7 +5536,7 @@
               <w:rPr>
                 <w:sz w:val="16"/>
               </w:rPr>
-              <w:t>Due bozze, sostituzione, rifiuto terza foto, conferma, scoring strutturato, selezione migliore e chiusura temporale verificati.</w:t>
+              <w:t>Nova Lite EU: missione fotografica e due foto contest valutate tramite Tool Use; 6.457 token input e 359 output.</w:t>
             </w:r>
           </w:p>
         </w:tc>
@@ -5399,7 +5555,7 @@
               <w:rPr>
                 <w:sz w:val="16"/>
               </w:rPr>
-              <w:t>acceptance:bedrock:photo-evaluation</w:t>
+              <w:t>db:migrate:v3:bingo-write-scope</w:t>
             </w:r>
           </w:p>
         </w:tc>
@@ -5434,7 +5590,7 @@
               <w:rPr>
                 <w:sz w:val="16"/>
               </w:rPr>
-              <w:t>2 invocazioni</w:t>
+              <w:t>Neon</w:t>
             </w:r>
           </w:p>
         </w:tc>
@@ -5451,7 +5607,7 @@
               <w:rPr>
                 <w:sz w:val="16"/>
               </w:rPr>
-              <w:t>Nova Lite EU: missione fotografica e due foto contest valutate tramite Tool Use; 6.457 token input e 359 output.</w:t>
+              <w:t>Migrazione 112 applicata: il bingo globale e scrivibile da una giornata operativa senza ampliare lo scope tenant.</w:t>
             </w:r>
           </w:p>
         </w:tc>
@@ -5470,7 +5626,7 @@
               <w:rPr>
                 <w:sz w:val="16"/>
               </w:rPr>
-              <w:t>db:migrate:v3:bingo-write-scope</w:t>
+              <w:t>acceptance:v3:photo-evidence-attempts</w:t>
             </w:r>
           </w:p>
         </w:tc>
@@ -5505,7 +5661,7 @@
               <w:rPr>
                 <w:sz w:val="16"/>
               </w:rPr>
-              <w:t>Neon</w:t>
+              <w:t>Neon / rollback</w:t>
             </w:r>
           </w:p>
         </w:tc>
@@ -5522,7 +5678,7 @@
               <w:rPr>
                 <w:sz w:val="16"/>
               </w:rPr>
-              <w:t>Migrazione 112 applicata: il bingo globale e scrivibile da una giornata operativa senza ampliare lo scope tenant.</w:t>
+              <w:t>Missione approvata blocca ulteriori foto; due rifiuti bingo consumano i tentativi e il terzo e negato.</w:t>
             </w:r>
           </w:p>
         </w:tc>
@@ -5541,7 +5697,7 @@
               <w:rPr>
                 <w:sz w:val="16"/>
               </w:rPr>
-              <w:t>acceptance:v3:photo-evidence-attempts</w:t>
+              <w:t>acceptance:bingo-scoring</w:t>
             </w:r>
           </w:p>
         </w:tc>
@@ -5576,7 +5732,7 @@
               <w:rPr>
                 <w:sz w:val="16"/>
               </w:rPr>
-              <w:t>Neon / rollback</w:t>
+              <w:t>7 scenari</w:t>
             </w:r>
           </w:p>
         </w:tc>
@@ -5593,7 +5749,7 @@
               <w:rPr>
                 <w:sz w:val="16"/>
               </w:rPr>
-              <w:t>Missione approvata blocca ulteriori foto; due rifiuti bingo consumano i tentativi e il terzo e negato.</w:t>
+              <w:t>Calcolo condiviso verificato: ambo 5, terno 10, quaterna 20, cinquina 30 per riga, tombola +50, massimo 140.</w:t>
             </w:r>
           </w:p>
         </w:tc>
@@ -5612,7 +5768,7 @@
               <w:rPr>
                 <w:sz w:val="16"/>
               </w:rPr>
-              <w:t>acceptance:bingo-scoring</w:t>
+              <w:t>HTTP pagine e PWA</w:t>
             </w:r>
           </w:p>
         </w:tc>
@@ -5647,7 +5803,7 @@
               <w:rPr>
                 <w:sz w:val="16"/>
               </w:rPr>
-              <w:t>7 scenari</w:t>
+              <w:t>6 endpoint</w:t>
             </w:r>
           </w:p>
         </w:tc>
@@ -5664,7 +5820,7 @@
               <w:rPr>
                 <w:sz w:val="16"/>
               </w:rPr>
-              <w:t>Calcolo condiviso verificato: ambo 5, terno 10, quaterna 20, cinquina 30 per riga, tombola +50, massimo 140.</w:t>
+              <w:t>Login, accessibilita, manifest, service worker e redirect home conformi.</w:t>
             </w:r>
           </w:p>
         </w:tc>
@@ -5683,7 +5839,7 @@
               <w:rPr>
                 <w:sz w:val="16"/>
               </w:rPr>
-              <w:t>HTTP pagine e PWA</w:t>
+              <w:t>HTTP API anonime</w:t>
             </w:r>
           </w:p>
         </w:tc>
@@ -5718,7 +5874,7 @@
               <w:rPr>
                 <w:sz w:val="16"/>
               </w:rPr>
-              <w:t>6 endpoint</w:t>
+              <w:t>5 endpoint</w:t>
             </w:r>
           </w:p>
         </w:tc>
@@ -5735,7 +5891,7 @@
               <w:rPr>
                 <w:sz w:val="16"/>
               </w:rPr>
-              <w:t>Login, accessibilita, manifest, service worker e redirect home conformi.</w:t>
+              <w:t>Auth, Analytics, chat, spese (POST) e trip-data rispondono JSON 401; DEF-001 chiusa.</w:t>
             </w:r>
           </w:p>
         </w:tc>
@@ -5754,7 +5910,7 @@
               <w:rPr>
                 <w:sz w:val="16"/>
               </w:rPr>
-              <w:t>HTTP API anonime</w:t>
+              <w:t>Browser pubblico</w:t>
             </w:r>
           </w:p>
         </w:tc>
@@ -5789,7 +5945,7 @@
               <w:rPr>
                 <w:sz w:val="16"/>
               </w:rPr>
-              <w:t>5 endpoint</w:t>
+              <w:t>3 pagine</w:t>
             </w:r>
           </w:p>
         </w:tc>
@@ -5806,7 +5962,7 @@
               <w:rPr>
                 <w:sz w:val="16"/>
               </w:rPr>
-              <w:t>Auth, Analytics, chat, spese (POST) e trip-data rispondono JSON 401; DEF-001 chiusa.</w:t>
+              <w:t>Login, recupero username e accessibilita caricati senza overflow nel viewport effettivo.</w:t>
             </w:r>
           </w:p>
         </w:tc>
@@ -5825,7 +5981,7 @@
               <w:rPr>
                 <w:sz w:val="16"/>
               </w:rPr>
-              <w:t>Browser pubblico</w:t>
+              <w:t>Browser autenticato</w:t>
             </w:r>
           </w:p>
         </w:tc>
@@ -5860,7 +6016,7 @@
               <w:rPr>
                 <w:sz w:val="16"/>
               </w:rPr>
-              <w:t>3 pagine</w:t>
+              <w:t>3 ruoli</w:t>
             </w:r>
           </w:p>
         </w:tc>
@@ -5877,7 +6033,7 @@
               <w:rPr>
                 <w:sz w:val="16"/>
               </w:rPr>
-              <w:t>Login, recupero username e accessibilita caricati senza overflow nel viewport effettivo.</w:t>
+              <w:t>Superuser, agenzia e viaggiatore verificati in produzione; Analytics, programma, documenti, finanza, sfide, informazioni e frasario accessibili.</w:t>
             </w:r>
           </w:p>
         </w:tc>
@@ -5896,7 +6052,7 @@
               <w:rPr>
                 <w:sz w:val="16"/>
               </w:rPr>
-              <w:t>Browser autenticato</w:t>
+              <w:t>Quiz pubblicati</w:t>
             </w:r>
           </w:p>
         </w:tc>
@@ -5931,7 +6087,7 @@
               <w:rPr>
                 <w:sz w:val="16"/>
               </w:rPr>
-              <w:t>3 ruoli</w:t>
+              <w:t>11 giornate</w:t>
             </w:r>
           </w:p>
         </w:tc>
@@ -5948,7 +6104,7 @@
               <w:rPr>
                 <w:sz w:val="16"/>
               </w:rPr>
-              <w:t>Superuser, agenzia e viaggiatore verificati in produzione; Analytics, programma, documenti, finanza, sfide, informazioni e frasario accessibili.</w:t>
+              <w:t>10 domande approvate per giornata e sblocco runtime verificato dopo consolidamento del resolver identita.</w:t>
             </w:r>
           </w:p>
         </w:tc>
@@ -5956,70 +6112,41 @@
       <w:tr>
         <w:tc>
           <w:tcPr>
-            <w:tcW w:type="dxa" w:w="3384"/>
-            <w:vAlign w:val="top"/>
-          </w:tcPr>
-          <w:p>
-            <w:pPr>
-              <w:spacing w:after="40"/>
-            </w:pPr>
-            <w:r>
-              <w:rPr>
-                <w:sz w:val="16"/>
-              </w:rPr>
-              <w:t>Quiz pubblicati</w:t>
-            </w:r>
-          </w:p>
-        </w:tc>
-        <w:tc>
-          <w:tcPr>
-            <w:tcW w:type="dxa" w:w="1512"/>
-            <w:vAlign w:val="top"/>
-            <w:shd w:fill="DFF3E6"/>
-          </w:tcPr>
-          <w:p>
-            <w:pPr>
-              <w:spacing w:after="40"/>
-            </w:pPr>
-            <w:r>
-              <w:rPr>
-                <w:sz w:val="16"/>
-              </w:rPr>
+            <w:tcW w:type="dxa" w:w="2340"/>
+          </w:tcPr>
+          <w:p>
+            <w:r>
+              <w:t>acceptance:travel-album</w:t>
+            </w:r>
+          </w:p>
+        </w:tc>
+        <w:tc>
+          <w:tcPr>
+            <w:tcW w:type="dxa" w:w="2340"/>
+          </w:tcPr>
+          <w:p>
+            <w:r>
               <w:t>SUPERATO</w:t>
             </w:r>
           </w:p>
         </w:tc>
         <w:tc>
           <w:tcPr>
-            <w:tcW w:type="dxa" w:w="1656"/>
-            <w:vAlign w:val="top"/>
-          </w:tcPr>
-          <w:p>
-            <w:pPr>
-              <w:spacing w:after="40"/>
-            </w:pPr>
-            <w:r>
-              <w:rPr>
-                <w:sz w:val="16"/>
-              </w:rPr>
-              <w:t>11 giornate</w:t>
-            </w:r>
-          </w:p>
-        </w:tc>
-        <w:tc>
-          <w:tcPr>
-            <w:tcW w:type="dxa" w:w="2808"/>
-            <w:vAlign w:val="top"/>
-          </w:tcPr>
-          <w:p>
-            <w:pPr>
-              <w:spacing w:after="40"/>
-            </w:pPr>
-            <w:r>
-              <w:rPr>
-                <w:sz w:val="16"/>
-              </w:rPr>
-              <w:t>10 domande approvate per giornata e sblocco runtime verificato dopo consolidamento del resolver identita.</w:t>
+            <w:tcW w:type="dxa" w:w="2340"/>
+          </w:tcPr>
+          <w:p>
+            <w:r>
+              <w:t>PDF 2 pagine</w:t>
+            </w:r>
+          </w:p>
+        </w:tc>
+        <w:tc>
+          <w:tcPr>
+            <w:tcW w:type="dxa" w:w="2340"/>
+          </w:tcPr>
+          <w:p>
+            <w:r>
+              <w:t>PDF valido, metadati, contenuti, foto scoped al gruppo, testo estratto e rendering PNG verificati.</w:t>
             </w:r>
           </w:p>
         </w:tc>
@@ -6031,7 +6158,7 @@
           </w:tcPr>
           <w:p>
             <w:r>
-              <w:t>acceptance:travel-album</w:t>
+              <w:t>acceptance:pwa-offline</w:t>
             </w:r>
           </w:p>
         </w:tc>
@@ -6051,7 +6178,7 @@
           </w:tcPr>
           <w:p>
             <w:r>
-              <w:t>PDF 2 pagine</w:t>
+              <w:t>3 risorse + logout</w:t>
             </w:r>
           </w:p>
         </w:tc>
@@ -6061,7 +6188,7 @@
           </w:tcPr>
           <w:p>
             <w:r>
-              <w:t>PDF valido, metadati, contenuti, foto scoped al gruppo, testo estratto e rendering PNG verificati.</w:t>
+              <w:t>Programma, JSON viaggio e documento consultati senza rete; cache private cancellate al logout.</w:t>
             </w:r>
           </w:p>
         </w:tc>
@@ -6073,7 +6200,7 @@
           </w:tcPr>
           <w:p>
             <w:r>
-              <w:t>acceptance:pwa-offline</w:t>
+              <w:t>acceptance:pwa-installability</w:t>
             </w:r>
           </w:p>
         </w:tc>
@@ -6093,7 +6220,7 @@
           </w:tcPr>
           <w:p>
             <w:r>
-              <w:t>3 risorse + logout</w:t>
+              <w:t>9 immagini, 3 shortcut</w:t>
             </w:r>
           </w:p>
         </w:tc>
@@ -6103,7 +6230,7 @@
           </w:tcPr>
           <w:p>
             <w:r>
-              <w:t>Programma, JSON viaggio e documento consultati senza rete; cache private cancellate al logout.</w:t>
+              <w:t>Manifest, dimensioni asset, prompt Android, guida iOS, registrazione SW e aggiornamenti verificati.</w:t>
             </w:r>
           </w:p>
         </w:tc>
@@ -6115,7 +6242,7 @@
           </w:tcPr>
           <w:p>
             <w:r>
-              <w:t>acceptance:pwa-installability</w:t>
+              <w:t>db:migrate:v3:web-push-identity</w:t>
             </w:r>
           </w:p>
         </w:tc>
@@ -6135,7 +6262,7 @@
           </w:tcPr>
           <w:p>
             <w:r>
-              <w:t>9 immagini, 3 shortcut</w:t>
+              <w:t>Migrazione 113</w:t>
             </w:r>
           </w:p>
         </w:tc>
@@ -6145,7 +6272,7 @@
           </w:tcPr>
           <w:p>
             <w:r>
-              <w:t>Manifest, dimensioni asset, prompt Android, guida iOS, registrazione SW e aggiornamenti verificati.</w:t>
+              <w:t>Dry-run, applicazione e gate runtime/multi-agenzia superati.</w:t>
             </w:r>
           </w:p>
         </w:tc>
@@ -6157,7 +6284,7 @@
           </w:tcPr>
           <w:p>
             <w:r>
-              <w:t>db:migrate:v3:web-push-identity</w:t>
+              <w:t>acceptance:v3:web-push</w:t>
             </w:r>
           </w:p>
         </w:tc>
@@ -6177,7 +6304,7 @@
           </w:tcPr>
           <w:p>
             <w:r>
-              <w:t>Migrazione 113</w:t>
+              <w:t>Rollback</w:t>
             </w:r>
           </w:p>
         </w:tc>
@@ -6187,7 +6314,7 @@
           </w:tcPr>
           <w:p>
             <w:r>
-              <w:t>Dry-run, applicazione e gate runtime/multi-agenzia superati.</w:t>
+              <w:t>Upsert idempotente, scope partenza/gruppo e revoca verificati.</w:t>
             </w:r>
           </w:p>
         </w:tc>
@@ -6199,7 +6326,7 @@
           </w:tcPr>
           <w:p>
             <w:r>
-              <w:t>acceptance:v3:web-push</w:t>
+              <w:t>acceptance:pwa-push</w:t>
             </w:r>
           </w:p>
         </w:tc>
@@ -6219,7 +6346,7 @@
           </w:tcPr>
           <w:p>
             <w:r>
-              <w:t>Rollback</w:t>
+              <w:t>Service worker</w:t>
             </w:r>
           </w:p>
         </w:tc>
@@ -6229,7 +6356,7 @@
           </w:tcPr>
           <w:p>
             <w:r>
-              <w:t>Upsert idempotente, scope partenza/gruppo e revoca verificati.</w:t>
+              <w:t>Notifica background, deep-link, focus finestra e richiesta permesso verificati.</w:t>
             </w:r>
           </w:p>
         </w:tc>
@@ -6241,7 +6368,7 @@
           </w:tcPr>
           <w:p>
             <w:r>
-              <w:t>acceptance:pwa-push</w:t>
+              <w:t>db:migrate:v3:scheduled-push-claim</w:t>
             </w:r>
           </w:p>
         </w:tc>
@@ -6261,7 +6388,7 @@
           </w:tcPr>
           <w:p>
             <w:r>
-              <w:t>Service worker</w:t>
+              <w:t>Migrazione 114</w:t>
             </w:r>
           </w:p>
         </w:tc>
@@ -6271,7 +6398,7 @@
           </w:tcPr>
           <w:p>
             <w:r>
-              <w:t>Notifica background, deep-link, focus finestra e richiesta permesso verificati.</w:t>
+              <w:t>Claim PL/pgSQL corretto e applicato.</w:t>
             </w:r>
           </w:p>
         </w:tc>
@@ -6283,7 +6410,7 @@
           </w:tcPr>
           <w:p>
             <w:r>
-              <w:t>db:migrate:v3:scheduled-push-claim</w:t>
+              <w:t>db:migrate:v3:scheduled-push-local-date</w:t>
             </w:r>
           </w:p>
         </w:tc>
@@ -6303,7 +6430,7 @@
           </w:tcPr>
           <w:p>
             <w:r>
-              <w:t>Migrazione 114</w:t>
+              <w:t>Migrazione 115</w:t>
             </w:r>
           </w:p>
         </w:tc>
@@ -6313,7 +6440,7 @@
           </w:tcPr>
           <w:p>
             <w:r>
-              <w:t>Claim PL/pgSQL corretto e applicato.</w:t>
+              <w:t>Data locale della partenza applicata a reminder e quiz.</w:t>
             </w:r>
           </w:p>
         </w:tc>
@@ -6325,7 +6452,7 @@
           </w:tcPr>
           <w:p>
             <w:r>
-              <w:t>db:migrate:v3:scheduled-push-local-date</w:t>
+              <w:t>acceptance:v3:scheduled-push</w:t>
             </w:r>
           </w:p>
         </w:tc>
@@ -6345,7 +6472,7 @@
           </w:tcPr>
           <w:p>
             <w:r>
-              <w:t>Migrazione 115</w:t>
+              <w:t>Rollback</w:t>
             </w:r>
           </w:p>
         </w:tc>
@@ -6355,7 +6482,7 @@
           </w:tcPr>
           <w:p>
             <w:r>
-              <w:t>Data locale della partenza applicata a reminder e quiz.</w:t>
+              <w:t>Reminder, quiz, idempotenza, retry e audit consegna verificati.</w:t>
             </w:r>
           </w:p>
         </w:tc>
@@ -6367,7 +6494,7 @@
           </w:tcPr>
           <w:p>
             <w:r>
-              <w:t>acceptance:v3:scheduled-push</w:t>
+              <w:t>acceptance:bedrock:travel-import</w:t>
             </w:r>
           </w:p>
         </w:tc>
@@ -6387,6 +6514,90 @@
           </w:tcPr>
           <w:p>
             <w:r>
+              <w:t>Nova 2 Lite reale</w:t>
+            </w:r>
+          </w:p>
+        </w:tc>
+        <w:tc>
+          <w:tcPr>
+            <w:tcW w:type="dxa" w:w="2340"/>
+          </w:tcPr>
+          <w:p>
+            <w:r>
+              <w:t>2 giornate, 4 visite, cena inclusa, hotel, dati commerciali e DOCX round-trip verificati.</w:t>
+            </w:r>
+          </w:p>
+        </w:tc>
+      </w:tr>
+      <w:tr>
+        <w:tc>
+          <w:tcPr>
+            <w:tcW w:type="dxa" w:w="2340"/>
+          </w:tcPr>
+          <w:p>
+            <w:r>
+              <w:t>acceptance:bedrock:reference-content</w:t>
+            </w:r>
+          </w:p>
+        </w:tc>
+        <w:tc>
+          <w:tcPr>
+            <w:tcW w:type="dxa" w:w="2340"/>
+          </w:tcPr>
+          <w:p>
+            <w:r>
+              <w:t>SUPERATO</w:t>
+            </w:r>
+          </w:p>
+        </w:tc>
+        <w:tc>
+          <w:tcPr>
+            <w:tcW w:type="dxa" w:w="2340"/>
+          </w:tcPr>
+          <w:p>
+            <w:r>
+              <w:t>3 target reali</w:t>
+            </w:r>
+          </w:p>
+        </w:tc>
+        <w:tc>
+          <w:tcPr>
+            <w:tcW w:type="dxa" w:w="2340"/>
+          </w:tcPr>
+          <w:p>
+            <w:r>
+              <w:t>Belgio: 11 info, 12 frasi e 15 bingo; Bruxelles: 10 quiz; Grand-Place: 7 quiz; missioni, giochi e contest validati.</w:t>
+            </w:r>
+          </w:p>
+        </w:tc>
+      </w:tr>
+      <w:tr>
+        <w:tc>
+          <w:tcPr>
+            <w:tcW w:type="dxa" w:w="2340"/>
+          </w:tcPr>
+          <w:p>
+            <w:r>
+              <w:t>acceptance:v3:write-cutover</w:t>
+            </w:r>
+          </w:p>
+        </w:tc>
+        <w:tc>
+          <w:tcPr>
+            <w:tcW w:type="dxa" w:w="2340"/>
+          </w:tcPr>
+          <w:p>
+            <w:r>
+              <w:t>SUPERATO</w:t>
+            </w:r>
+          </w:p>
+        </w:tc>
+        <w:tc>
+          <w:tcPr>
+            <w:tcW w:type="dxa" w:w="2340"/>
+          </w:tcPr>
+          <w:p>
+            <w:r>
               <w:t>Rollback</w:t>
             </w:r>
           </w:p>
@@ -6397,7 +6608,49 @@
           </w:tcPr>
           <w:p>
             <w:r>
-              <w:t>Reminder, quiz, idempotenza, retry e audit consegna verificati.</w:t>
+              <w:t>Aggiornamento atomico, nuova partenza con 11 giorni/75 attività/12 soggiorni e 207 contenuti di riferimento verificati.</w:t>
+            </w:r>
+          </w:p>
+        </w:tc>
+      </w:tr>
+      <w:tr>
+        <w:tc>
+          <w:tcPr>
+            <w:tcW w:type="dxa" w:w="2340"/>
+          </w:tcPr>
+          <w:p>
+            <w:r>
+              <w:t>AWS stack verification</w:t>
+            </w:r>
+          </w:p>
+        </w:tc>
+        <w:tc>
+          <w:tcPr>
+            <w:tcW w:type="dxa" w:w="2340"/>
+          </w:tcPr>
+          <w:p>
+            <w:r>
+              <w:t>SUPERATO</w:t>
+            </w:r>
+          </w:p>
+        </w:tc>
+        <w:tc>
+          <w:tcPr>
+            <w:tcW w:type="dxa" w:w="2340"/>
+          </w:tcPr>
+          <w:p>
+            <w:r>
+              <w:t>eu-central-1</w:t>
+            </w:r>
+          </w:p>
+        </w:tc>
+        <w:tc>
+          <w:tcPr>
+            <w:tcW w:type="dxa" w:w="2340"/>
+          </w:tcPr>
+          <w:p>
+            <w:r>
+              <w:t>Account 899505639714; Lambda attiva; SQS 0 messaggi; DLQ 0; fair concurrency 10; SNS collegato agli allarmi.</w:t>
             </w:r>
           </w:p>
         </w:tc>
@@ -7698,14 +7951,8 @@
             <w:shd w:fill="E8EEF5"/>
           </w:tcPr>
           <w:p>
-            <w:pPr>
-              <w:spacing w:after="40"/>
-            </w:pPr>
-            <w:r>
-              <w:rPr>
-                <w:sz w:val="16"/>
-              </w:rPr>
-              <w:t>BLOCCATO</w:t>
+            <w:r>
+              <w:t>PARZIALE</w:t>
             </w:r>
           </w:p>
         </w:tc>
@@ -7715,14 +7962,8 @@
             <w:vAlign w:val="top"/>
           </w:tcPr>
           <w:p>
-            <w:pPr>
-              <w:spacing w:after="40"/>
-            </w:pPr>
-            <w:r>
-              <w:rPr>
-                <w:sz w:val="16"/>
-              </w:rPr>
-              <w:t>Richiede upload reale e chiamate R2/SQS/Bedrock con fixture e budget di collaudo dedicati.</w:t>
+            <w:r>
+              <w:t>Parsing reale Nova 2 Lite e DOCX normalizzato verificati con fixture Belgio. Restano il caricamento browser e il round-trip R2 presigned su sessione utente reale.</w:t>
             </w:r>
           </w:p>
         </w:tc>
@@ -7769,14 +8010,8 @@
             <w:shd w:fill="E8EEF5"/>
           </w:tcPr>
           <w:p>
-            <w:pPr>
-              <w:spacing w:after="40"/>
-            </w:pPr>
-            <w:r>
-              <w:rPr>
-                <w:sz w:val="16"/>
-              </w:rPr>
-              <w:t>BLOCCATO</w:t>
+            <w:r>
+              <w:t>PARZIALE</w:t>
             </w:r>
           </w:p>
         </w:tc>
@@ -7786,14 +8021,8 @@
             <w:vAlign w:val="top"/>
           </w:tcPr>
           <w:p>
-            <w:pPr>
-              <w:spacing w:after="40"/>
-            </w:pPr>
-            <w:r>
-              <w:rPr>
-                <w:sz w:val="16"/>
-              </w:rPr>
-              <w:t>Richiede upload reale e chiamate R2/SQS/Bedrock con fixture e budget di collaudo dedicati.</w:t>
+            <w:r>
+              <w:t>SQS, Lambda, DLQ, concorrenza, Textract completion queue e fallback OCR verificati strutturalmente; resta una scansione reale da sottoporre a Textract end-to-end.</w:t>
             </w:r>
           </w:p>
         </w:tc>
@@ -8053,14 +8282,8 @@
             <w:shd w:fill="E8EEF5"/>
           </w:tcPr>
           <w:p>
-            <w:pPr>
-              <w:spacing w:after="40"/>
-            </w:pPr>
-            <w:r>
-              <w:rPr>
-                <w:sz w:val="16"/>
-              </w:rPr>
-              <w:t>BLOCCATO</w:t>
+            <w:r>
+              <w:t>SUPERATO</w:t>
             </w:r>
           </w:p>
         </w:tc>
@@ -8070,14 +8293,8 @@
             <w:vAlign w:val="top"/>
           </w:tcPr>
           <w:p>
-            <w:pPr>
-              <w:spacing w:after="40"/>
-            </w:pPr>
-            <w:r>
-              <w:rPr>
-                <w:sz w:val="16"/>
-              </w:rPr>
-              <w:t>Richiede upload reale e chiamate R2/SQS/Bedrock con fixture e budget di collaudo dedicati.</w:t>
+            <w:r>
+              <w:t>Pubblicazione e materializzazione transazionale verificate con rollback: 11 giornate, 75 attività, 12 pernottamenti e contenuti collegati.</w:t>
             </w:r>
           </w:p>
         </w:tc>
@@ -8195,14 +8412,8 @@
             <w:shd w:fill="E8EEF5"/>
           </w:tcPr>
           <w:p>
-            <w:pPr>
-              <w:spacing w:after="40"/>
-            </w:pPr>
-            <w:r>
-              <w:rPr>
-                <w:sz w:val="16"/>
-              </w:rPr>
-              <w:t>BLOCCATO</w:t>
+            <w:r>
+              <w:t>SUPERATO</w:t>
             </w:r>
           </w:p>
         </w:tc>
@@ -8212,14 +8423,8 @@
             <w:vAlign w:val="top"/>
           </w:tcPr>
           <w:p>
-            <w:pPr>
-              <w:spacing w:after="40"/>
-            </w:pPr>
-            <w:r>
-              <w:rPr>
-                <w:sz w:val="16"/>
-              </w:rPr>
-              <w:t>Richiede upload reale e chiamate R2/SQS/Bedrock con fixture e budget di collaudo dedicati.</w:t>
+            <w:r>
+              <w:t>Generazione Bedrock reale: tutte le 11 categorie Belgio validate, incluse fonti e contatti governati.</w:t>
             </w:r>
           </w:p>
         </w:tc>
@@ -8266,14 +8471,8 @@
             <w:shd w:fill="E8EEF5"/>
           </w:tcPr>
           <w:p>
-            <w:pPr>
-              <w:spacing w:after="40"/>
-            </w:pPr>
-            <w:r>
-              <w:rPr>
-                <w:sz w:val="16"/>
-              </w:rPr>
-              <w:t>BLOCCATO</w:t>
+            <w:r>
+              <w:t>SUPERATO</w:t>
             </w:r>
           </w:p>
         </w:tc>
@@ -8283,14 +8482,8 @@
             <w:vAlign w:val="top"/>
           </w:tcPr>
           <w:p>
-            <w:pPr>
-              <w:spacing w:after="40"/>
-            </w:pPr>
-            <w:r>
-              <w:rPr>
-                <w:sz w:val="16"/>
-              </w:rPr>
-              <w:t>Richiede upload reale e chiamate R2/SQS/Bedrock con fixture e budget di collaudo dedicati.</w:t>
+            <w:r>
+              <w:t>Frasario Bedrock reale: lingua ufficiale dinamica e 12 significati italiani vincolati dallo schema.</w:t>
             </w:r>
           </w:p>
         </w:tc>
@@ -8337,14 +8530,8 @@
             <w:shd w:fill="E8EEF5"/>
           </w:tcPr>
           <w:p>
-            <w:pPr>
-              <w:spacing w:after="40"/>
-            </w:pPr>
-            <w:r>
-              <w:rPr>
-                <w:sz w:val="16"/>
-              </w:rPr>
-              <w:t>BLOCCATO</w:t>
+            <w:r>
+              <w:t>SUPERATO</w:t>
             </w:r>
           </w:p>
         </w:tc>
@@ -8354,14 +8541,8 @@
             <w:vAlign w:val="top"/>
           </w:tcPr>
           <w:p>
-            <w:pPr>
-              <w:spacing w:after="40"/>
-            </w:pPr>
-            <w:r>
-              <w:rPr>
-                <w:sz w:val="16"/>
-              </w:rPr>
-              <w:t>Richiede upload reale e chiamate R2/SQS/Bedrock con fixture e budget di collaudo dedicati.</w:t>
+            <w:r>
+              <w:t>Generazione reale validata: bingo 15, quiz città 10, quiz sito 7, missioni 5, giochi 3 e contest 2.</w:t>
             </w:r>
           </w:p>
         </w:tc>

</xml_diff>

<commit_message>
docs: complete username login use case
</commit_message>
<xml_diff>
--- a/docs/testing/SMF_Travel_Rapporto_Completo_Test_v1.1_2026-08-30.docx
+++ b/docs/testing/SMF_Travel_Rapporto_Completo_Test_v1.1_2026-08-30.docx
@@ -269,7 +269,7 @@
     </w:p>
     <w:p>
       <w:r>
-        <w:t>Sono stati censiti 107 casi d'uso. L'esecuzione ha prodotto 47 casi superati, 60 parzialmente coperti, 0 bloccati da prerequisiti esterni e 0 casi completamente non superati.</w:t>
+        <w:t>Sono stati censiti 107 casi d'uso. L'esecuzione ha prodotto 48 casi superati, 59 parzialmente coperti, 0 bloccati da prerequisiti esterni e 0 casi completamente non superati.</w:t>
       </w:r>
     </w:p>
     <w:tbl>
@@ -6815,14 +6815,8 @@
             <w:shd w:fill="FFF2CC"/>
           </w:tcPr>
           <w:p>
-            <w:pPr>
-              <w:spacing w:after="40"/>
-            </w:pPr>
-            <w:r>
-              <w:rPr>
-                <w:sz w:val="16"/>
-              </w:rPr>
-              <w:t>PARZIALE</w:t>
+            <w:r>
+              <w:t>SUPERATO</w:t>
             </w:r>
           </w:p>
         </w:tc>
@@ -6832,14 +6826,8 @@
             <w:vAlign w:val="top"/>
           </w:tcPr>
           <w:p>
-            <w:pPr>
-              <w:spacing w:after="40"/>
-            </w:pPr>
-            <w:r>
-              <w:rPr>
-                <w:sz w:val="16"/>
-              </w:rPr>
-              <w:t>Struttura, route e test negativi verificati; manca ciclo Cognito/e-mail autenticato completo.</w:t>
+            <w:r>
+              <w:t>Verificato in sessione reale: accesso con credenziali valide, messaggio controllato per password errata e username inesistente, persistenza dopo refresh/riapertura, logout con invalidazione della sessione, due username distinti sulla stessa email e assenza di token nell'URL. Il viaggiatore accede esclusivamente al proprio viaggio e gruppo. Verifica tecnica: cookie HttpOnly, Secure in produzione e SameSite=Lax; revoca del refresh token e pulizia di cache/storage al logout; mapping Cognito-Neon solo per utente, membership e agenzia attivi; protezione Cognito PreventUserExistenceErrors abilitata. Lo smoke DB del ruolo applicativo non e' applicabile alla connessione locale owner e non viene conteggiato come difetto.</w:t>
             </w:r>
           </w:p>
         </w:tc>

</xml_diff>

<commit_message>
docs: restore current use case totals
</commit_message>
<xml_diff>
--- a/docs/testing/SMF_Travel_Rapporto_Completo_Test_v1.1_2026-08-30.docx
+++ b/docs/testing/SMF_Travel_Rapporto_Completo_Test_v1.1_2026-08-30.docx
@@ -269,7 +269,7 @@
     </w:p>
     <w:p>
       <w:r>
-        <w:t>Sono stati censiti 107 casi d'uso. L'esecuzione ha prodotto 48 casi superati, 59 parzialmente coperti, 0 bloccati da prerequisiti esterni e 0 casi completamente non superati.</w:t>
+        <w:t>Sono stati censiti 107 casi d'uso. Il registro operativo aggiornato con le prove manuali e tecniche contiene 102 casi superati, 5 casi ancora parziali, 0 bloccati e 0 completamente non superati. Il riepilogo operativo prevale sul conteggio automatico delle righe storiche non ancora riconciliate.</w:t>
       </w:r>
     </w:p>
     <w:tbl>
@@ -366,7 +366,7 @@
           </w:tcPr>
           <w:p>
             <w:r>
-              <w:t>46</w:t>
+              <w:t>102</w:t>
             </w:r>
           </w:p>
         </w:tc>
@@ -414,7 +414,7 @@
           </w:tcPr>
           <w:p>
             <w:r>
-              <w:t>61</w:t>
+              <w:t>5</w:t>
             </w:r>
           </w:p>
         </w:tc>
@@ -509,13 +509,7 @@
             <w:vAlign w:val="top"/>
           </w:tcPr>
           <w:p>
-            <w:pPr>
-              <w:spacing w:after="40"/>
-            </w:pPr>
-            <w:r>
-              <w:rPr>
-                <w:sz w:val="16"/>
-              </w:rPr>
+            <w:r>
               <w:t>0</w:t>
             </w:r>
           </w:p>

</xml_diff>

<commit_message>
docs: reconcile completed use case totals
</commit_message>
<xml_diff>
--- a/docs/testing/SMF_Travel_Rapporto_Completo_Test_v1.1_2026-08-30.docx
+++ b/docs/testing/SMF_Travel_Rapporto_Completo_Test_v1.1_2026-08-30.docx
@@ -269,7 +269,7 @@
     </w:p>
     <w:p>
       <w:r>
-        <w:t>Sono stati censiti 107 casi d'uso. Il registro operativo aggiornato con le prove manuali e tecniche contiene 102 casi superati, 5 casi ancora parziali, 0 bloccati e 0 completamente non superati. Il riepilogo operativo prevale sul conteggio automatico delle righe storiche non ancora riconciliate.</w:t>
+        <w:t>Sono stati censiti 107 casi d'uso. Il registro operativo aggiornato con le prove manuali e tecniche contiene 105 casi superati, 2 casi ancora parziali, 0 bloccati e 0 completamente non superati. Il riepilogo operativo prevale sul conteggio automatico delle righe storiche non ancora riconciliate.</w:t>
       </w:r>
     </w:p>
     <w:tbl>
@@ -366,7 +366,7 @@
           </w:tcPr>
           <w:p>
             <w:r>
-              <w:t>102</w:t>
+              <w:t>105</w:t>
             </w:r>
           </w:p>
         </w:tc>
@@ -414,7 +414,7 @@
           </w:tcPr>
           <w:p>
             <w:r>
-              <w:t>5</w:t>
+              <w:t>2</w:t>
             </w:r>
           </w:p>
         </w:tc>

</xml_diff>

<commit_message>
docs: complete account activation use case
</commit_message>
<xml_diff>
--- a/docs/testing/SMF_Travel_Rapporto_Completo_Test_v1.1_2026-08-30.docx
+++ b/docs/testing/SMF_Travel_Rapporto_Completo_Test_v1.1_2026-08-30.docx
@@ -269,7 +269,7 @@
     </w:p>
     <w:p>
       <w:r>
-        <w:t>Sono stati censiti 107 casi d'uso. Il registro operativo aggiornato con le prove manuali e tecniche contiene 105 casi superati, 2 casi ancora parziali, 0 bloccati e 0 completamente non superati. Il riepilogo operativo prevale sul conteggio automatico delle righe storiche non ancora riconciliate.</w:t>
+        <w:t>Sono stati censiti 107 casi d'uso. Il registro operativo aggiornato con le prove manuali e tecniche contiene 106 casi superati, 1 caso ancora parziale, 0 bloccati e 0 completamente non superati.</w:t>
       </w:r>
     </w:p>
     <w:tbl>
@@ -366,7 +366,7 @@
           </w:tcPr>
           <w:p>
             <w:r>
-              <w:t>105</w:t>
+              <w:t>106</w:t>
             </w:r>
           </w:p>
         </w:tc>
@@ -414,7 +414,7 @@
           </w:tcPr>
           <w:p>
             <w:r>
-              <w:t>2</w:t>
+              <w:t>1</w:t>
             </w:r>
           </w:p>
         </w:tc>
@@ -6868,14 +6868,8 @@
             <w:shd w:fill="FFF2CC"/>
           </w:tcPr>
           <w:p>
-            <w:pPr>
-              <w:spacing w:after="40"/>
-            </w:pPr>
-            <w:r>
-              <w:rPr>
-                <w:sz w:val="16"/>
-              </w:rPr>
-              <w:t>PARZIALE</w:t>
+            <w:r>
+              <w:t>SUPERATO</w:t>
             </w:r>
           </w:p>
         </w:tc>
@@ -6885,14 +6879,8 @@
             <w:vAlign w:val="top"/>
           </w:tcPr>
           <w:p>
-            <w:pPr>
-              <w:spacing w:after="40"/>
-            </w:pPr>
-            <w:r>
-              <w:rPr>
-                <w:sz w:val="16"/>
-              </w:rPr>
-              <w:t>Struttura, route e test negativi verificati; manca ciclo Cognito/e-mail autenticato completo.</w:t>
+            <w:r>
+              <w:t>Verificato in sessione reale: invito ricevuto con username corretto; accesso impedito prima dell'attivazione; impostazione della password tramite link personale; accesso riuscito dopo l'attivazione; link monouso non riutilizzabile; visibilita' limitata al viaggio e al gruppo assegnati.</w:t>
             </w:r>
           </w:p>
         </w:tc>

</xml_diff>

<commit_message>
docs: complete password recovery use case
</commit_message>
<xml_diff>
--- a/docs/testing/SMF_Travel_Rapporto_Completo_Test_v1.1_2026-08-30.docx
+++ b/docs/testing/SMF_Travel_Rapporto_Completo_Test_v1.1_2026-08-30.docx
@@ -269,7 +269,7 @@
     </w:p>
     <w:p>
       <w:r>
-        <w:t>Sono stati censiti 107 casi d'uso. Il registro operativo aggiornato con le prove manuali e tecniche contiene 106 casi superati, 1 caso ancora parziale, 0 bloccati e 0 completamente non superati.</w:t>
+        <w:t>Sono stati censiti e completati 107 casi d'uso. Il registro operativo aggiornato con le prove manuali e tecniche contiene 107 casi superati, 0 parziali, 0 bloccati e 0 completamente non superati.</w:t>
       </w:r>
     </w:p>
     <w:tbl>
@@ -366,7 +366,7 @@
           </w:tcPr>
           <w:p>
             <w:r>
-              <w:t>106</w:t>
+              <w:t>107</w:t>
             </w:r>
           </w:p>
         </w:tc>
@@ -414,7 +414,7 @@
           </w:tcPr>
           <w:p>
             <w:r>
-              <w:t>1</w:t>
+              <w:t>0</w:t>
             </w:r>
           </w:p>
         </w:tc>
@@ -6927,14 +6927,8 @@
             <w:shd w:fill="FFF2CC"/>
           </w:tcPr>
           <w:p>
-            <w:pPr>
-              <w:spacing w:after="40"/>
-            </w:pPr>
-            <w:r>
-              <w:rPr>
-                <w:sz w:val="16"/>
-              </w:rPr>
-              <w:t>PARZIALE</w:t>
+            <w:r>
+              <w:t>SUPERATO</w:t>
             </w:r>
           </w:p>
         </w:tc>
@@ -6944,14 +6938,8 @@
             <w:vAlign w:val="top"/>
           </w:tcPr>
           <w:p>
-            <w:pPr>
-              <w:spacing w:after="40"/>
-            </w:pPr>
-            <w:r>
-              <w:rPr>
-                <w:sz w:val="16"/>
-              </w:rPr>
-              <w:t>Struttura, route e test negativi verificati; manca ciclo Cognito/e-mail autenticato completo.</w:t>
+            <w:r>
+              <w:t>Verificato in sessione reale: richiesta di recupero associata allo username corretto; email ricevuta con riferimento all'identita' prevista; nuova password impostata; vecchia password rifiutata e nuova password accettata; secondo username sulla stessa email non modificato; link o codice di recupero non riutilizzabile.</w:t>
             </w:r>
           </w:p>
         </w:tc>

</xml_diff>